<commit_message>
added home range stats
</commit_message>
<xml_diff>
--- a/Green Tree Snake Movement and Home Range Analysis.docx
+++ b/Green Tree Snake Movement and Home Range Analysis.docx
@@ -183,7 +183,7 @@
         <w:br w:type="page"/>
       </w:r>
     </w:p>
-    <w:bookmarkStart w:id="0" w:name="_Toc243392857" w:displacedByCustomXml="next"/>
+    <w:bookmarkStart w:id="0" w:name="_Toc243393746" w:displacedByCustomXml="next"/>
     <w:sdt>
       <w:sdtPr>
         <w:rPr>
@@ -253,7 +253,7 @@
             </w:rPr>
             <w:fldChar w:fldCharType="separate"/>
           </w:r>
-          <w:hyperlink w:anchor="_Toc243392857" w:history="1">
+          <w:hyperlink w:anchor="_Toc243393746" w:history="1">
             <w:r>
               <w:rPr>
                 <w:rStyle w:val="Hyperlink"/>
@@ -280,7 +280,7 @@
                 <w:noProof/>
                 <w:webHidden/>
               </w:rPr>
-              <w:instrText xml:space="preserve"> PAGEREF _Toc243392857 \h </w:instrText>
+              <w:instrText xml:space="preserve"> PAGEREF _Toc243393746 \h </w:instrText>
             </w:r>
             <w:r>
               <w:rPr>
@@ -331,7 +331,7 @@
               <w14:ligatures w14:val="standardContextual"/>
             </w:rPr>
           </w:pPr>
-          <w:hyperlink w:anchor="_Toc243392858" w:history="1">
+          <w:hyperlink w:anchor="_Toc243393747" w:history="1">
             <w:r>
               <w:rPr>
                 <w:rStyle w:val="Hyperlink"/>
@@ -358,7 +358,7 @@
                 <w:noProof/>
                 <w:webHidden/>
               </w:rPr>
-              <w:instrText xml:space="preserve"> PAGEREF _Toc243392858 \h </w:instrText>
+              <w:instrText xml:space="preserve"> PAGEREF _Toc243393747 \h </w:instrText>
             </w:r>
             <w:r>
               <w:rPr>
@@ -409,7 +409,7 @@
               <w14:ligatures w14:val="standardContextual"/>
             </w:rPr>
           </w:pPr>
-          <w:hyperlink w:anchor="_Toc243392859" w:history="1">
+          <w:hyperlink w:anchor="_Toc243393748" w:history="1">
             <w:r>
               <w:rPr>
                 <w:rStyle w:val="Hyperlink"/>
@@ -436,7 +436,7 @@
                 <w:noProof/>
                 <w:webHidden/>
               </w:rPr>
-              <w:instrText xml:space="preserve"> PAGEREF _Toc243392859 \h </w:instrText>
+              <w:instrText xml:space="preserve"> PAGEREF _Toc243393748 \h </w:instrText>
             </w:r>
             <w:r>
               <w:rPr>
@@ -487,7 +487,7 @@
               <w14:ligatures w14:val="standardContextual"/>
             </w:rPr>
           </w:pPr>
-          <w:hyperlink w:anchor="_Toc243392860" w:history="1">
+          <w:hyperlink w:anchor="_Toc243393749" w:history="1">
             <w:r>
               <w:rPr>
                 <w:rStyle w:val="Hyperlink"/>
@@ -514,7 +514,7 @@
                 <w:noProof/>
                 <w:webHidden/>
               </w:rPr>
-              <w:instrText xml:space="preserve"> PAGEREF _Toc243392860 \h </w:instrText>
+              <w:instrText xml:space="preserve"> PAGEREF _Toc243393749 \h </w:instrText>
             </w:r>
             <w:r>
               <w:rPr>
@@ -563,7 +563,7 @@
               <w14:ligatures w14:val="standardContextual"/>
             </w:rPr>
           </w:pPr>
-          <w:hyperlink w:anchor="_Toc243392861" w:history="1">
+          <w:hyperlink w:anchor="_Toc243393750" w:history="1">
             <w:r>
               <w:rPr>
                 <w:rStyle w:val="Hyperlink"/>
@@ -590,7 +590,7 @@
                 <w:noProof/>
                 <w:webHidden/>
               </w:rPr>
-              <w:instrText xml:space="preserve"> PAGEREF _Toc243392861 \h </w:instrText>
+              <w:instrText xml:space="preserve"> PAGEREF _Toc243393750 \h </w:instrText>
             </w:r>
             <w:r>
               <w:rPr>
@@ -639,7 +639,7 @@
               <w14:ligatures w14:val="standardContextual"/>
             </w:rPr>
           </w:pPr>
-          <w:hyperlink w:anchor="_Toc243392862" w:history="1">
+          <w:hyperlink w:anchor="_Toc243393751" w:history="1">
             <w:r>
               <w:rPr>
                 <w:rStyle w:val="Hyperlink"/>
@@ -666,7 +666,7 @@
                 <w:noProof/>
                 <w:webHidden/>
               </w:rPr>
-              <w:instrText xml:space="preserve"> PAGEREF _Toc243392862 \h </w:instrText>
+              <w:instrText xml:space="preserve"> PAGEREF _Toc243393751 \h </w:instrText>
             </w:r>
             <w:r>
               <w:rPr>
@@ -717,7 +717,7 @@
               <w14:ligatures w14:val="standardContextual"/>
             </w:rPr>
           </w:pPr>
-          <w:hyperlink w:anchor="_Toc243392863" w:history="1">
+          <w:hyperlink w:anchor="_Toc243393752" w:history="1">
             <w:r>
               <w:rPr>
                 <w:rStyle w:val="Hyperlink"/>
@@ -744,7 +744,7 @@
                 <w:noProof/>
                 <w:webHidden/>
               </w:rPr>
-              <w:instrText xml:space="preserve"> PAGEREF _Toc243392863 \h </w:instrText>
+              <w:instrText xml:space="preserve"> PAGEREF _Toc243393752 \h </w:instrText>
             </w:r>
             <w:r>
               <w:rPr>
@@ -793,7 +793,7 @@
               <w14:ligatures w14:val="standardContextual"/>
             </w:rPr>
           </w:pPr>
-          <w:hyperlink w:anchor="_Toc243392864" w:history="1">
+          <w:hyperlink w:anchor="_Toc243393753" w:history="1">
             <w:r>
               <w:rPr>
                 <w:rStyle w:val="Hyperlink"/>
@@ -820,7 +820,7 @@
                 <w:noProof/>
                 <w:webHidden/>
               </w:rPr>
-              <w:instrText xml:space="preserve"> PAGEREF _Toc243392864 \h </w:instrText>
+              <w:instrText xml:space="preserve"> PAGEREF _Toc243393753 \h </w:instrText>
             </w:r>
             <w:r>
               <w:rPr>
@@ -869,7 +869,7 @@
               <w14:ligatures w14:val="standardContextual"/>
             </w:rPr>
           </w:pPr>
-          <w:hyperlink w:anchor="_Toc243392865" w:history="1">
+          <w:hyperlink w:anchor="_Toc243393754" w:history="1">
             <w:r>
               <w:rPr>
                 <w:rStyle w:val="Hyperlink"/>
@@ -896,7 +896,7 @@
                 <w:noProof/>
                 <w:webHidden/>
               </w:rPr>
-              <w:instrText xml:space="preserve"> PAGEREF _Toc243392865 \h </w:instrText>
+              <w:instrText xml:space="preserve"> PAGEREF _Toc243393754 \h </w:instrText>
             </w:r>
             <w:r>
               <w:rPr>
@@ -945,7 +945,7 @@
               <w14:ligatures w14:val="standardContextual"/>
             </w:rPr>
           </w:pPr>
-          <w:hyperlink w:anchor="_Toc243392866" w:history="1">
+          <w:hyperlink w:anchor="_Toc243393755" w:history="1">
             <w:r>
               <w:rPr>
                 <w:rStyle w:val="Hyperlink"/>
@@ -972,7 +972,7 @@
                 <w:noProof/>
                 <w:webHidden/>
               </w:rPr>
-              <w:instrText xml:space="preserve"> PAGEREF _Toc243392866 \h </w:instrText>
+              <w:instrText xml:space="preserve"> PAGEREF _Toc243393755 \h </w:instrText>
             </w:r>
             <w:r>
               <w:rPr>
@@ -1021,7 +1021,7 @@
               <w14:ligatures w14:val="standardContextual"/>
             </w:rPr>
           </w:pPr>
-          <w:hyperlink w:anchor="_Toc243392867" w:history="1">
+          <w:hyperlink w:anchor="_Toc243393756" w:history="1">
             <w:r>
               <w:rPr>
                 <w:rStyle w:val="Hyperlink"/>
@@ -1057,7 +1057,7 @@
                 <w:noProof/>
                 <w:webHidden/>
               </w:rPr>
-              <w:instrText xml:space="preserve"> PAGEREF _Toc243392867 \h </w:instrText>
+              <w:instrText xml:space="preserve"> PAGEREF _Toc243393756 \h </w:instrText>
             </w:r>
             <w:r>
               <w:rPr>
@@ -1106,7 +1106,7 @@
               <w14:ligatures w14:val="standardContextual"/>
             </w:rPr>
           </w:pPr>
-          <w:hyperlink w:anchor="_Toc243392868" w:history="1">
+          <w:hyperlink w:anchor="_Toc243393757" w:history="1">
             <w:r>
               <w:rPr>
                 <w:rStyle w:val="Hyperlink"/>
@@ -1133,7 +1133,7 @@
                 <w:noProof/>
                 <w:webHidden/>
               </w:rPr>
-              <w:instrText xml:space="preserve"> PAGEREF _Toc243392868 \h </w:instrText>
+              <w:instrText xml:space="preserve"> PAGEREF _Toc243393757 \h </w:instrText>
             </w:r>
             <w:r>
               <w:rPr>
@@ -1184,7 +1184,7 @@
               <w14:ligatures w14:val="standardContextual"/>
             </w:rPr>
           </w:pPr>
-          <w:hyperlink w:anchor="_Toc243392869" w:history="1">
+          <w:hyperlink w:anchor="_Toc243393758" w:history="1">
             <w:r>
               <w:rPr>
                 <w:rStyle w:val="Hyperlink"/>
@@ -1211,7 +1211,7 @@
                 <w:noProof/>
                 <w:webHidden/>
               </w:rPr>
-              <w:instrText xml:space="preserve"> PAGEREF _Toc243392869 \h </w:instrText>
+              <w:instrText xml:space="preserve"> PAGEREF _Toc243393758 \h </w:instrText>
             </w:r>
             <w:r>
               <w:rPr>
@@ -1260,7 +1260,7 @@
               <w14:ligatures w14:val="standardContextual"/>
             </w:rPr>
           </w:pPr>
-          <w:hyperlink w:anchor="_Toc243392870" w:history="1">
+          <w:hyperlink w:anchor="_Toc243393759" w:history="1">
             <w:r>
               <w:rPr>
                 <w:rStyle w:val="Hyperlink"/>
@@ -1287,7 +1287,7 @@
                 <w:noProof/>
                 <w:webHidden/>
               </w:rPr>
-              <w:instrText xml:space="preserve"> PAGEREF _Toc243392870 \h </w:instrText>
+              <w:instrText xml:space="preserve"> PAGEREF _Toc243393759 \h </w:instrText>
             </w:r>
             <w:r>
               <w:rPr>
@@ -1336,7 +1336,7 @@
               <w14:ligatures w14:val="standardContextual"/>
             </w:rPr>
           </w:pPr>
-          <w:hyperlink w:anchor="_Toc243392871" w:history="1">
+          <w:hyperlink w:anchor="_Toc243393760" w:history="1">
             <w:r>
               <w:rPr>
                 <w:rStyle w:val="Hyperlink"/>
@@ -1363,7 +1363,7 @@
                 <w:noProof/>
                 <w:webHidden/>
               </w:rPr>
-              <w:instrText xml:space="preserve"> PAGEREF _Toc243392871 \h </w:instrText>
+              <w:instrText xml:space="preserve"> PAGEREF _Toc243393760 \h </w:instrText>
             </w:r>
             <w:r>
               <w:rPr>
@@ -1412,7 +1412,7 @@
               <w14:ligatures w14:val="standardContextual"/>
             </w:rPr>
           </w:pPr>
-          <w:hyperlink w:anchor="_Toc243392872" w:history="1">
+          <w:hyperlink w:anchor="_Toc243393761" w:history="1">
             <w:r>
               <w:rPr>
                 <w:rStyle w:val="Hyperlink"/>
@@ -1439,7 +1439,7 @@
                 <w:noProof/>
                 <w:webHidden/>
               </w:rPr>
-              <w:instrText xml:space="preserve"> PAGEREF _Toc243392872 \h </w:instrText>
+              <w:instrText xml:space="preserve"> PAGEREF _Toc243393761 \h </w:instrText>
             </w:r>
             <w:r>
               <w:rPr>
@@ -1486,7 +1486,7 @@
               <w14:ligatures w14:val="standardContextual"/>
             </w:rPr>
           </w:pPr>
-          <w:hyperlink w:anchor="_Toc243392873" w:history="1">
+          <w:hyperlink w:anchor="_Toc243393762" w:history="1">
             <w:r>
               <w:rPr>
                 <w:rStyle w:val="Hyperlink"/>
@@ -1513,7 +1513,7 @@
                 <w:noProof/>
                 <w:webHidden/>
               </w:rPr>
-              <w:instrText xml:space="preserve"> PAGEREF _Toc243392873 \h </w:instrText>
+              <w:instrText xml:space="preserve"> PAGEREF _Toc243393762 \h </w:instrText>
             </w:r>
             <w:r>
               <w:rPr>
@@ -1560,7 +1560,7 @@
               <w14:ligatures w14:val="standardContextual"/>
             </w:rPr>
           </w:pPr>
-          <w:hyperlink w:anchor="_Toc243392874" w:history="1">
+          <w:hyperlink w:anchor="_Toc243393763" w:history="1">
             <w:r>
               <w:rPr>
                 <w:rStyle w:val="Hyperlink"/>
@@ -1587,7 +1587,7 @@
                 <w:noProof/>
                 <w:webHidden/>
               </w:rPr>
-              <w:instrText xml:space="preserve"> PAGEREF _Toc243392874 \h </w:instrText>
+              <w:instrText xml:space="preserve"> PAGEREF _Toc243393763 \h </w:instrText>
             </w:r>
             <w:r>
               <w:rPr>
@@ -1636,7 +1636,7 @@
               <w14:ligatures w14:val="standardContextual"/>
             </w:rPr>
           </w:pPr>
-          <w:hyperlink w:anchor="_Toc243392875" w:history="1">
+          <w:hyperlink w:anchor="_Toc243393764" w:history="1">
             <w:r>
               <w:rPr>
                 <w:rStyle w:val="Hyperlink"/>
@@ -1663,7 +1663,7 @@
                 <w:noProof/>
                 <w:webHidden/>
               </w:rPr>
-              <w:instrText xml:space="preserve"> PAGEREF _Toc243392875 \h </w:instrText>
+              <w:instrText xml:space="preserve"> PAGEREF _Toc243393764 \h </w:instrText>
             </w:r>
             <w:r>
               <w:rPr>
@@ -1714,7 +1714,7 @@
               <w14:ligatures w14:val="standardContextual"/>
             </w:rPr>
           </w:pPr>
-          <w:hyperlink w:anchor="_Toc243392876" w:history="1">
+          <w:hyperlink w:anchor="_Toc243393765" w:history="1">
             <w:r>
               <w:rPr>
                 <w:rStyle w:val="Hyperlink"/>
@@ -1741,7 +1741,7 @@
                 <w:noProof/>
                 <w:webHidden/>
               </w:rPr>
-              <w:instrText xml:space="preserve"> PAGEREF _Toc243392876 \h </w:instrText>
+              <w:instrText xml:space="preserve"> PAGEREF _Toc243393765 \h </w:instrText>
             </w:r>
             <w:r>
               <w:rPr>
@@ -1790,7 +1790,7 @@
               <w14:ligatures w14:val="standardContextual"/>
             </w:rPr>
           </w:pPr>
-          <w:hyperlink w:anchor="_Toc243392877" w:history="1">
+          <w:hyperlink w:anchor="_Toc243393766" w:history="1">
             <w:r>
               <w:rPr>
                 <w:rStyle w:val="Hyperlink"/>
@@ -1817,7 +1817,7 @@
                 <w:noProof/>
                 <w:webHidden/>
               </w:rPr>
-              <w:instrText xml:space="preserve"> PAGEREF _Toc243392877 \h </w:instrText>
+              <w:instrText xml:space="preserve"> PAGEREF _Toc243393766 \h </w:instrText>
             </w:r>
             <w:r>
               <w:rPr>
@@ -1866,7 +1866,7 @@
               <w14:ligatures w14:val="standardContextual"/>
             </w:rPr>
           </w:pPr>
-          <w:hyperlink w:anchor="_Toc243392878" w:history="1">
+          <w:hyperlink w:anchor="_Toc243393767" w:history="1">
             <w:r>
               <w:rPr>
                 <w:rStyle w:val="Hyperlink"/>
@@ -1893,7 +1893,7 @@
                 <w:noProof/>
                 <w:webHidden/>
               </w:rPr>
-              <w:instrText xml:space="preserve"> PAGEREF _Toc243392878 \h </w:instrText>
+              <w:instrText xml:space="preserve"> PAGEREF _Toc243393767 \h </w:instrText>
             </w:r>
             <w:r>
               <w:rPr>
@@ -1942,7 +1942,7 @@
               <w14:ligatures w14:val="standardContextual"/>
             </w:rPr>
           </w:pPr>
-          <w:hyperlink w:anchor="_Toc243392879" w:history="1">
+          <w:hyperlink w:anchor="_Toc243393768" w:history="1">
             <w:r>
               <w:rPr>
                 <w:rStyle w:val="Hyperlink"/>
@@ -1969,7 +1969,7 @@
                 <w:noProof/>
                 <w:webHidden/>
               </w:rPr>
-              <w:instrText xml:space="preserve"> PAGEREF _Toc243392879 \h </w:instrText>
+              <w:instrText xml:space="preserve"> PAGEREF _Toc243393768 \h </w:instrText>
             </w:r>
             <w:r>
               <w:rPr>
@@ -2018,7 +2018,7 @@
               <w14:ligatures w14:val="standardContextual"/>
             </w:rPr>
           </w:pPr>
-          <w:hyperlink w:anchor="_Toc243392880" w:history="1">
+          <w:hyperlink w:anchor="_Toc243393769" w:history="1">
             <w:r>
               <w:rPr>
                 <w:rStyle w:val="Hyperlink"/>
@@ -2045,7 +2045,7 @@
                 <w:noProof/>
                 <w:webHidden/>
               </w:rPr>
-              <w:instrText xml:space="preserve"> PAGEREF _Toc243392880 \h </w:instrText>
+              <w:instrText xml:space="preserve"> PAGEREF _Toc243393769 \h </w:instrText>
             </w:r>
             <w:r>
               <w:rPr>
@@ -2094,7 +2094,7 @@
               <w14:ligatures w14:val="standardContextual"/>
             </w:rPr>
           </w:pPr>
-          <w:hyperlink w:anchor="_Toc243392881" w:history="1">
+          <w:hyperlink w:anchor="_Toc243393770" w:history="1">
             <w:r>
               <w:rPr>
                 <w:rStyle w:val="Hyperlink"/>
@@ -2121,7 +2121,7 @@
                 <w:noProof/>
                 <w:webHidden/>
               </w:rPr>
-              <w:instrText xml:space="preserve"> PAGEREF _Toc243392881 \h </w:instrText>
+              <w:instrText xml:space="preserve"> PAGEREF _Toc243393770 \h </w:instrText>
             </w:r>
             <w:r>
               <w:rPr>
@@ -2170,7 +2170,7 @@
               <w14:ligatures w14:val="standardContextual"/>
             </w:rPr>
           </w:pPr>
-          <w:hyperlink w:anchor="_Toc243392882" w:history="1">
+          <w:hyperlink w:anchor="_Toc243393771" w:history="1">
             <w:r>
               <w:rPr>
                 <w:rStyle w:val="Hyperlink"/>
@@ -2197,7 +2197,7 @@
                 <w:noProof/>
                 <w:webHidden/>
               </w:rPr>
-              <w:instrText xml:space="preserve"> PAGEREF _Toc243392882 \h </w:instrText>
+              <w:instrText xml:space="preserve"> PAGEREF _Toc243393771 \h </w:instrText>
             </w:r>
             <w:r>
               <w:rPr>
@@ -2248,7 +2248,7 @@
               <w14:ligatures w14:val="standardContextual"/>
             </w:rPr>
           </w:pPr>
-          <w:hyperlink w:anchor="_Toc243392883" w:history="1">
+          <w:hyperlink w:anchor="_Toc243393772" w:history="1">
             <w:r>
               <w:rPr>
                 <w:rStyle w:val="Hyperlink"/>
@@ -2275,7 +2275,7 @@
                 <w:noProof/>
                 <w:webHidden/>
               </w:rPr>
-              <w:instrText xml:space="preserve"> PAGEREF _Toc243392883 \h </w:instrText>
+              <w:instrText xml:space="preserve"> PAGEREF _Toc243393772 \h </w:instrText>
             </w:r>
             <w:r>
               <w:rPr>
@@ -2324,7 +2324,7 @@
               <w14:ligatures w14:val="standardContextual"/>
             </w:rPr>
           </w:pPr>
-          <w:hyperlink w:anchor="_Toc243392884" w:history="1">
+          <w:hyperlink w:anchor="_Toc243393773" w:history="1">
             <w:r>
               <w:rPr>
                 <w:rStyle w:val="Hyperlink"/>
@@ -2351,7 +2351,7 @@
                 <w:noProof/>
                 <w:webHidden/>
               </w:rPr>
-              <w:instrText xml:space="preserve"> PAGEREF _Toc243392884 \h </w:instrText>
+              <w:instrText xml:space="preserve"> PAGEREF _Toc243393773 \h </w:instrText>
             </w:r>
             <w:r>
               <w:rPr>
@@ -2400,7 +2400,7 @@
               <w14:ligatures w14:val="standardContextual"/>
             </w:rPr>
           </w:pPr>
-          <w:hyperlink w:anchor="_Toc243392885" w:history="1">
+          <w:hyperlink w:anchor="_Toc243393774" w:history="1">
             <w:r>
               <w:rPr>
                 <w:rStyle w:val="Hyperlink"/>
@@ -2427,7 +2427,7 @@
                 <w:noProof/>
                 <w:webHidden/>
               </w:rPr>
-              <w:instrText xml:space="preserve"> PAGEREF _Toc243392885 \h </w:instrText>
+              <w:instrText xml:space="preserve"> PAGEREF _Toc243393774 \h </w:instrText>
             </w:r>
             <w:r>
               <w:rPr>
@@ -2476,7 +2476,7 @@
               <w14:ligatures w14:val="standardContextual"/>
             </w:rPr>
           </w:pPr>
-          <w:hyperlink w:anchor="_Toc243392886" w:history="1">
+          <w:hyperlink w:anchor="_Toc243393775" w:history="1">
             <w:r>
               <w:rPr>
                 <w:rStyle w:val="Hyperlink"/>
@@ -2503,7 +2503,7 @@
                 <w:noProof/>
                 <w:webHidden/>
               </w:rPr>
-              <w:instrText xml:space="preserve"> PAGEREF _Toc243392886 \h </w:instrText>
+              <w:instrText xml:space="preserve"> PAGEREF _Toc243393775 \h </w:instrText>
             </w:r>
             <w:r>
               <w:rPr>
@@ -2552,7 +2552,7 @@
               <w14:ligatures w14:val="standardContextual"/>
             </w:rPr>
           </w:pPr>
-          <w:hyperlink w:anchor="_Toc243392887" w:history="1">
+          <w:hyperlink w:anchor="_Toc243393776" w:history="1">
             <w:r>
               <w:rPr>
                 <w:rStyle w:val="Hyperlink"/>
@@ -2579,7 +2579,7 @@
                 <w:noProof/>
                 <w:webHidden/>
               </w:rPr>
-              <w:instrText xml:space="preserve"> PAGEREF _Toc243392887 \h </w:instrText>
+              <w:instrText xml:space="preserve"> PAGEREF _Toc243393776 \h </w:instrText>
             </w:r>
             <w:r>
               <w:rPr>
@@ -2630,7 +2630,7 @@
               <w14:ligatures w14:val="standardContextual"/>
             </w:rPr>
           </w:pPr>
-          <w:hyperlink w:anchor="_Toc243392888" w:history="1">
+          <w:hyperlink w:anchor="_Toc243393777" w:history="1">
             <w:r>
               <w:rPr>
                 <w:rStyle w:val="Hyperlink"/>
@@ -2657,7 +2657,7 @@
                 <w:noProof/>
                 <w:webHidden/>
               </w:rPr>
-              <w:instrText xml:space="preserve"> PAGEREF _Toc243392888 \h </w:instrText>
+              <w:instrText xml:space="preserve"> PAGEREF _Toc243393777 \h </w:instrText>
             </w:r>
             <w:r>
               <w:rPr>
@@ -2708,7 +2708,7 @@
               <w14:ligatures w14:val="standardContextual"/>
             </w:rPr>
           </w:pPr>
-          <w:hyperlink w:anchor="_Toc243392889" w:history="1">
+          <w:hyperlink w:anchor="_Toc243393778" w:history="1">
             <w:r>
               <w:rPr>
                 <w:rStyle w:val="Hyperlink"/>
@@ -2735,7 +2735,7 @@
                 <w:noProof/>
                 <w:webHidden/>
               </w:rPr>
-              <w:instrText xml:space="preserve"> PAGEREF _Toc243392889 \h </w:instrText>
+              <w:instrText xml:space="preserve"> PAGEREF _Toc243393778 \h </w:instrText>
             </w:r>
             <w:r>
               <w:rPr>
@@ -2782,7 +2782,7 @@
       <w:pPr>
         <w:pStyle w:val="Heading1"/>
       </w:pPr>
-      <w:bookmarkStart w:id="1" w:name="_Toc243392858"/>
+      <w:bookmarkStart w:id="1" w:name="_Toc243393747"/>
       <w:r>
         <w:lastRenderedPageBreak/>
         <w:t>List</w:t>
@@ -4288,7 +4288,7 @@
       <w:r>
         <w:fldChar w:fldCharType="end"/>
       </w:r>
-      <w:bookmarkStart w:id="2" w:name="_Toc243392859"/>
+      <w:bookmarkStart w:id="2" w:name="_Toc243393748"/>
       <w:r>
         <w:t>List of Tables</w:t>
       </w:r>
@@ -4319,7 +4319,7 @@
       <w:r>
         <w:fldChar w:fldCharType="separate"/>
       </w:r>
-      <w:hyperlink w:anchor="_Toc243392890" w:history="1">
+      <w:hyperlink w:anchor="_Toc243393779" w:history="1">
         <w:r>
           <w:rPr>
             <w:rStyle w:val="Hyperlink"/>
@@ -4346,7 +4346,7 @@
             <w:noProof/>
             <w:webHidden/>
           </w:rPr>
-          <w:instrText xml:space="preserve"> PAGEREF _Toc243392890 \h </w:instrText>
+          <w:instrText xml:space="preserve"> PAGEREF _Toc243393779 \h </w:instrText>
         </w:r>
         <w:r>
           <w:rPr>
@@ -4393,7 +4393,7 @@
           <w14:ligatures w14:val="standardContextual"/>
         </w:rPr>
       </w:pPr>
-      <w:hyperlink w:anchor="_Toc243392891" w:history="1">
+      <w:hyperlink w:anchor="_Toc243393780" w:history="1">
         <w:r>
           <w:rPr>
             <w:rStyle w:val="Hyperlink"/>
@@ -4420,7 +4420,7 @@
             <w:noProof/>
             <w:webHidden/>
           </w:rPr>
-          <w:instrText xml:space="preserve"> PAGEREF _Toc243392891 \h </w:instrText>
+          <w:instrText xml:space="preserve"> PAGEREF _Toc243393780 \h </w:instrText>
         </w:r>
         <w:r>
           <w:rPr>
@@ -4465,7 +4465,7 @@
       <w:pPr>
         <w:pStyle w:val="Heading1"/>
       </w:pPr>
-      <w:bookmarkStart w:id="3" w:name="_Toc243392860"/>
+      <w:bookmarkStart w:id="3" w:name="_Toc243393749"/>
       <w:r>
         <w:rPr>
           <w:color w:val="0F4761" w:themeColor="accent1" w:themeShade="BF"/>
@@ -4484,7 +4484,7 @@
       <w:pPr>
         <w:pStyle w:val="Heading2"/>
       </w:pPr>
-      <w:bookmarkStart w:id="4" w:name="_Toc243392861"/>
+      <w:bookmarkStart w:id="4" w:name="_Toc243393750"/>
       <w:r>
         <w:t>1.1 Background</w:t>
       </w:r>
@@ -4519,7 +4519,7 @@
       <w:pPr>
         <w:pStyle w:val="Heading2"/>
       </w:pPr>
-      <w:bookmarkStart w:id="5" w:name="_Toc243392862"/>
+      <w:bookmarkStart w:id="5" w:name="_Toc243393751"/>
       <w:r>
         <w:t xml:space="preserve">1.2 Study </w:t>
       </w:r>
@@ -4561,7 +4561,7 @@
       <w:pPr>
         <w:pStyle w:val="Heading1"/>
       </w:pPr>
-      <w:bookmarkStart w:id="6" w:name="_Toc243392863"/>
+      <w:bookmarkStart w:id="6" w:name="_Toc243393752"/>
       <w:r>
         <w:t>2. Overview of existing research</w:t>
       </w:r>
@@ -4576,7 +4576,7 @@
       <w:pPr>
         <w:pStyle w:val="Heading2"/>
       </w:pPr>
-      <w:bookmarkStart w:id="7" w:name="_Toc243392864"/>
+      <w:bookmarkStart w:id="7" w:name="_Toc243393753"/>
       <w:r>
         <w:t>2.1 Animal movement/telemetry</w:t>
       </w:r>
@@ -4622,7 +4622,7 @@
       <w:pPr>
         <w:pStyle w:val="Heading2"/>
       </w:pPr>
-      <w:bookmarkStart w:id="8" w:name="_Toc243392865"/>
+      <w:bookmarkStart w:id="8" w:name="_Toc243393754"/>
       <w:r>
         <w:t>2.2 Snake spatial ecology</w:t>
       </w:r>
@@ -4637,7 +4637,7 @@
       <w:pPr>
         <w:pStyle w:val="Heading2"/>
       </w:pPr>
-      <w:bookmarkStart w:id="9" w:name="_Toc243392866"/>
+      <w:bookmarkStart w:id="9" w:name="_Toc243393755"/>
       <w:r>
         <w:t>2.3 Python home range</w:t>
       </w:r>
@@ -4810,7 +4810,7 @@
       <w:pPr>
         <w:pStyle w:val="Heading2"/>
       </w:pPr>
-      <w:bookmarkStart w:id="10" w:name="_Toc243392867"/>
+      <w:bookmarkStart w:id="10" w:name="_Toc243393756"/>
       <w:r>
         <w:t xml:space="preserve">2.4 </w:t>
       </w:r>
@@ -4828,7 +4828,7 @@
       <w:pPr>
         <w:pStyle w:val="Heading2"/>
       </w:pPr>
-      <w:bookmarkStart w:id="11" w:name="_Toc243392868"/>
+      <w:bookmarkStart w:id="11" w:name="_Toc243393757"/>
       <w:r>
         <w:t>2.5 Methodological literature</w:t>
       </w:r>
@@ -4839,7 +4839,7 @@
       <w:pPr>
         <w:pStyle w:val="Heading1"/>
       </w:pPr>
-      <w:bookmarkStart w:id="12" w:name="_Toc243392869"/>
+      <w:bookmarkStart w:id="12" w:name="_Toc243393758"/>
       <w:r>
         <w:t>3.</w:t>
       </w:r>
@@ -4852,7 +4852,7 @@
       <w:pPr>
         <w:pStyle w:val="Heading2"/>
       </w:pPr>
-      <w:bookmarkStart w:id="13" w:name="_Toc243392870"/>
+      <w:bookmarkStart w:id="13" w:name="_Toc243393759"/>
       <w:r>
         <w:t>3.</w:t>
       </w:r>
@@ -4870,7 +4870,7 @@
       <w:pPr>
         <w:pStyle w:val="Heading2"/>
       </w:pPr>
-      <w:bookmarkStart w:id="14" w:name="_Toc243392871"/>
+      <w:bookmarkStart w:id="14" w:name="_Toc243393760"/>
       <w:r>
         <w:t>3.</w:t>
       </w:r>
@@ -4918,7 +4918,7 @@
       <w:pPr>
         <w:pStyle w:val="Heading2"/>
       </w:pPr>
-      <w:bookmarkStart w:id="15" w:name="_Toc243392872"/>
+      <w:bookmarkStart w:id="15" w:name="_Toc243393761"/>
       <w:r>
         <w:t>3.</w:t>
       </w:r>
@@ -4932,7 +4932,7 @@
       <w:pPr>
         <w:pStyle w:val="Heading3"/>
       </w:pPr>
-      <w:bookmarkStart w:id="16" w:name="_Toc243392873"/>
+      <w:bookmarkStart w:id="16" w:name="_Toc243393762"/>
       <w:r>
         <w:t>3.</w:t>
       </w:r>
@@ -4946,7 +4946,7 @@
       <w:pPr>
         <w:pStyle w:val="Heading3"/>
       </w:pPr>
-      <w:bookmarkStart w:id="17" w:name="_Toc243392874"/>
+      <w:bookmarkStart w:id="17" w:name="_Toc243393763"/>
       <w:r>
         <w:t>3.</w:t>
       </w:r>
@@ -4960,7 +4960,7 @@
       <w:pPr>
         <w:pStyle w:val="Heading2"/>
       </w:pPr>
-      <w:bookmarkStart w:id="18" w:name="_Toc243392875"/>
+      <w:bookmarkStart w:id="18" w:name="_Toc243393764"/>
       <w:r>
         <w:t>3.</w:t>
       </w:r>
@@ -4974,7 +4974,7 @@
       <w:pPr>
         <w:pStyle w:val="Heading1"/>
       </w:pPr>
-      <w:bookmarkStart w:id="19" w:name="_Toc243392876"/>
+      <w:bookmarkStart w:id="19" w:name="_Toc243393765"/>
       <w:r>
         <w:t>4.</w:t>
       </w:r>
@@ -4987,7 +4987,7 @@
       <w:pPr>
         <w:pStyle w:val="Heading2"/>
       </w:pPr>
-      <w:bookmarkStart w:id="20" w:name="_Toc243392877"/>
+      <w:bookmarkStart w:id="20" w:name="_Toc243393766"/>
       <w:r>
         <w:t>4.</w:t>
       </w:r>
@@ -5001,7 +5001,7 @@
       <w:pPr>
         <w:pStyle w:val="Heading2"/>
       </w:pPr>
-      <w:bookmarkStart w:id="21" w:name="_Toc243392878"/>
+      <w:bookmarkStart w:id="21" w:name="_Toc243393767"/>
       <w:r>
         <w:lastRenderedPageBreak/>
         <w:t>4.</w:t>
@@ -5017,7 +5017,7 @@
         <w:pStyle w:val="Caption"/>
         <w:keepNext/>
       </w:pPr>
-      <w:bookmarkStart w:id="22" w:name="_Toc243392890"/>
+      <w:bookmarkStart w:id="22" w:name="_Toc243393779"/>
       <w:r>
         <w:t xml:space="preserve">Table </w:t>
       </w:r>
@@ -8630,7 +8630,7 @@
       <w:pPr>
         <w:pStyle w:val="Heading2"/>
       </w:pPr>
-      <w:bookmarkStart w:id="23" w:name="_Toc243392879"/>
+      <w:bookmarkStart w:id="23" w:name="_Toc243393768"/>
       <w:r>
         <w:t>4.</w:t>
       </w:r>
@@ -8645,7 +8645,7 @@
         <w:pStyle w:val="Caption"/>
         <w:keepNext/>
       </w:pPr>
-      <w:bookmarkStart w:id="24" w:name="_Toc243392891"/>
+      <w:bookmarkStart w:id="24" w:name="_Toc243393780"/>
       <w:r>
         <w:t xml:space="preserve">Table </w:t>
       </w:r>
@@ -8823,51 +8823,91 @@
         <w:tc>
           <w:tcPr>
             <w:tcW w:w="1573" w:type="dxa"/>
-          </w:tcPr>
-          <w:p>
-            <w:pPr>
-              <w:cnfStyle w:val="000000100000" w:firstRow="0" w:lastRow="0" w:firstColumn="0" w:lastColumn="0" w:oddVBand="0" w:evenVBand="0" w:oddHBand="1" w:evenHBand="0" w:firstRowFirstColumn="0" w:firstRowLastColumn="0" w:lastRowFirstColumn="0" w:lastRowLastColumn="0"/>
-            </w:pPr>
+            <w:vAlign w:val="bottom"/>
+          </w:tcPr>
+          <w:p>
+            <w:pPr>
+              <w:cnfStyle w:val="000000100000" w:firstRow="0" w:lastRow="0" w:firstColumn="0" w:lastColumn="0" w:oddVBand="0" w:evenVBand="0" w:oddHBand="1" w:evenHBand="0" w:firstRowFirstColumn="0" w:firstRowLastColumn="0" w:lastRowFirstColumn="0" w:lastRowLastColumn="0"/>
+            </w:pPr>
+            <w:r>
+              <w:rPr>
+                <w:rFonts w:ascii="Aptos Narrow" w:hAnsi="Aptos Narrow"/>
+                <w:color w:val="000000"/>
+              </w:rPr>
+              <w:t>1.45</w:t>
+            </w:r>
           </w:p>
         </w:tc>
         <w:tc>
           <w:tcPr>
             <w:tcW w:w="1559" w:type="dxa"/>
-          </w:tcPr>
-          <w:p>
-            <w:pPr>
-              <w:cnfStyle w:val="000000100000" w:firstRow="0" w:lastRow="0" w:firstColumn="0" w:lastColumn="0" w:oddVBand="0" w:evenVBand="0" w:oddHBand="1" w:evenHBand="0" w:firstRowFirstColumn="0" w:firstRowLastColumn="0" w:lastRowFirstColumn="0" w:lastRowLastColumn="0"/>
-            </w:pPr>
+            <w:vAlign w:val="bottom"/>
+          </w:tcPr>
+          <w:p>
+            <w:pPr>
+              <w:cnfStyle w:val="000000100000" w:firstRow="0" w:lastRow="0" w:firstColumn="0" w:lastColumn="0" w:oddVBand="0" w:evenVBand="0" w:oddHBand="1" w:evenHBand="0" w:firstRowFirstColumn="0" w:firstRowLastColumn="0" w:lastRowFirstColumn="0" w:lastRowLastColumn="0"/>
+            </w:pPr>
+            <w:r>
+              <w:rPr>
+                <w:rFonts w:ascii="Aptos Narrow" w:hAnsi="Aptos Narrow"/>
+                <w:color w:val="000000"/>
+              </w:rPr>
+              <w:t>2.9</w:t>
+            </w:r>
           </w:p>
         </w:tc>
         <w:tc>
           <w:tcPr>
             <w:tcW w:w="1701" w:type="dxa"/>
-          </w:tcPr>
-          <w:p>
-            <w:pPr>
-              <w:cnfStyle w:val="000000100000" w:firstRow="0" w:lastRow="0" w:firstColumn="0" w:lastColumn="0" w:oddVBand="0" w:evenVBand="0" w:oddHBand="1" w:evenHBand="0" w:firstRowFirstColumn="0" w:firstRowLastColumn="0" w:lastRowFirstColumn="0" w:lastRowLastColumn="0"/>
-            </w:pPr>
+            <w:vAlign w:val="bottom"/>
+          </w:tcPr>
+          <w:p>
+            <w:pPr>
+              <w:cnfStyle w:val="000000100000" w:firstRow="0" w:lastRow="0" w:firstColumn="0" w:lastColumn="0" w:oddVBand="0" w:evenVBand="0" w:oddHBand="1" w:evenHBand="0" w:firstRowFirstColumn="0" w:firstRowLastColumn="0" w:lastRowFirstColumn="0" w:lastRowLastColumn="0"/>
+            </w:pPr>
+            <w:r>
+              <w:rPr>
+                <w:rFonts w:ascii="Aptos Narrow" w:hAnsi="Aptos Narrow"/>
+                <w:color w:val="000000"/>
+              </w:rPr>
+              <w:t>0.29</w:t>
+            </w:r>
           </w:p>
         </w:tc>
         <w:tc>
           <w:tcPr>
             <w:tcW w:w="1701" w:type="dxa"/>
-          </w:tcPr>
-          <w:p>
-            <w:pPr>
-              <w:cnfStyle w:val="000000100000" w:firstRow="0" w:lastRow="0" w:firstColumn="0" w:lastColumn="0" w:oddVBand="0" w:evenVBand="0" w:oddHBand="1" w:evenHBand="0" w:firstRowFirstColumn="0" w:firstRowLastColumn="0" w:lastRowFirstColumn="0" w:lastRowLastColumn="0"/>
-            </w:pPr>
+            <w:vAlign w:val="bottom"/>
+          </w:tcPr>
+          <w:p>
+            <w:pPr>
+              <w:cnfStyle w:val="000000100000" w:firstRow="0" w:lastRow="0" w:firstColumn="0" w:lastColumn="0" w:oddVBand="0" w:evenVBand="0" w:oddHBand="1" w:evenHBand="0" w:firstRowFirstColumn="0" w:firstRowLastColumn="0" w:lastRowFirstColumn="0" w:lastRowLastColumn="0"/>
+            </w:pPr>
+            <w:r>
+              <w:rPr>
+                <w:rFonts w:ascii="Aptos Narrow" w:hAnsi="Aptos Narrow"/>
+                <w:color w:val="000000"/>
+              </w:rPr>
+              <w:t>0.58</w:t>
+            </w:r>
           </w:p>
         </w:tc>
         <w:tc>
           <w:tcPr>
             <w:tcW w:w="1984" w:type="dxa"/>
-          </w:tcPr>
-          <w:p>
-            <w:pPr>
-              <w:cnfStyle w:val="000000100000" w:firstRow="0" w:lastRow="0" w:firstColumn="0" w:lastColumn="0" w:oddVBand="0" w:evenVBand="0" w:oddHBand="1" w:evenHBand="0" w:firstRowFirstColumn="0" w:firstRowLastColumn="0" w:lastRowFirstColumn="0" w:lastRowLastColumn="0"/>
-            </w:pPr>
+            <w:vAlign w:val="bottom"/>
+          </w:tcPr>
+          <w:p>
+            <w:pPr>
+              <w:cnfStyle w:val="000000100000" w:firstRow="0" w:lastRow="0" w:firstColumn="0" w:lastColumn="0" w:oddVBand="0" w:evenVBand="0" w:oddHBand="1" w:evenHBand="0" w:firstRowFirstColumn="0" w:firstRowLastColumn="0" w:lastRowFirstColumn="0" w:lastRowLastColumn="0"/>
+            </w:pPr>
+            <w:r>
+              <w:rPr>
+                <w:rFonts w:ascii="Aptos Narrow" w:hAnsi="Aptos Narrow"/>
+                <w:color w:val="000000"/>
+              </w:rPr>
+              <w:t>1.16</w:t>
+            </w:r>
           </w:p>
         </w:tc>
       </w:tr>
@@ -8891,51 +8931,91 @@
         <w:tc>
           <w:tcPr>
             <w:tcW w:w="1573" w:type="dxa"/>
+            <w:vAlign w:val="bottom"/>
           </w:tcPr>
           <w:p>
             <w:pPr>
               <w:cnfStyle w:val="000000000000" w:firstRow="0" w:lastRow="0" w:firstColumn="0" w:lastColumn="0" w:oddVBand="0" w:evenVBand="0" w:oddHBand="0" w:evenHBand="0" w:firstRowFirstColumn="0" w:firstRowLastColumn="0" w:lastRowFirstColumn="0" w:lastRowLastColumn="0"/>
             </w:pPr>
+            <w:r>
+              <w:rPr>
+                <w:rFonts w:ascii="Aptos Narrow" w:hAnsi="Aptos Narrow"/>
+                <w:color w:val="000000"/>
+              </w:rPr>
+              <w:t>0.74</w:t>
+            </w:r>
           </w:p>
         </w:tc>
         <w:tc>
           <w:tcPr>
             <w:tcW w:w="1559" w:type="dxa"/>
+            <w:vAlign w:val="bottom"/>
           </w:tcPr>
           <w:p>
             <w:pPr>
               <w:cnfStyle w:val="000000000000" w:firstRow="0" w:lastRow="0" w:firstColumn="0" w:lastColumn="0" w:oddVBand="0" w:evenVBand="0" w:oddHBand="0" w:evenHBand="0" w:firstRowFirstColumn="0" w:firstRowLastColumn="0" w:lastRowFirstColumn="0" w:lastRowLastColumn="0"/>
             </w:pPr>
+            <w:r>
+              <w:rPr>
+                <w:rFonts w:ascii="Aptos Narrow" w:hAnsi="Aptos Narrow"/>
+                <w:color w:val="000000"/>
+              </w:rPr>
+              <w:t>1.47</w:t>
+            </w:r>
           </w:p>
         </w:tc>
         <w:tc>
           <w:tcPr>
             <w:tcW w:w="1701" w:type="dxa"/>
+            <w:vAlign w:val="bottom"/>
           </w:tcPr>
           <w:p>
             <w:pPr>
               <w:cnfStyle w:val="000000000000" w:firstRow="0" w:lastRow="0" w:firstColumn="0" w:lastColumn="0" w:oddVBand="0" w:evenVBand="0" w:oddHBand="0" w:evenHBand="0" w:firstRowFirstColumn="0" w:firstRowLastColumn="0" w:lastRowFirstColumn="0" w:lastRowLastColumn="0"/>
             </w:pPr>
+            <w:r>
+              <w:rPr>
+                <w:rFonts w:ascii="Aptos Narrow" w:hAnsi="Aptos Narrow"/>
+                <w:color w:val="000000"/>
+              </w:rPr>
+              <w:t>0.15</w:t>
+            </w:r>
           </w:p>
         </w:tc>
         <w:tc>
           <w:tcPr>
             <w:tcW w:w="1701" w:type="dxa"/>
+            <w:vAlign w:val="bottom"/>
           </w:tcPr>
           <w:p>
             <w:pPr>
               <w:cnfStyle w:val="000000000000" w:firstRow="0" w:lastRow="0" w:firstColumn="0" w:lastColumn="0" w:oddVBand="0" w:evenVBand="0" w:oddHBand="0" w:evenHBand="0" w:firstRowFirstColumn="0" w:firstRowLastColumn="0" w:lastRowFirstColumn="0" w:lastRowLastColumn="0"/>
             </w:pPr>
+            <w:r>
+              <w:rPr>
+                <w:rFonts w:ascii="Aptos Narrow" w:hAnsi="Aptos Narrow"/>
+                <w:color w:val="000000"/>
+              </w:rPr>
+              <w:t>0.29</w:t>
+            </w:r>
           </w:p>
         </w:tc>
         <w:tc>
           <w:tcPr>
             <w:tcW w:w="1984" w:type="dxa"/>
+            <w:vAlign w:val="bottom"/>
           </w:tcPr>
           <w:p>
             <w:pPr>
               <w:cnfStyle w:val="000000000000" w:firstRow="0" w:lastRow="0" w:firstColumn="0" w:lastColumn="0" w:oddVBand="0" w:evenVBand="0" w:oddHBand="0" w:evenHBand="0" w:firstRowFirstColumn="0" w:firstRowLastColumn="0" w:lastRowFirstColumn="0" w:lastRowLastColumn="0"/>
             </w:pPr>
+            <w:r>
+              <w:rPr>
+                <w:rFonts w:ascii="Aptos Narrow" w:hAnsi="Aptos Narrow"/>
+                <w:color w:val="000000"/>
+              </w:rPr>
+              <w:t>0.59</w:t>
+            </w:r>
           </w:p>
         </w:tc>
       </w:tr>
@@ -8962,51 +9042,91 @@
         <w:tc>
           <w:tcPr>
             <w:tcW w:w="1573" w:type="dxa"/>
-          </w:tcPr>
-          <w:p>
-            <w:pPr>
-              <w:cnfStyle w:val="000000100000" w:firstRow="0" w:lastRow="0" w:firstColumn="0" w:lastColumn="0" w:oddVBand="0" w:evenVBand="0" w:oddHBand="1" w:evenHBand="0" w:firstRowFirstColumn="0" w:firstRowLastColumn="0" w:lastRowFirstColumn="0" w:lastRowLastColumn="0"/>
-            </w:pPr>
+            <w:vAlign w:val="bottom"/>
+          </w:tcPr>
+          <w:p>
+            <w:pPr>
+              <w:cnfStyle w:val="000000100000" w:firstRow="0" w:lastRow="0" w:firstColumn="0" w:lastColumn="0" w:oddVBand="0" w:evenVBand="0" w:oddHBand="1" w:evenHBand="0" w:firstRowFirstColumn="0" w:firstRowLastColumn="0" w:lastRowFirstColumn="0" w:lastRowLastColumn="0"/>
+            </w:pPr>
+            <w:r>
+              <w:rPr>
+                <w:rFonts w:ascii="Aptos Narrow" w:hAnsi="Aptos Narrow"/>
+                <w:color w:val="000000"/>
+              </w:rPr>
+              <w:t>0.47</w:t>
+            </w:r>
           </w:p>
         </w:tc>
         <w:tc>
           <w:tcPr>
             <w:tcW w:w="1559" w:type="dxa"/>
-          </w:tcPr>
-          <w:p>
-            <w:pPr>
-              <w:cnfStyle w:val="000000100000" w:firstRow="0" w:lastRow="0" w:firstColumn="0" w:lastColumn="0" w:oddVBand="0" w:evenVBand="0" w:oddHBand="1" w:evenHBand="0" w:firstRowFirstColumn="0" w:firstRowLastColumn="0" w:lastRowFirstColumn="0" w:lastRowLastColumn="0"/>
-            </w:pPr>
+            <w:vAlign w:val="bottom"/>
+          </w:tcPr>
+          <w:p>
+            <w:pPr>
+              <w:cnfStyle w:val="000000100000" w:firstRow="0" w:lastRow="0" w:firstColumn="0" w:lastColumn="0" w:oddVBand="0" w:evenVBand="0" w:oddHBand="1" w:evenHBand="0" w:firstRowFirstColumn="0" w:firstRowLastColumn="0" w:lastRowFirstColumn="0" w:lastRowLastColumn="0"/>
+            </w:pPr>
+            <w:r>
+              <w:rPr>
+                <w:rFonts w:ascii="Aptos Narrow" w:hAnsi="Aptos Narrow"/>
+                <w:color w:val="000000"/>
+              </w:rPr>
+              <w:t>0.94</w:t>
+            </w:r>
           </w:p>
         </w:tc>
         <w:tc>
           <w:tcPr>
             <w:tcW w:w="1701" w:type="dxa"/>
-          </w:tcPr>
-          <w:p>
-            <w:pPr>
-              <w:cnfStyle w:val="000000100000" w:firstRow="0" w:lastRow="0" w:firstColumn="0" w:lastColumn="0" w:oddVBand="0" w:evenVBand="0" w:oddHBand="1" w:evenHBand="0" w:firstRowFirstColumn="0" w:firstRowLastColumn="0" w:lastRowFirstColumn="0" w:lastRowLastColumn="0"/>
-            </w:pPr>
+            <w:vAlign w:val="bottom"/>
+          </w:tcPr>
+          <w:p>
+            <w:pPr>
+              <w:cnfStyle w:val="000000100000" w:firstRow="0" w:lastRow="0" w:firstColumn="0" w:lastColumn="0" w:oddVBand="0" w:evenVBand="0" w:oddHBand="1" w:evenHBand="0" w:firstRowFirstColumn="0" w:firstRowLastColumn="0" w:lastRowFirstColumn="0" w:lastRowLastColumn="0"/>
+            </w:pPr>
+            <w:r>
+              <w:rPr>
+                <w:rFonts w:ascii="Aptos Narrow" w:hAnsi="Aptos Narrow"/>
+                <w:color w:val="000000"/>
+              </w:rPr>
+              <w:t>0.09</w:t>
+            </w:r>
           </w:p>
         </w:tc>
         <w:tc>
           <w:tcPr>
             <w:tcW w:w="1701" w:type="dxa"/>
-          </w:tcPr>
-          <w:p>
-            <w:pPr>
-              <w:cnfStyle w:val="000000100000" w:firstRow="0" w:lastRow="0" w:firstColumn="0" w:lastColumn="0" w:oddVBand="0" w:evenVBand="0" w:oddHBand="1" w:evenHBand="0" w:firstRowFirstColumn="0" w:firstRowLastColumn="0" w:lastRowFirstColumn="0" w:lastRowLastColumn="0"/>
-            </w:pPr>
+            <w:vAlign w:val="bottom"/>
+          </w:tcPr>
+          <w:p>
+            <w:pPr>
+              <w:cnfStyle w:val="000000100000" w:firstRow="0" w:lastRow="0" w:firstColumn="0" w:lastColumn="0" w:oddVBand="0" w:evenVBand="0" w:oddHBand="1" w:evenHBand="0" w:firstRowFirstColumn="0" w:firstRowLastColumn="0" w:lastRowFirstColumn="0" w:lastRowLastColumn="0"/>
+            </w:pPr>
+            <w:r>
+              <w:rPr>
+                <w:rFonts w:ascii="Aptos Narrow" w:hAnsi="Aptos Narrow"/>
+                <w:color w:val="000000"/>
+              </w:rPr>
+              <w:t>0.19</w:t>
+            </w:r>
           </w:p>
         </w:tc>
         <w:tc>
           <w:tcPr>
             <w:tcW w:w="1984" w:type="dxa"/>
-          </w:tcPr>
-          <w:p>
-            <w:pPr>
-              <w:cnfStyle w:val="000000100000" w:firstRow="0" w:lastRow="0" w:firstColumn="0" w:lastColumn="0" w:oddVBand="0" w:evenVBand="0" w:oddHBand="1" w:evenHBand="0" w:firstRowFirstColumn="0" w:firstRowLastColumn="0" w:lastRowFirstColumn="0" w:lastRowLastColumn="0"/>
-            </w:pPr>
+            <w:vAlign w:val="bottom"/>
+          </w:tcPr>
+          <w:p>
+            <w:pPr>
+              <w:cnfStyle w:val="000000100000" w:firstRow="0" w:lastRow="0" w:firstColumn="0" w:lastColumn="0" w:oddVBand="0" w:evenVBand="0" w:oddHBand="1" w:evenHBand="0" w:firstRowFirstColumn="0" w:firstRowLastColumn="0" w:lastRowFirstColumn="0" w:lastRowLastColumn="0"/>
+            </w:pPr>
+            <w:r>
+              <w:rPr>
+                <w:rFonts w:ascii="Aptos Narrow" w:hAnsi="Aptos Narrow"/>
+                <w:color w:val="000000"/>
+              </w:rPr>
+              <w:t>0.38</w:t>
+            </w:r>
           </w:p>
         </w:tc>
       </w:tr>
@@ -9030,51 +9150,91 @@
         <w:tc>
           <w:tcPr>
             <w:tcW w:w="1573" w:type="dxa"/>
+            <w:vAlign w:val="bottom"/>
           </w:tcPr>
           <w:p>
             <w:pPr>
               <w:cnfStyle w:val="000000000000" w:firstRow="0" w:lastRow="0" w:firstColumn="0" w:lastColumn="0" w:oddVBand="0" w:evenVBand="0" w:oddHBand="0" w:evenHBand="0" w:firstRowFirstColumn="0" w:firstRowLastColumn="0" w:lastRowFirstColumn="0" w:lastRowLastColumn="0"/>
             </w:pPr>
+            <w:r>
+              <w:rPr>
+                <w:rFonts w:ascii="Aptos Narrow" w:hAnsi="Aptos Narrow"/>
+                <w:color w:val="000000"/>
+              </w:rPr>
+              <w:t>0.05</w:t>
+            </w:r>
           </w:p>
         </w:tc>
         <w:tc>
           <w:tcPr>
             <w:tcW w:w="1559" w:type="dxa"/>
+            <w:vAlign w:val="bottom"/>
           </w:tcPr>
           <w:p>
             <w:pPr>
               <w:cnfStyle w:val="000000000000" w:firstRow="0" w:lastRow="0" w:firstColumn="0" w:lastColumn="0" w:oddVBand="0" w:evenVBand="0" w:oddHBand="0" w:evenHBand="0" w:firstRowFirstColumn="0" w:firstRowLastColumn="0" w:lastRowFirstColumn="0" w:lastRowLastColumn="0"/>
             </w:pPr>
+            <w:r>
+              <w:rPr>
+                <w:rFonts w:ascii="Aptos Narrow" w:hAnsi="Aptos Narrow"/>
+                <w:color w:val="000000"/>
+              </w:rPr>
+              <w:t>0.1</w:t>
+            </w:r>
           </w:p>
         </w:tc>
         <w:tc>
           <w:tcPr>
             <w:tcW w:w="1701" w:type="dxa"/>
+            <w:vAlign w:val="bottom"/>
           </w:tcPr>
           <w:p>
             <w:pPr>
               <w:cnfStyle w:val="000000000000" w:firstRow="0" w:lastRow="0" w:firstColumn="0" w:lastColumn="0" w:oddVBand="0" w:evenVBand="0" w:oddHBand="0" w:evenHBand="0" w:firstRowFirstColumn="0" w:firstRowLastColumn="0" w:lastRowFirstColumn="0" w:lastRowLastColumn="0"/>
             </w:pPr>
+            <w:r>
+              <w:rPr>
+                <w:rFonts w:ascii="Aptos Narrow" w:hAnsi="Aptos Narrow"/>
+                <w:color w:val="000000"/>
+              </w:rPr>
+              <w:t>0.01</w:t>
+            </w:r>
           </w:p>
         </w:tc>
         <w:tc>
           <w:tcPr>
             <w:tcW w:w="1701" w:type="dxa"/>
+            <w:vAlign w:val="bottom"/>
           </w:tcPr>
           <w:p>
             <w:pPr>
               <w:cnfStyle w:val="000000000000" w:firstRow="0" w:lastRow="0" w:firstColumn="0" w:lastColumn="0" w:oddVBand="0" w:evenVBand="0" w:oddHBand="0" w:evenHBand="0" w:firstRowFirstColumn="0" w:firstRowLastColumn="0" w:lastRowFirstColumn="0" w:lastRowLastColumn="0"/>
             </w:pPr>
+            <w:r>
+              <w:rPr>
+                <w:rFonts w:ascii="Aptos Narrow" w:hAnsi="Aptos Narrow"/>
+                <w:color w:val="000000"/>
+              </w:rPr>
+              <w:t>0.02</w:t>
+            </w:r>
           </w:p>
         </w:tc>
         <w:tc>
           <w:tcPr>
             <w:tcW w:w="1984" w:type="dxa"/>
+            <w:vAlign w:val="bottom"/>
           </w:tcPr>
           <w:p>
             <w:pPr>
               <w:cnfStyle w:val="000000000000" w:firstRow="0" w:lastRow="0" w:firstColumn="0" w:lastColumn="0" w:oddVBand="0" w:evenVBand="0" w:oddHBand="0" w:evenHBand="0" w:firstRowFirstColumn="0" w:firstRowLastColumn="0" w:lastRowFirstColumn="0" w:lastRowLastColumn="0"/>
             </w:pPr>
+            <w:r>
+              <w:rPr>
+                <w:rFonts w:ascii="Aptos Narrow" w:hAnsi="Aptos Narrow"/>
+                <w:color w:val="000000"/>
+              </w:rPr>
+              <w:t>0.04</w:t>
+            </w:r>
           </w:p>
         </w:tc>
       </w:tr>
@@ -9101,51 +9261,91 @@
         <w:tc>
           <w:tcPr>
             <w:tcW w:w="1573" w:type="dxa"/>
-          </w:tcPr>
-          <w:p>
-            <w:pPr>
-              <w:cnfStyle w:val="000000100000" w:firstRow="0" w:lastRow="0" w:firstColumn="0" w:lastColumn="0" w:oddVBand="0" w:evenVBand="0" w:oddHBand="1" w:evenHBand="0" w:firstRowFirstColumn="0" w:firstRowLastColumn="0" w:lastRowFirstColumn="0" w:lastRowLastColumn="0"/>
-            </w:pPr>
+            <w:vAlign w:val="bottom"/>
+          </w:tcPr>
+          <w:p>
+            <w:pPr>
+              <w:cnfStyle w:val="000000100000" w:firstRow="0" w:lastRow="0" w:firstColumn="0" w:lastColumn="0" w:oddVBand="0" w:evenVBand="0" w:oddHBand="1" w:evenHBand="0" w:firstRowFirstColumn="0" w:firstRowLastColumn="0" w:lastRowFirstColumn="0" w:lastRowLastColumn="0"/>
+            </w:pPr>
+            <w:r>
+              <w:rPr>
+                <w:rFonts w:ascii="Aptos Narrow" w:hAnsi="Aptos Narrow"/>
+                <w:color w:val="000000"/>
+              </w:rPr>
+              <w:t>0.29</w:t>
+            </w:r>
           </w:p>
         </w:tc>
         <w:tc>
           <w:tcPr>
             <w:tcW w:w="1559" w:type="dxa"/>
-          </w:tcPr>
-          <w:p>
-            <w:pPr>
-              <w:cnfStyle w:val="000000100000" w:firstRow="0" w:lastRow="0" w:firstColumn="0" w:lastColumn="0" w:oddVBand="0" w:evenVBand="0" w:oddHBand="1" w:evenHBand="0" w:firstRowFirstColumn="0" w:firstRowLastColumn="0" w:lastRowFirstColumn="0" w:lastRowLastColumn="0"/>
-            </w:pPr>
+            <w:vAlign w:val="bottom"/>
+          </w:tcPr>
+          <w:p>
+            <w:pPr>
+              <w:cnfStyle w:val="000000100000" w:firstRow="0" w:lastRow="0" w:firstColumn="0" w:lastColumn="0" w:oddVBand="0" w:evenVBand="0" w:oddHBand="1" w:evenHBand="0" w:firstRowFirstColumn="0" w:firstRowLastColumn="0" w:lastRowFirstColumn="0" w:lastRowLastColumn="0"/>
+            </w:pPr>
+            <w:r>
+              <w:rPr>
+                <w:rFonts w:ascii="Aptos Narrow" w:hAnsi="Aptos Narrow"/>
+                <w:color w:val="000000"/>
+              </w:rPr>
+              <w:t>0.59</w:t>
+            </w:r>
           </w:p>
         </w:tc>
         <w:tc>
           <w:tcPr>
             <w:tcW w:w="1701" w:type="dxa"/>
-          </w:tcPr>
-          <w:p>
-            <w:pPr>
-              <w:cnfStyle w:val="000000100000" w:firstRow="0" w:lastRow="0" w:firstColumn="0" w:lastColumn="0" w:oddVBand="0" w:evenVBand="0" w:oddHBand="1" w:evenHBand="0" w:firstRowFirstColumn="0" w:firstRowLastColumn="0" w:lastRowFirstColumn="0" w:lastRowLastColumn="0"/>
-            </w:pPr>
+            <w:vAlign w:val="bottom"/>
+          </w:tcPr>
+          <w:p>
+            <w:pPr>
+              <w:cnfStyle w:val="000000100000" w:firstRow="0" w:lastRow="0" w:firstColumn="0" w:lastColumn="0" w:oddVBand="0" w:evenVBand="0" w:oddHBand="1" w:evenHBand="0" w:firstRowFirstColumn="0" w:firstRowLastColumn="0" w:lastRowFirstColumn="0" w:lastRowLastColumn="0"/>
+            </w:pPr>
+            <w:r>
+              <w:rPr>
+                <w:rFonts w:ascii="Aptos Narrow" w:hAnsi="Aptos Narrow"/>
+                <w:color w:val="000000"/>
+              </w:rPr>
+              <w:t>0.06</w:t>
+            </w:r>
           </w:p>
         </w:tc>
         <w:tc>
           <w:tcPr>
             <w:tcW w:w="1701" w:type="dxa"/>
-          </w:tcPr>
-          <w:p>
-            <w:pPr>
-              <w:cnfStyle w:val="000000100000" w:firstRow="0" w:lastRow="0" w:firstColumn="0" w:lastColumn="0" w:oddVBand="0" w:evenVBand="0" w:oddHBand="1" w:evenHBand="0" w:firstRowFirstColumn="0" w:firstRowLastColumn="0" w:lastRowFirstColumn="0" w:lastRowLastColumn="0"/>
-            </w:pPr>
+            <w:vAlign w:val="bottom"/>
+          </w:tcPr>
+          <w:p>
+            <w:pPr>
+              <w:cnfStyle w:val="000000100000" w:firstRow="0" w:lastRow="0" w:firstColumn="0" w:lastColumn="0" w:oddVBand="0" w:evenVBand="0" w:oddHBand="1" w:evenHBand="0" w:firstRowFirstColumn="0" w:firstRowLastColumn="0" w:lastRowFirstColumn="0" w:lastRowLastColumn="0"/>
+            </w:pPr>
+            <w:r>
+              <w:rPr>
+                <w:rFonts w:ascii="Aptos Narrow" w:hAnsi="Aptos Narrow"/>
+                <w:color w:val="000000"/>
+              </w:rPr>
+              <w:t>0.12</w:t>
+            </w:r>
           </w:p>
         </w:tc>
         <w:tc>
           <w:tcPr>
             <w:tcW w:w="1984" w:type="dxa"/>
-          </w:tcPr>
-          <w:p>
-            <w:pPr>
-              <w:cnfStyle w:val="000000100000" w:firstRow="0" w:lastRow="0" w:firstColumn="0" w:lastColumn="0" w:oddVBand="0" w:evenVBand="0" w:oddHBand="1" w:evenHBand="0" w:firstRowFirstColumn="0" w:firstRowLastColumn="0" w:lastRowFirstColumn="0" w:lastRowLastColumn="0"/>
-            </w:pPr>
+            <w:vAlign w:val="bottom"/>
+          </w:tcPr>
+          <w:p>
+            <w:pPr>
+              <w:cnfStyle w:val="000000100000" w:firstRow="0" w:lastRow="0" w:firstColumn="0" w:lastColumn="0" w:oddVBand="0" w:evenVBand="0" w:oddHBand="1" w:evenHBand="0" w:firstRowFirstColumn="0" w:firstRowLastColumn="0" w:lastRowFirstColumn="0" w:lastRowLastColumn="0"/>
+            </w:pPr>
+            <w:r>
+              <w:rPr>
+                <w:rFonts w:ascii="Aptos Narrow" w:hAnsi="Aptos Narrow"/>
+                <w:color w:val="000000"/>
+              </w:rPr>
+              <w:t>0.23</w:t>
+            </w:r>
           </w:p>
         </w:tc>
       </w:tr>
@@ -9169,51 +9369,91 @@
         <w:tc>
           <w:tcPr>
             <w:tcW w:w="1573" w:type="dxa"/>
+            <w:vAlign w:val="bottom"/>
           </w:tcPr>
           <w:p>
             <w:pPr>
               <w:cnfStyle w:val="000000000000" w:firstRow="0" w:lastRow="0" w:firstColumn="0" w:lastColumn="0" w:oddVBand="0" w:evenVBand="0" w:oddHBand="0" w:evenHBand="0" w:firstRowFirstColumn="0" w:firstRowLastColumn="0" w:lastRowFirstColumn="0" w:lastRowLastColumn="0"/>
             </w:pPr>
+            <w:r>
+              <w:rPr>
+                <w:rFonts w:ascii="Aptos Narrow" w:hAnsi="Aptos Narrow"/>
+                <w:color w:val="000000"/>
+              </w:rPr>
+              <w:t>0.08</w:t>
+            </w:r>
           </w:p>
         </w:tc>
         <w:tc>
           <w:tcPr>
             <w:tcW w:w="1559" w:type="dxa"/>
+            <w:vAlign w:val="bottom"/>
           </w:tcPr>
           <w:p>
             <w:pPr>
               <w:cnfStyle w:val="000000000000" w:firstRow="0" w:lastRow="0" w:firstColumn="0" w:lastColumn="0" w:oddVBand="0" w:evenVBand="0" w:oddHBand="0" w:evenHBand="0" w:firstRowFirstColumn="0" w:firstRowLastColumn="0" w:lastRowFirstColumn="0" w:lastRowLastColumn="0"/>
             </w:pPr>
+            <w:r>
+              <w:rPr>
+                <w:rFonts w:ascii="Aptos Narrow" w:hAnsi="Aptos Narrow"/>
+                <w:color w:val="000000"/>
+              </w:rPr>
+              <w:t>0.15</w:t>
+            </w:r>
           </w:p>
         </w:tc>
         <w:tc>
           <w:tcPr>
             <w:tcW w:w="1701" w:type="dxa"/>
+            <w:vAlign w:val="bottom"/>
           </w:tcPr>
           <w:p>
             <w:pPr>
               <w:cnfStyle w:val="000000000000" w:firstRow="0" w:lastRow="0" w:firstColumn="0" w:lastColumn="0" w:oddVBand="0" w:evenVBand="0" w:oddHBand="0" w:evenHBand="0" w:firstRowFirstColumn="0" w:firstRowLastColumn="0" w:lastRowFirstColumn="0" w:lastRowLastColumn="0"/>
             </w:pPr>
+            <w:r>
+              <w:rPr>
+                <w:rFonts w:ascii="Aptos Narrow" w:hAnsi="Aptos Narrow"/>
+                <w:color w:val="000000"/>
+              </w:rPr>
+              <w:t>0.02</w:t>
+            </w:r>
           </w:p>
         </w:tc>
         <w:tc>
           <w:tcPr>
             <w:tcW w:w="1701" w:type="dxa"/>
+            <w:vAlign w:val="bottom"/>
           </w:tcPr>
           <w:p>
             <w:pPr>
               <w:cnfStyle w:val="000000000000" w:firstRow="0" w:lastRow="0" w:firstColumn="0" w:lastColumn="0" w:oddVBand="0" w:evenVBand="0" w:oddHBand="0" w:evenHBand="0" w:firstRowFirstColumn="0" w:firstRowLastColumn="0" w:lastRowFirstColumn="0" w:lastRowLastColumn="0"/>
             </w:pPr>
+            <w:r>
+              <w:rPr>
+                <w:rFonts w:ascii="Aptos Narrow" w:hAnsi="Aptos Narrow"/>
+                <w:color w:val="000000"/>
+              </w:rPr>
+              <w:t>0.03</w:t>
+            </w:r>
           </w:p>
         </w:tc>
         <w:tc>
           <w:tcPr>
             <w:tcW w:w="1984" w:type="dxa"/>
+            <w:vAlign w:val="bottom"/>
           </w:tcPr>
           <w:p>
             <w:pPr>
               <w:cnfStyle w:val="000000000000" w:firstRow="0" w:lastRow="0" w:firstColumn="0" w:lastColumn="0" w:oddVBand="0" w:evenVBand="0" w:oddHBand="0" w:evenHBand="0" w:firstRowFirstColumn="0" w:firstRowLastColumn="0" w:lastRowFirstColumn="0" w:lastRowLastColumn="0"/>
             </w:pPr>
+            <w:r>
+              <w:rPr>
+                <w:rFonts w:ascii="Aptos Narrow" w:hAnsi="Aptos Narrow"/>
+                <w:color w:val="000000"/>
+              </w:rPr>
+              <w:t>0.06</w:t>
+            </w:r>
           </w:p>
         </w:tc>
       </w:tr>
@@ -9240,51 +9480,91 @@
         <w:tc>
           <w:tcPr>
             <w:tcW w:w="1573" w:type="dxa"/>
-          </w:tcPr>
-          <w:p>
-            <w:pPr>
-              <w:cnfStyle w:val="000000100000" w:firstRow="0" w:lastRow="0" w:firstColumn="0" w:lastColumn="0" w:oddVBand="0" w:evenVBand="0" w:oddHBand="1" w:evenHBand="0" w:firstRowFirstColumn="0" w:firstRowLastColumn="0" w:lastRowFirstColumn="0" w:lastRowLastColumn="0"/>
-            </w:pPr>
+            <w:vAlign w:val="bottom"/>
+          </w:tcPr>
+          <w:p>
+            <w:pPr>
+              <w:cnfStyle w:val="000000100000" w:firstRow="0" w:lastRow="0" w:firstColumn="0" w:lastColumn="0" w:oddVBand="0" w:evenVBand="0" w:oddHBand="1" w:evenHBand="0" w:firstRowFirstColumn="0" w:firstRowLastColumn="0" w:lastRowFirstColumn="0" w:lastRowLastColumn="0"/>
+            </w:pPr>
+            <w:r>
+              <w:rPr>
+                <w:rFonts w:ascii="Aptos Narrow" w:hAnsi="Aptos Narrow"/>
+                <w:color w:val="000000"/>
+              </w:rPr>
+              <w:t>0.29</w:t>
+            </w:r>
           </w:p>
         </w:tc>
         <w:tc>
           <w:tcPr>
             <w:tcW w:w="1559" w:type="dxa"/>
-          </w:tcPr>
-          <w:p>
-            <w:pPr>
-              <w:cnfStyle w:val="000000100000" w:firstRow="0" w:lastRow="0" w:firstColumn="0" w:lastColumn="0" w:oddVBand="0" w:evenVBand="0" w:oddHBand="1" w:evenHBand="0" w:firstRowFirstColumn="0" w:firstRowLastColumn="0" w:lastRowFirstColumn="0" w:lastRowLastColumn="0"/>
-            </w:pPr>
+            <w:vAlign w:val="bottom"/>
+          </w:tcPr>
+          <w:p>
+            <w:pPr>
+              <w:cnfStyle w:val="000000100000" w:firstRow="0" w:lastRow="0" w:firstColumn="0" w:lastColumn="0" w:oddVBand="0" w:evenVBand="0" w:oddHBand="1" w:evenHBand="0" w:firstRowFirstColumn="0" w:firstRowLastColumn="0" w:lastRowFirstColumn="0" w:lastRowLastColumn="0"/>
+            </w:pPr>
+            <w:r>
+              <w:rPr>
+                <w:rFonts w:ascii="Aptos Narrow" w:hAnsi="Aptos Narrow"/>
+                <w:color w:val="000000"/>
+              </w:rPr>
+              <w:t>0.58</w:t>
+            </w:r>
           </w:p>
         </w:tc>
         <w:tc>
           <w:tcPr>
             <w:tcW w:w="1701" w:type="dxa"/>
-          </w:tcPr>
-          <w:p>
-            <w:pPr>
-              <w:cnfStyle w:val="000000100000" w:firstRow="0" w:lastRow="0" w:firstColumn="0" w:lastColumn="0" w:oddVBand="0" w:evenVBand="0" w:oddHBand="1" w:evenHBand="0" w:firstRowFirstColumn="0" w:firstRowLastColumn="0" w:lastRowFirstColumn="0" w:lastRowLastColumn="0"/>
-            </w:pPr>
+            <w:vAlign w:val="bottom"/>
+          </w:tcPr>
+          <w:p>
+            <w:pPr>
+              <w:cnfStyle w:val="000000100000" w:firstRow="0" w:lastRow="0" w:firstColumn="0" w:lastColumn="0" w:oddVBand="0" w:evenVBand="0" w:oddHBand="1" w:evenHBand="0" w:firstRowFirstColumn="0" w:firstRowLastColumn="0" w:lastRowFirstColumn="0" w:lastRowLastColumn="0"/>
+            </w:pPr>
+            <w:r>
+              <w:rPr>
+                <w:rFonts w:ascii="Aptos Narrow" w:hAnsi="Aptos Narrow"/>
+                <w:color w:val="000000"/>
+              </w:rPr>
+              <w:t>0.06</w:t>
+            </w:r>
           </w:p>
         </w:tc>
         <w:tc>
           <w:tcPr>
             <w:tcW w:w="1701" w:type="dxa"/>
-          </w:tcPr>
-          <w:p>
-            <w:pPr>
-              <w:cnfStyle w:val="000000100000" w:firstRow="0" w:lastRow="0" w:firstColumn="0" w:lastColumn="0" w:oddVBand="0" w:evenVBand="0" w:oddHBand="1" w:evenHBand="0" w:firstRowFirstColumn="0" w:firstRowLastColumn="0" w:lastRowFirstColumn="0" w:lastRowLastColumn="0"/>
-            </w:pPr>
+            <w:vAlign w:val="bottom"/>
+          </w:tcPr>
+          <w:p>
+            <w:pPr>
+              <w:cnfStyle w:val="000000100000" w:firstRow="0" w:lastRow="0" w:firstColumn="0" w:lastColumn="0" w:oddVBand="0" w:evenVBand="0" w:oddHBand="1" w:evenHBand="0" w:firstRowFirstColumn="0" w:firstRowLastColumn="0" w:lastRowFirstColumn="0" w:lastRowLastColumn="0"/>
+            </w:pPr>
+            <w:r>
+              <w:rPr>
+                <w:rFonts w:ascii="Aptos Narrow" w:hAnsi="Aptos Narrow"/>
+                <w:color w:val="000000"/>
+              </w:rPr>
+              <w:t>0.12</w:t>
+            </w:r>
           </w:p>
         </w:tc>
         <w:tc>
           <w:tcPr>
             <w:tcW w:w="1984" w:type="dxa"/>
-          </w:tcPr>
-          <w:p>
-            <w:pPr>
-              <w:cnfStyle w:val="000000100000" w:firstRow="0" w:lastRow="0" w:firstColumn="0" w:lastColumn="0" w:oddVBand="0" w:evenVBand="0" w:oddHBand="1" w:evenHBand="0" w:firstRowFirstColumn="0" w:firstRowLastColumn="0" w:lastRowFirstColumn="0" w:lastRowLastColumn="0"/>
-            </w:pPr>
+            <w:vAlign w:val="bottom"/>
+          </w:tcPr>
+          <w:p>
+            <w:pPr>
+              <w:cnfStyle w:val="000000100000" w:firstRow="0" w:lastRow="0" w:firstColumn="0" w:lastColumn="0" w:oddVBand="0" w:evenVBand="0" w:oddHBand="1" w:evenHBand="0" w:firstRowFirstColumn="0" w:firstRowLastColumn="0" w:lastRowFirstColumn="0" w:lastRowLastColumn="0"/>
+            </w:pPr>
+            <w:r>
+              <w:rPr>
+                <w:rFonts w:ascii="Aptos Narrow" w:hAnsi="Aptos Narrow"/>
+                <w:color w:val="000000"/>
+              </w:rPr>
+              <w:t>0.23</w:t>
+            </w:r>
           </w:p>
         </w:tc>
       </w:tr>
@@ -9308,51 +9588,91 @@
         <w:tc>
           <w:tcPr>
             <w:tcW w:w="1573" w:type="dxa"/>
+            <w:vAlign w:val="bottom"/>
           </w:tcPr>
           <w:p>
             <w:pPr>
               <w:cnfStyle w:val="000000000000" w:firstRow="0" w:lastRow="0" w:firstColumn="0" w:lastColumn="0" w:oddVBand="0" w:evenVBand="0" w:oddHBand="0" w:evenHBand="0" w:firstRowFirstColumn="0" w:firstRowLastColumn="0" w:lastRowFirstColumn="0" w:lastRowLastColumn="0"/>
             </w:pPr>
+            <w:r>
+              <w:rPr>
+                <w:rFonts w:ascii="Aptos Narrow" w:hAnsi="Aptos Narrow"/>
+                <w:color w:val="000000"/>
+              </w:rPr>
+              <w:t>0.04</w:t>
+            </w:r>
           </w:p>
         </w:tc>
         <w:tc>
           <w:tcPr>
             <w:tcW w:w="1559" w:type="dxa"/>
+            <w:vAlign w:val="bottom"/>
           </w:tcPr>
           <w:p>
             <w:pPr>
               <w:cnfStyle w:val="000000000000" w:firstRow="0" w:lastRow="0" w:firstColumn="0" w:lastColumn="0" w:oddVBand="0" w:evenVBand="0" w:oddHBand="0" w:evenHBand="0" w:firstRowFirstColumn="0" w:firstRowLastColumn="0" w:lastRowFirstColumn="0" w:lastRowLastColumn="0"/>
             </w:pPr>
+            <w:r>
+              <w:rPr>
+                <w:rFonts w:ascii="Aptos Narrow" w:hAnsi="Aptos Narrow"/>
+                <w:color w:val="000000"/>
+              </w:rPr>
+              <w:t>0.07</w:t>
+            </w:r>
           </w:p>
         </w:tc>
         <w:tc>
           <w:tcPr>
             <w:tcW w:w="1701" w:type="dxa"/>
+            <w:vAlign w:val="bottom"/>
           </w:tcPr>
           <w:p>
             <w:pPr>
               <w:cnfStyle w:val="000000000000" w:firstRow="0" w:lastRow="0" w:firstColumn="0" w:lastColumn="0" w:oddVBand="0" w:evenVBand="0" w:oddHBand="0" w:evenHBand="0" w:firstRowFirstColumn="0" w:firstRowLastColumn="0" w:lastRowFirstColumn="0" w:lastRowLastColumn="0"/>
             </w:pPr>
+            <w:r>
+              <w:rPr>
+                <w:rFonts w:ascii="Aptos Narrow" w:hAnsi="Aptos Narrow"/>
+                <w:color w:val="000000"/>
+              </w:rPr>
+              <w:t>0.01</w:t>
+            </w:r>
           </w:p>
         </w:tc>
         <w:tc>
           <w:tcPr>
             <w:tcW w:w="1701" w:type="dxa"/>
+            <w:vAlign w:val="bottom"/>
           </w:tcPr>
           <w:p>
             <w:pPr>
               <w:cnfStyle w:val="000000000000" w:firstRow="0" w:lastRow="0" w:firstColumn="0" w:lastColumn="0" w:oddVBand="0" w:evenVBand="0" w:oddHBand="0" w:evenHBand="0" w:firstRowFirstColumn="0" w:firstRowLastColumn="0" w:lastRowFirstColumn="0" w:lastRowLastColumn="0"/>
             </w:pPr>
+            <w:r>
+              <w:rPr>
+                <w:rFonts w:ascii="Aptos Narrow" w:hAnsi="Aptos Narrow"/>
+                <w:color w:val="000000"/>
+              </w:rPr>
+              <w:t>0.01</w:t>
+            </w:r>
           </w:p>
         </w:tc>
         <w:tc>
           <w:tcPr>
             <w:tcW w:w="1984" w:type="dxa"/>
+            <w:vAlign w:val="bottom"/>
           </w:tcPr>
           <w:p>
             <w:pPr>
               <w:cnfStyle w:val="000000000000" w:firstRow="0" w:lastRow="0" w:firstColumn="0" w:lastColumn="0" w:oddVBand="0" w:evenVBand="0" w:oddHBand="0" w:evenHBand="0" w:firstRowFirstColumn="0" w:firstRowLastColumn="0" w:lastRowFirstColumn="0" w:lastRowLastColumn="0"/>
             </w:pPr>
+            <w:r>
+              <w:rPr>
+                <w:rFonts w:ascii="Aptos Narrow" w:hAnsi="Aptos Narrow"/>
+                <w:color w:val="000000"/>
+              </w:rPr>
+              <w:t>0.03</w:t>
+            </w:r>
           </w:p>
         </w:tc>
       </w:tr>
@@ -9379,51 +9699,91 @@
         <w:tc>
           <w:tcPr>
             <w:tcW w:w="1573" w:type="dxa"/>
-          </w:tcPr>
-          <w:p>
-            <w:pPr>
-              <w:cnfStyle w:val="000000100000" w:firstRow="0" w:lastRow="0" w:firstColumn="0" w:lastColumn="0" w:oddVBand="0" w:evenVBand="0" w:oddHBand="1" w:evenHBand="0" w:firstRowFirstColumn="0" w:firstRowLastColumn="0" w:lastRowFirstColumn="0" w:lastRowLastColumn="0"/>
-            </w:pPr>
+            <w:vAlign w:val="bottom"/>
+          </w:tcPr>
+          <w:p>
+            <w:pPr>
+              <w:cnfStyle w:val="000000100000" w:firstRow="0" w:lastRow="0" w:firstColumn="0" w:lastColumn="0" w:oddVBand="0" w:evenVBand="0" w:oddHBand="1" w:evenHBand="0" w:firstRowFirstColumn="0" w:firstRowLastColumn="0" w:lastRowFirstColumn="0" w:lastRowLastColumn="0"/>
+            </w:pPr>
+            <w:r>
+              <w:rPr>
+                <w:rFonts w:ascii="Aptos Narrow" w:hAnsi="Aptos Narrow"/>
+                <w:color w:val="000000"/>
+              </w:rPr>
+              <w:t>0.04</w:t>
+            </w:r>
           </w:p>
         </w:tc>
         <w:tc>
           <w:tcPr>
             <w:tcW w:w="1559" w:type="dxa"/>
-          </w:tcPr>
-          <w:p>
-            <w:pPr>
-              <w:cnfStyle w:val="000000100000" w:firstRow="0" w:lastRow="0" w:firstColumn="0" w:lastColumn="0" w:oddVBand="0" w:evenVBand="0" w:oddHBand="1" w:evenHBand="0" w:firstRowFirstColumn="0" w:firstRowLastColumn="0" w:lastRowFirstColumn="0" w:lastRowLastColumn="0"/>
-            </w:pPr>
+            <w:vAlign w:val="bottom"/>
+          </w:tcPr>
+          <w:p>
+            <w:pPr>
+              <w:cnfStyle w:val="000000100000" w:firstRow="0" w:lastRow="0" w:firstColumn="0" w:lastColumn="0" w:oddVBand="0" w:evenVBand="0" w:oddHBand="1" w:evenHBand="0" w:firstRowFirstColumn="0" w:firstRowLastColumn="0" w:lastRowFirstColumn="0" w:lastRowLastColumn="0"/>
+            </w:pPr>
+            <w:r>
+              <w:rPr>
+                <w:rFonts w:ascii="Aptos Narrow" w:hAnsi="Aptos Narrow"/>
+                <w:color w:val="000000"/>
+              </w:rPr>
+              <w:t>0.09</w:t>
+            </w:r>
           </w:p>
         </w:tc>
         <w:tc>
           <w:tcPr>
             <w:tcW w:w="1701" w:type="dxa"/>
-          </w:tcPr>
-          <w:p>
-            <w:pPr>
-              <w:cnfStyle w:val="000000100000" w:firstRow="0" w:lastRow="0" w:firstColumn="0" w:lastColumn="0" w:oddVBand="0" w:evenVBand="0" w:oddHBand="1" w:evenHBand="0" w:firstRowFirstColumn="0" w:firstRowLastColumn="0" w:lastRowFirstColumn="0" w:lastRowLastColumn="0"/>
-            </w:pPr>
+            <w:vAlign w:val="bottom"/>
+          </w:tcPr>
+          <w:p>
+            <w:pPr>
+              <w:cnfStyle w:val="000000100000" w:firstRow="0" w:lastRow="0" w:firstColumn="0" w:lastColumn="0" w:oddVBand="0" w:evenVBand="0" w:oddHBand="1" w:evenHBand="0" w:firstRowFirstColumn="0" w:firstRowLastColumn="0" w:lastRowFirstColumn="0" w:lastRowLastColumn="0"/>
+            </w:pPr>
+            <w:r>
+              <w:rPr>
+                <w:rFonts w:ascii="Aptos Narrow" w:hAnsi="Aptos Narrow"/>
+                <w:color w:val="000000"/>
+              </w:rPr>
+              <w:t>0.01</w:t>
+            </w:r>
           </w:p>
         </w:tc>
         <w:tc>
           <w:tcPr>
             <w:tcW w:w="1701" w:type="dxa"/>
-          </w:tcPr>
-          <w:p>
-            <w:pPr>
-              <w:cnfStyle w:val="000000100000" w:firstRow="0" w:lastRow="0" w:firstColumn="0" w:lastColumn="0" w:oddVBand="0" w:evenVBand="0" w:oddHBand="1" w:evenHBand="0" w:firstRowFirstColumn="0" w:firstRowLastColumn="0" w:lastRowFirstColumn="0" w:lastRowLastColumn="0"/>
-            </w:pPr>
+            <w:vAlign w:val="bottom"/>
+          </w:tcPr>
+          <w:p>
+            <w:pPr>
+              <w:cnfStyle w:val="000000100000" w:firstRow="0" w:lastRow="0" w:firstColumn="0" w:lastColumn="0" w:oddVBand="0" w:evenVBand="0" w:oddHBand="1" w:evenHBand="0" w:firstRowFirstColumn="0" w:firstRowLastColumn="0" w:lastRowFirstColumn="0" w:lastRowLastColumn="0"/>
+            </w:pPr>
+            <w:r>
+              <w:rPr>
+                <w:rFonts w:ascii="Aptos Narrow" w:hAnsi="Aptos Narrow"/>
+                <w:color w:val="000000"/>
+              </w:rPr>
+              <w:t>0.02</w:t>
+            </w:r>
           </w:p>
         </w:tc>
         <w:tc>
           <w:tcPr>
             <w:tcW w:w="1984" w:type="dxa"/>
-          </w:tcPr>
-          <w:p>
-            <w:pPr>
-              <w:cnfStyle w:val="000000100000" w:firstRow="0" w:lastRow="0" w:firstColumn="0" w:lastColumn="0" w:oddVBand="0" w:evenVBand="0" w:oddHBand="1" w:evenHBand="0" w:firstRowFirstColumn="0" w:firstRowLastColumn="0" w:lastRowFirstColumn="0" w:lastRowLastColumn="0"/>
-            </w:pPr>
+            <w:vAlign w:val="bottom"/>
+          </w:tcPr>
+          <w:p>
+            <w:pPr>
+              <w:cnfStyle w:val="000000100000" w:firstRow="0" w:lastRow="0" w:firstColumn="0" w:lastColumn="0" w:oddVBand="0" w:evenVBand="0" w:oddHBand="1" w:evenHBand="0" w:firstRowFirstColumn="0" w:firstRowLastColumn="0" w:lastRowFirstColumn="0" w:lastRowLastColumn="0"/>
+            </w:pPr>
+            <w:r>
+              <w:rPr>
+                <w:rFonts w:ascii="Aptos Narrow" w:hAnsi="Aptos Narrow"/>
+                <w:color w:val="000000"/>
+              </w:rPr>
+              <w:t>0.04</w:t>
+            </w:r>
           </w:p>
         </w:tc>
       </w:tr>
@@ -9447,51 +9807,91 @@
         <w:tc>
           <w:tcPr>
             <w:tcW w:w="1573" w:type="dxa"/>
+            <w:vAlign w:val="bottom"/>
           </w:tcPr>
           <w:p>
             <w:pPr>
               <w:cnfStyle w:val="000000000000" w:firstRow="0" w:lastRow="0" w:firstColumn="0" w:lastColumn="0" w:oddVBand="0" w:evenVBand="0" w:oddHBand="0" w:evenHBand="0" w:firstRowFirstColumn="0" w:firstRowLastColumn="0" w:lastRowFirstColumn="0" w:lastRowLastColumn="0"/>
             </w:pPr>
+            <w:r>
+              <w:rPr>
+                <w:rFonts w:ascii="Aptos Narrow" w:hAnsi="Aptos Narrow"/>
+                <w:color w:val="000000"/>
+              </w:rPr>
+              <w:t>0.24</w:t>
+            </w:r>
           </w:p>
         </w:tc>
         <w:tc>
           <w:tcPr>
             <w:tcW w:w="1559" w:type="dxa"/>
+            <w:vAlign w:val="bottom"/>
           </w:tcPr>
           <w:p>
             <w:pPr>
               <w:cnfStyle w:val="000000000000" w:firstRow="0" w:lastRow="0" w:firstColumn="0" w:lastColumn="0" w:oddVBand="0" w:evenVBand="0" w:oddHBand="0" w:evenHBand="0" w:firstRowFirstColumn="0" w:firstRowLastColumn="0" w:lastRowFirstColumn="0" w:lastRowLastColumn="0"/>
             </w:pPr>
+            <w:r>
+              <w:rPr>
+                <w:rFonts w:ascii="Aptos Narrow" w:hAnsi="Aptos Narrow"/>
+                <w:color w:val="000000"/>
+              </w:rPr>
+              <w:t>0.48</w:t>
+            </w:r>
           </w:p>
         </w:tc>
         <w:tc>
           <w:tcPr>
             <w:tcW w:w="1701" w:type="dxa"/>
+            <w:vAlign w:val="bottom"/>
           </w:tcPr>
           <w:p>
             <w:pPr>
               <w:cnfStyle w:val="000000000000" w:firstRow="0" w:lastRow="0" w:firstColumn="0" w:lastColumn="0" w:oddVBand="0" w:evenVBand="0" w:oddHBand="0" w:evenHBand="0" w:firstRowFirstColumn="0" w:firstRowLastColumn="0" w:lastRowFirstColumn="0" w:lastRowLastColumn="0"/>
             </w:pPr>
+            <w:r>
+              <w:rPr>
+                <w:rFonts w:ascii="Aptos Narrow" w:hAnsi="Aptos Narrow"/>
+                <w:color w:val="000000"/>
+              </w:rPr>
+              <w:t>0.05</w:t>
+            </w:r>
           </w:p>
         </w:tc>
         <w:tc>
           <w:tcPr>
             <w:tcW w:w="1701" w:type="dxa"/>
+            <w:vAlign w:val="bottom"/>
           </w:tcPr>
           <w:p>
             <w:pPr>
               <w:cnfStyle w:val="000000000000" w:firstRow="0" w:lastRow="0" w:firstColumn="0" w:lastColumn="0" w:oddVBand="0" w:evenVBand="0" w:oddHBand="0" w:evenHBand="0" w:firstRowFirstColumn="0" w:firstRowLastColumn="0" w:lastRowFirstColumn="0" w:lastRowLastColumn="0"/>
             </w:pPr>
+            <w:r>
+              <w:rPr>
+                <w:rFonts w:ascii="Aptos Narrow" w:hAnsi="Aptos Narrow"/>
+                <w:color w:val="000000"/>
+              </w:rPr>
+              <w:t>0.1</w:t>
+            </w:r>
           </w:p>
         </w:tc>
         <w:tc>
           <w:tcPr>
             <w:tcW w:w="1984" w:type="dxa"/>
+            <w:vAlign w:val="bottom"/>
           </w:tcPr>
           <w:p>
             <w:pPr>
               <w:cnfStyle w:val="000000000000" w:firstRow="0" w:lastRow="0" w:firstColumn="0" w:lastColumn="0" w:oddVBand="0" w:evenVBand="0" w:oddHBand="0" w:evenHBand="0" w:firstRowFirstColumn="0" w:firstRowLastColumn="0" w:lastRowFirstColumn="0" w:lastRowLastColumn="0"/>
             </w:pPr>
+            <w:r>
+              <w:rPr>
+                <w:rFonts w:ascii="Aptos Narrow" w:hAnsi="Aptos Narrow"/>
+                <w:color w:val="000000"/>
+              </w:rPr>
+              <w:t>0.19</w:t>
+            </w:r>
           </w:p>
         </w:tc>
       </w:tr>
@@ -9518,51 +9918,91 @@
         <w:tc>
           <w:tcPr>
             <w:tcW w:w="1573" w:type="dxa"/>
-          </w:tcPr>
-          <w:p>
-            <w:pPr>
-              <w:cnfStyle w:val="000000100000" w:firstRow="0" w:lastRow="0" w:firstColumn="0" w:lastColumn="0" w:oddVBand="0" w:evenVBand="0" w:oddHBand="1" w:evenHBand="0" w:firstRowFirstColumn="0" w:firstRowLastColumn="0" w:lastRowFirstColumn="0" w:lastRowLastColumn="0"/>
-            </w:pPr>
+            <w:vAlign w:val="bottom"/>
+          </w:tcPr>
+          <w:p>
+            <w:pPr>
+              <w:cnfStyle w:val="000000100000" w:firstRow="0" w:lastRow="0" w:firstColumn="0" w:lastColumn="0" w:oddVBand="0" w:evenVBand="0" w:oddHBand="1" w:evenHBand="0" w:firstRowFirstColumn="0" w:firstRowLastColumn="0" w:lastRowFirstColumn="0" w:lastRowLastColumn="0"/>
+            </w:pPr>
+            <w:r>
+              <w:rPr>
+                <w:rFonts w:ascii="Aptos Narrow" w:hAnsi="Aptos Narrow"/>
+                <w:color w:val="000000"/>
+              </w:rPr>
+              <w:t>0.01</w:t>
+            </w:r>
           </w:p>
         </w:tc>
         <w:tc>
           <w:tcPr>
             <w:tcW w:w="1559" w:type="dxa"/>
-          </w:tcPr>
-          <w:p>
-            <w:pPr>
-              <w:cnfStyle w:val="000000100000" w:firstRow="0" w:lastRow="0" w:firstColumn="0" w:lastColumn="0" w:oddVBand="0" w:evenVBand="0" w:oddHBand="1" w:evenHBand="0" w:firstRowFirstColumn="0" w:firstRowLastColumn="0" w:lastRowFirstColumn="0" w:lastRowLastColumn="0"/>
-            </w:pPr>
+            <w:vAlign w:val="bottom"/>
+          </w:tcPr>
+          <w:p>
+            <w:pPr>
+              <w:cnfStyle w:val="000000100000" w:firstRow="0" w:lastRow="0" w:firstColumn="0" w:lastColumn="0" w:oddVBand="0" w:evenVBand="0" w:oddHBand="1" w:evenHBand="0" w:firstRowFirstColumn="0" w:firstRowLastColumn="0" w:lastRowFirstColumn="0" w:lastRowLastColumn="0"/>
+            </w:pPr>
+            <w:r>
+              <w:rPr>
+                <w:rFonts w:ascii="Aptos Narrow" w:hAnsi="Aptos Narrow"/>
+                <w:color w:val="000000"/>
+              </w:rPr>
+              <w:t>0.03</w:t>
+            </w:r>
           </w:p>
         </w:tc>
         <w:tc>
           <w:tcPr>
             <w:tcW w:w="1701" w:type="dxa"/>
-          </w:tcPr>
-          <w:p>
-            <w:pPr>
-              <w:cnfStyle w:val="000000100000" w:firstRow="0" w:lastRow="0" w:firstColumn="0" w:lastColumn="0" w:oddVBand="0" w:evenVBand="0" w:oddHBand="1" w:evenHBand="0" w:firstRowFirstColumn="0" w:firstRowLastColumn="0" w:lastRowFirstColumn="0" w:lastRowLastColumn="0"/>
-            </w:pPr>
+            <w:vAlign w:val="bottom"/>
+          </w:tcPr>
+          <w:p>
+            <w:pPr>
+              <w:cnfStyle w:val="000000100000" w:firstRow="0" w:lastRow="0" w:firstColumn="0" w:lastColumn="0" w:oddVBand="0" w:evenVBand="0" w:oddHBand="1" w:evenHBand="0" w:firstRowFirstColumn="0" w:firstRowLastColumn="0" w:lastRowFirstColumn="0" w:lastRowLastColumn="0"/>
+            </w:pPr>
+            <w:r>
+              <w:rPr>
+                <w:rFonts w:ascii="Aptos Narrow" w:hAnsi="Aptos Narrow"/>
+                <w:color w:val="000000"/>
+              </w:rPr>
+              <w:t>0</w:t>
+            </w:r>
           </w:p>
         </w:tc>
         <w:tc>
           <w:tcPr>
             <w:tcW w:w="1701" w:type="dxa"/>
-          </w:tcPr>
-          <w:p>
-            <w:pPr>
-              <w:cnfStyle w:val="000000100000" w:firstRow="0" w:lastRow="0" w:firstColumn="0" w:lastColumn="0" w:oddVBand="0" w:evenVBand="0" w:oddHBand="1" w:evenHBand="0" w:firstRowFirstColumn="0" w:firstRowLastColumn="0" w:lastRowFirstColumn="0" w:lastRowLastColumn="0"/>
-            </w:pPr>
+            <w:vAlign w:val="bottom"/>
+          </w:tcPr>
+          <w:p>
+            <w:pPr>
+              <w:cnfStyle w:val="000000100000" w:firstRow="0" w:lastRow="0" w:firstColumn="0" w:lastColumn="0" w:oddVBand="0" w:evenVBand="0" w:oddHBand="1" w:evenHBand="0" w:firstRowFirstColumn="0" w:firstRowLastColumn="0" w:lastRowFirstColumn="0" w:lastRowLastColumn="0"/>
+            </w:pPr>
+            <w:r>
+              <w:rPr>
+                <w:rFonts w:ascii="Aptos Narrow" w:hAnsi="Aptos Narrow"/>
+                <w:color w:val="000000"/>
+              </w:rPr>
+              <w:t>0.01</w:t>
+            </w:r>
           </w:p>
         </w:tc>
         <w:tc>
           <w:tcPr>
             <w:tcW w:w="1984" w:type="dxa"/>
-          </w:tcPr>
-          <w:p>
-            <w:pPr>
-              <w:cnfStyle w:val="000000100000" w:firstRow="0" w:lastRow="0" w:firstColumn="0" w:lastColumn="0" w:oddVBand="0" w:evenVBand="0" w:oddHBand="1" w:evenHBand="0" w:firstRowFirstColumn="0" w:firstRowLastColumn="0" w:lastRowFirstColumn="0" w:lastRowLastColumn="0"/>
-            </w:pPr>
+            <w:vAlign w:val="bottom"/>
+          </w:tcPr>
+          <w:p>
+            <w:pPr>
+              <w:cnfStyle w:val="000000100000" w:firstRow="0" w:lastRow="0" w:firstColumn="0" w:lastColumn="0" w:oddVBand="0" w:evenVBand="0" w:oddHBand="1" w:evenHBand="0" w:firstRowFirstColumn="0" w:firstRowLastColumn="0" w:lastRowFirstColumn="0" w:lastRowLastColumn="0"/>
+            </w:pPr>
+            <w:r>
+              <w:rPr>
+                <w:rFonts w:ascii="Aptos Narrow" w:hAnsi="Aptos Narrow"/>
+                <w:color w:val="000000"/>
+              </w:rPr>
+              <w:t>0.01</w:t>
+            </w:r>
           </w:p>
         </w:tc>
       </w:tr>
@@ -9586,51 +10026,91 @@
         <w:tc>
           <w:tcPr>
             <w:tcW w:w="1573" w:type="dxa"/>
+            <w:vAlign w:val="bottom"/>
           </w:tcPr>
           <w:p>
             <w:pPr>
               <w:cnfStyle w:val="000000000000" w:firstRow="0" w:lastRow="0" w:firstColumn="0" w:lastColumn="0" w:oddVBand="0" w:evenVBand="0" w:oddHBand="0" w:evenHBand="0" w:firstRowFirstColumn="0" w:firstRowLastColumn="0" w:lastRowFirstColumn="0" w:lastRowLastColumn="0"/>
             </w:pPr>
+            <w:r>
+              <w:rPr>
+                <w:rFonts w:ascii="Aptos Narrow" w:hAnsi="Aptos Narrow"/>
+                <w:color w:val="000000"/>
+              </w:rPr>
+              <w:t>0.89</w:t>
+            </w:r>
           </w:p>
         </w:tc>
         <w:tc>
           <w:tcPr>
             <w:tcW w:w="1559" w:type="dxa"/>
+            <w:vAlign w:val="bottom"/>
           </w:tcPr>
           <w:p>
             <w:pPr>
               <w:cnfStyle w:val="000000000000" w:firstRow="0" w:lastRow="0" w:firstColumn="0" w:lastColumn="0" w:oddVBand="0" w:evenVBand="0" w:oddHBand="0" w:evenHBand="0" w:firstRowFirstColumn="0" w:firstRowLastColumn="0" w:lastRowFirstColumn="0" w:lastRowLastColumn="0"/>
             </w:pPr>
+            <w:r>
+              <w:rPr>
+                <w:rFonts w:ascii="Aptos Narrow" w:hAnsi="Aptos Narrow"/>
+                <w:color w:val="000000"/>
+              </w:rPr>
+              <w:t>1.78</w:t>
+            </w:r>
           </w:p>
         </w:tc>
         <w:tc>
           <w:tcPr>
             <w:tcW w:w="1701" w:type="dxa"/>
+            <w:vAlign w:val="bottom"/>
           </w:tcPr>
           <w:p>
             <w:pPr>
               <w:cnfStyle w:val="000000000000" w:firstRow="0" w:lastRow="0" w:firstColumn="0" w:lastColumn="0" w:oddVBand="0" w:evenVBand="0" w:oddHBand="0" w:evenHBand="0" w:firstRowFirstColumn="0" w:firstRowLastColumn="0" w:lastRowFirstColumn="0" w:lastRowLastColumn="0"/>
             </w:pPr>
+            <w:r>
+              <w:rPr>
+                <w:rFonts w:ascii="Aptos Narrow" w:hAnsi="Aptos Narrow"/>
+                <w:color w:val="000000"/>
+              </w:rPr>
+              <w:t>0.18</w:t>
+            </w:r>
           </w:p>
         </w:tc>
         <w:tc>
           <w:tcPr>
             <w:tcW w:w="1701" w:type="dxa"/>
+            <w:vAlign w:val="bottom"/>
           </w:tcPr>
           <w:p>
             <w:pPr>
               <w:cnfStyle w:val="000000000000" w:firstRow="0" w:lastRow="0" w:firstColumn="0" w:lastColumn="0" w:oddVBand="0" w:evenVBand="0" w:oddHBand="0" w:evenHBand="0" w:firstRowFirstColumn="0" w:firstRowLastColumn="0" w:lastRowFirstColumn="0" w:lastRowLastColumn="0"/>
             </w:pPr>
+            <w:r>
+              <w:rPr>
+                <w:rFonts w:ascii="Aptos Narrow" w:hAnsi="Aptos Narrow"/>
+                <w:color w:val="000000"/>
+              </w:rPr>
+              <w:t>0.36</w:t>
+            </w:r>
           </w:p>
         </w:tc>
         <w:tc>
           <w:tcPr>
             <w:tcW w:w="1984" w:type="dxa"/>
+            <w:vAlign w:val="bottom"/>
           </w:tcPr>
           <w:p>
             <w:pPr>
               <w:cnfStyle w:val="000000000000" w:firstRow="0" w:lastRow="0" w:firstColumn="0" w:lastColumn="0" w:oddVBand="0" w:evenVBand="0" w:oddHBand="0" w:evenHBand="0" w:firstRowFirstColumn="0" w:firstRowLastColumn="0" w:lastRowFirstColumn="0" w:lastRowLastColumn="0"/>
             </w:pPr>
+            <w:r>
+              <w:rPr>
+                <w:rFonts w:ascii="Aptos Narrow" w:hAnsi="Aptos Narrow"/>
+                <w:color w:val="000000"/>
+              </w:rPr>
+              <w:t>0.71</w:t>
+            </w:r>
           </w:p>
         </w:tc>
       </w:tr>
@@ -9657,51 +10137,91 @@
         <w:tc>
           <w:tcPr>
             <w:tcW w:w="1573" w:type="dxa"/>
-          </w:tcPr>
-          <w:p>
-            <w:pPr>
-              <w:cnfStyle w:val="000000100000" w:firstRow="0" w:lastRow="0" w:firstColumn="0" w:lastColumn="0" w:oddVBand="0" w:evenVBand="0" w:oddHBand="1" w:evenHBand="0" w:firstRowFirstColumn="0" w:firstRowLastColumn="0" w:lastRowFirstColumn="0" w:lastRowLastColumn="0"/>
-            </w:pPr>
+            <w:vAlign w:val="bottom"/>
+          </w:tcPr>
+          <w:p>
+            <w:pPr>
+              <w:cnfStyle w:val="000000100000" w:firstRow="0" w:lastRow="0" w:firstColumn="0" w:lastColumn="0" w:oddVBand="0" w:evenVBand="0" w:oddHBand="1" w:evenHBand="0" w:firstRowFirstColumn="0" w:firstRowLastColumn="0" w:lastRowFirstColumn="0" w:lastRowLastColumn="0"/>
+            </w:pPr>
+            <w:r>
+              <w:rPr>
+                <w:rFonts w:ascii="Aptos Narrow" w:hAnsi="Aptos Narrow"/>
+                <w:color w:val="000000"/>
+              </w:rPr>
+              <w:t>0.08</w:t>
+            </w:r>
           </w:p>
         </w:tc>
         <w:tc>
           <w:tcPr>
             <w:tcW w:w="1559" w:type="dxa"/>
-          </w:tcPr>
-          <w:p>
-            <w:pPr>
-              <w:cnfStyle w:val="000000100000" w:firstRow="0" w:lastRow="0" w:firstColumn="0" w:lastColumn="0" w:oddVBand="0" w:evenVBand="0" w:oddHBand="1" w:evenHBand="0" w:firstRowFirstColumn="0" w:firstRowLastColumn="0" w:lastRowFirstColumn="0" w:lastRowLastColumn="0"/>
-            </w:pPr>
+            <w:vAlign w:val="bottom"/>
+          </w:tcPr>
+          <w:p>
+            <w:pPr>
+              <w:cnfStyle w:val="000000100000" w:firstRow="0" w:lastRow="0" w:firstColumn="0" w:lastColumn="0" w:oddVBand="0" w:evenVBand="0" w:oddHBand="1" w:evenHBand="0" w:firstRowFirstColumn="0" w:firstRowLastColumn="0" w:lastRowFirstColumn="0" w:lastRowLastColumn="0"/>
+            </w:pPr>
+            <w:r>
+              <w:rPr>
+                <w:rFonts w:ascii="Aptos Narrow" w:hAnsi="Aptos Narrow"/>
+                <w:color w:val="000000"/>
+              </w:rPr>
+              <w:t>0.15</w:t>
+            </w:r>
           </w:p>
         </w:tc>
         <w:tc>
           <w:tcPr>
             <w:tcW w:w="1701" w:type="dxa"/>
-          </w:tcPr>
-          <w:p>
-            <w:pPr>
-              <w:cnfStyle w:val="000000100000" w:firstRow="0" w:lastRow="0" w:firstColumn="0" w:lastColumn="0" w:oddVBand="0" w:evenVBand="0" w:oddHBand="1" w:evenHBand="0" w:firstRowFirstColumn="0" w:firstRowLastColumn="0" w:lastRowFirstColumn="0" w:lastRowLastColumn="0"/>
-            </w:pPr>
+            <w:vAlign w:val="bottom"/>
+          </w:tcPr>
+          <w:p>
+            <w:pPr>
+              <w:cnfStyle w:val="000000100000" w:firstRow="0" w:lastRow="0" w:firstColumn="0" w:lastColumn="0" w:oddVBand="0" w:evenVBand="0" w:oddHBand="1" w:evenHBand="0" w:firstRowFirstColumn="0" w:firstRowLastColumn="0" w:lastRowFirstColumn="0" w:lastRowLastColumn="0"/>
+            </w:pPr>
+            <w:r>
+              <w:rPr>
+                <w:rFonts w:ascii="Aptos Narrow" w:hAnsi="Aptos Narrow"/>
+                <w:color w:val="000000"/>
+              </w:rPr>
+              <w:t>0.02</w:t>
+            </w:r>
           </w:p>
         </w:tc>
         <w:tc>
           <w:tcPr>
             <w:tcW w:w="1701" w:type="dxa"/>
-          </w:tcPr>
-          <w:p>
-            <w:pPr>
-              <w:cnfStyle w:val="000000100000" w:firstRow="0" w:lastRow="0" w:firstColumn="0" w:lastColumn="0" w:oddVBand="0" w:evenVBand="0" w:oddHBand="1" w:evenHBand="0" w:firstRowFirstColumn="0" w:firstRowLastColumn="0" w:lastRowFirstColumn="0" w:lastRowLastColumn="0"/>
-            </w:pPr>
+            <w:vAlign w:val="bottom"/>
+          </w:tcPr>
+          <w:p>
+            <w:pPr>
+              <w:cnfStyle w:val="000000100000" w:firstRow="0" w:lastRow="0" w:firstColumn="0" w:lastColumn="0" w:oddVBand="0" w:evenVBand="0" w:oddHBand="1" w:evenHBand="0" w:firstRowFirstColumn="0" w:firstRowLastColumn="0" w:lastRowFirstColumn="0" w:lastRowLastColumn="0"/>
+            </w:pPr>
+            <w:r>
+              <w:rPr>
+                <w:rFonts w:ascii="Aptos Narrow" w:hAnsi="Aptos Narrow"/>
+                <w:color w:val="000000"/>
+              </w:rPr>
+              <w:t>0.03</w:t>
+            </w:r>
           </w:p>
         </w:tc>
         <w:tc>
           <w:tcPr>
             <w:tcW w:w="1984" w:type="dxa"/>
-          </w:tcPr>
-          <w:p>
-            <w:pPr>
-              <w:cnfStyle w:val="000000100000" w:firstRow="0" w:lastRow="0" w:firstColumn="0" w:lastColumn="0" w:oddVBand="0" w:evenVBand="0" w:oddHBand="1" w:evenHBand="0" w:firstRowFirstColumn="0" w:firstRowLastColumn="0" w:lastRowFirstColumn="0" w:lastRowLastColumn="0"/>
-            </w:pPr>
+            <w:vAlign w:val="bottom"/>
+          </w:tcPr>
+          <w:p>
+            <w:pPr>
+              <w:cnfStyle w:val="000000100000" w:firstRow="0" w:lastRow="0" w:firstColumn="0" w:lastColumn="0" w:oddVBand="0" w:evenVBand="0" w:oddHBand="1" w:evenHBand="0" w:firstRowFirstColumn="0" w:firstRowLastColumn="0" w:lastRowFirstColumn="0" w:lastRowLastColumn="0"/>
+            </w:pPr>
+            <w:r>
+              <w:rPr>
+                <w:rFonts w:ascii="Aptos Narrow" w:hAnsi="Aptos Narrow"/>
+                <w:color w:val="000000"/>
+              </w:rPr>
+              <w:t>0.06</w:t>
+            </w:r>
           </w:p>
         </w:tc>
       </w:tr>
@@ -9725,51 +10245,91 @@
         <w:tc>
           <w:tcPr>
             <w:tcW w:w="1573" w:type="dxa"/>
+            <w:vAlign w:val="bottom"/>
           </w:tcPr>
           <w:p>
             <w:pPr>
               <w:cnfStyle w:val="000000000000" w:firstRow="0" w:lastRow="0" w:firstColumn="0" w:lastColumn="0" w:oddVBand="0" w:evenVBand="0" w:oddHBand="0" w:evenHBand="0" w:firstRowFirstColumn="0" w:firstRowLastColumn="0" w:lastRowFirstColumn="0" w:lastRowLastColumn="0"/>
             </w:pPr>
+            <w:r>
+              <w:rPr>
+                <w:rFonts w:ascii="Aptos Narrow" w:hAnsi="Aptos Narrow"/>
+                <w:color w:val="000000"/>
+              </w:rPr>
+              <w:t>0.67</w:t>
+            </w:r>
           </w:p>
         </w:tc>
         <w:tc>
           <w:tcPr>
             <w:tcW w:w="1559" w:type="dxa"/>
+            <w:vAlign w:val="bottom"/>
           </w:tcPr>
           <w:p>
             <w:pPr>
               <w:cnfStyle w:val="000000000000" w:firstRow="0" w:lastRow="0" w:firstColumn="0" w:lastColumn="0" w:oddVBand="0" w:evenVBand="0" w:oddHBand="0" w:evenHBand="0" w:firstRowFirstColumn="0" w:firstRowLastColumn="0" w:lastRowFirstColumn="0" w:lastRowLastColumn="0"/>
             </w:pPr>
+            <w:r>
+              <w:rPr>
+                <w:rFonts w:ascii="Aptos Narrow" w:hAnsi="Aptos Narrow"/>
+                <w:color w:val="000000"/>
+              </w:rPr>
+              <w:t>1.33</w:t>
+            </w:r>
           </w:p>
         </w:tc>
         <w:tc>
           <w:tcPr>
             <w:tcW w:w="1701" w:type="dxa"/>
+            <w:vAlign w:val="bottom"/>
           </w:tcPr>
           <w:p>
             <w:pPr>
               <w:cnfStyle w:val="000000000000" w:firstRow="0" w:lastRow="0" w:firstColumn="0" w:lastColumn="0" w:oddVBand="0" w:evenVBand="0" w:oddHBand="0" w:evenHBand="0" w:firstRowFirstColumn="0" w:firstRowLastColumn="0" w:lastRowFirstColumn="0" w:lastRowLastColumn="0"/>
             </w:pPr>
+            <w:r>
+              <w:rPr>
+                <w:rFonts w:ascii="Aptos Narrow" w:hAnsi="Aptos Narrow"/>
+                <w:color w:val="000000"/>
+              </w:rPr>
+              <w:t>0.13</w:t>
+            </w:r>
           </w:p>
         </w:tc>
         <w:tc>
           <w:tcPr>
             <w:tcW w:w="1701" w:type="dxa"/>
+            <w:vAlign w:val="bottom"/>
           </w:tcPr>
           <w:p>
             <w:pPr>
               <w:cnfStyle w:val="000000000000" w:firstRow="0" w:lastRow="0" w:firstColumn="0" w:lastColumn="0" w:oddVBand="0" w:evenVBand="0" w:oddHBand="0" w:evenHBand="0" w:firstRowFirstColumn="0" w:firstRowLastColumn="0" w:lastRowFirstColumn="0" w:lastRowLastColumn="0"/>
             </w:pPr>
+            <w:r>
+              <w:rPr>
+                <w:rFonts w:ascii="Aptos Narrow" w:hAnsi="Aptos Narrow"/>
+                <w:color w:val="000000"/>
+              </w:rPr>
+              <w:t>0.27</w:t>
+            </w:r>
           </w:p>
         </w:tc>
         <w:tc>
           <w:tcPr>
             <w:tcW w:w="1984" w:type="dxa"/>
+            <w:vAlign w:val="bottom"/>
           </w:tcPr>
           <w:p>
             <w:pPr>
               <w:cnfStyle w:val="000000000000" w:firstRow="0" w:lastRow="0" w:firstColumn="0" w:lastColumn="0" w:oddVBand="0" w:evenVBand="0" w:oddHBand="0" w:evenHBand="0" w:firstRowFirstColumn="0" w:firstRowLastColumn="0" w:lastRowFirstColumn="0" w:lastRowLastColumn="0"/>
             </w:pPr>
+            <w:r>
+              <w:rPr>
+                <w:rFonts w:ascii="Aptos Narrow" w:hAnsi="Aptos Narrow"/>
+                <w:color w:val="000000"/>
+              </w:rPr>
+              <w:t>0.53</w:t>
+            </w:r>
           </w:p>
         </w:tc>
       </w:tr>
@@ -9797,51 +10357,91 @@
         <w:tc>
           <w:tcPr>
             <w:tcW w:w="1573" w:type="dxa"/>
-          </w:tcPr>
-          <w:p>
-            <w:pPr>
-              <w:cnfStyle w:val="000000100000" w:firstRow="0" w:lastRow="0" w:firstColumn="0" w:lastColumn="0" w:oddVBand="0" w:evenVBand="0" w:oddHBand="1" w:evenHBand="0" w:firstRowFirstColumn="0" w:firstRowLastColumn="0" w:lastRowFirstColumn="0" w:lastRowLastColumn="0"/>
-            </w:pPr>
+            <w:vAlign w:val="bottom"/>
+          </w:tcPr>
+          <w:p>
+            <w:pPr>
+              <w:cnfStyle w:val="000000100000" w:firstRow="0" w:lastRow="0" w:firstColumn="0" w:lastColumn="0" w:oddVBand="0" w:evenVBand="0" w:oddHBand="1" w:evenHBand="0" w:firstRowFirstColumn="0" w:firstRowLastColumn="0" w:lastRowFirstColumn="0" w:lastRowLastColumn="0"/>
+            </w:pPr>
+            <w:r>
+              <w:rPr>
+                <w:rFonts w:ascii="Aptos Narrow" w:hAnsi="Aptos Narrow"/>
+                <w:color w:val="000000"/>
+              </w:rPr>
+              <w:t>0.04</w:t>
+            </w:r>
           </w:p>
         </w:tc>
         <w:tc>
           <w:tcPr>
             <w:tcW w:w="1559" w:type="dxa"/>
-          </w:tcPr>
-          <w:p>
-            <w:pPr>
-              <w:cnfStyle w:val="000000100000" w:firstRow="0" w:lastRow="0" w:firstColumn="0" w:lastColumn="0" w:oddVBand="0" w:evenVBand="0" w:oddHBand="1" w:evenHBand="0" w:firstRowFirstColumn="0" w:firstRowLastColumn="0" w:lastRowFirstColumn="0" w:lastRowLastColumn="0"/>
-            </w:pPr>
+            <w:vAlign w:val="bottom"/>
+          </w:tcPr>
+          <w:p>
+            <w:pPr>
+              <w:cnfStyle w:val="000000100000" w:firstRow="0" w:lastRow="0" w:firstColumn="0" w:lastColumn="0" w:oddVBand="0" w:evenVBand="0" w:oddHBand="1" w:evenHBand="0" w:firstRowFirstColumn="0" w:firstRowLastColumn="0" w:lastRowFirstColumn="0" w:lastRowLastColumn="0"/>
+            </w:pPr>
+            <w:r>
+              <w:rPr>
+                <w:rFonts w:ascii="Aptos Narrow" w:hAnsi="Aptos Narrow"/>
+                <w:color w:val="000000"/>
+              </w:rPr>
+              <w:t>0.09</w:t>
+            </w:r>
           </w:p>
         </w:tc>
         <w:tc>
           <w:tcPr>
             <w:tcW w:w="1701" w:type="dxa"/>
-          </w:tcPr>
-          <w:p>
-            <w:pPr>
-              <w:cnfStyle w:val="000000100000" w:firstRow="0" w:lastRow="0" w:firstColumn="0" w:lastColumn="0" w:oddVBand="0" w:evenVBand="0" w:oddHBand="1" w:evenHBand="0" w:firstRowFirstColumn="0" w:firstRowLastColumn="0" w:lastRowFirstColumn="0" w:lastRowLastColumn="0"/>
-            </w:pPr>
+            <w:vAlign w:val="bottom"/>
+          </w:tcPr>
+          <w:p>
+            <w:pPr>
+              <w:cnfStyle w:val="000000100000" w:firstRow="0" w:lastRow="0" w:firstColumn="0" w:lastColumn="0" w:oddVBand="0" w:evenVBand="0" w:oddHBand="1" w:evenHBand="0" w:firstRowFirstColumn="0" w:firstRowLastColumn="0" w:lastRowFirstColumn="0" w:lastRowLastColumn="0"/>
+            </w:pPr>
+            <w:r>
+              <w:rPr>
+                <w:rFonts w:ascii="Aptos Narrow" w:hAnsi="Aptos Narrow"/>
+                <w:color w:val="000000"/>
+              </w:rPr>
+              <w:t>0.01</w:t>
+            </w:r>
           </w:p>
         </w:tc>
         <w:tc>
           <w:tcPr>
             <w:tcW w:w="1701" w:type="dxa"/>
-          </w:tcPr>
-          <w:p>
-            <w:pPr>
-              <w:cnfStyle w:val="000000100000" w:firstRow="0" w:lastRow="0" w:firstColumn="0" w:lastColumn="0" w:oddVBand="0" w:evenVBand="0" w:oddHBand="1" w:evenHBand="0" w:firstRowFirstColumn="0" w:firstRowLastColumn="0" w:lastRowFirstColumn="0" w:lastRowLastColumn="0"/>
-            </w:pPr>
+            <w:vAlign w:val="bottom"/>
+          </w:tcPr>
+          <w:p>
+            <w:pPr>
+              <w:cnfStyle w:val="000000100000" w:firstRow="0" w:lastRow="0" w:firstColumn="0" w:lastColumn="0" w:oddVBand="0" w:evenVBand="0" w:oddHBand="1" w:evenHBand="0" w:firstRowFirstColumn="0" w:firstRowLastColumn="0" w:lastRowFirstColumn="0" w:lastRowLastColumn="0"/>
+            </w:pPr>
+            <w:r>
+              <w:rPr>
+                <w:rFonts w:ascii="Aptos Narrow" w:hAnsi="Aptos Narrow"/>
+                <w:color w:val="000000"/>
+              </w:rPr>
+              <w:t>0.02</w:t>
+            </w:r>
           </w:p>
         </w:tc>
         <w:tc>
           <w:tcPr>
             <w:tcW w:w="1984" w:type="dxa"/>
-          </w:tcPr>
-          <w:p>
-            <w:pPr>
-              <w:cnfStyle w:val="000000100000" w:firstRow="0" w:lastRow="0" w:firstColumn="0" w:lastColumn="0" w:oddVBand="0" w:evenVBand="0" w:oddHBand="1" w:evenHBand="0" w:firstRowFirstColumn="0" w:firstRowLastColumn="0" w:lastRowFirstColumn="0" w:lastRowLastColumn="0"/>
-            </w:pPr>
+            <w:vAlign w:val="bottom"/>
+          </w:tcPr>
+          <w:p>
+            <w:pPr>
+              <w:cnfStyle w:val="000000100000" w:firstRow="0" w:lastRow="0" w:firstColumn="0" w:lastColumn="0" w:oddVBand="0" w:evenVBand="0" w:oddHBand="1" w:evenHBand="0" w:firstRowFirstColumn="0" w:firstRowLastColumn="0" w:lastRowFirstColumn="0" w:lastRowLastColumn="0"/>
+            </w:pPr>
+            <w:r>
+              <w:rPr>
+                <w:rFonts w:ascii="Aptos Narrow" w:hAnsi="Aptos Narrow"/>
+                <w:color w:val="000000"/>
+              </w:rPr>
+              <w:t>0.04</w:t>
+            </w:r>
           </w:p>
         </w:tc>
       </w:tr>
@@ -9865,51 +10465,91 @@
         <w:tc>
           <w:tcPr>
             <w:tcW w:w="1573" w:type="dxa"/>
+            <w:vAlign w:val="bottom"/>
           </w:tcPr>
           <w:p>
             <w:pPr>
               <w:cnfStyle w:val="000000000000" w:firstRow="0" w:lastRow="0" w:firstColumn="0" w:lastColumn="0" w:oddVBand="0" w:evenVBand="0" w:oddHBand="0" w:evenHBand="0" w:firstRowFirstColumn="0" w:firstRowLastColumn="0" w:lastRowFirstColumn="0" w:lastRowLastColumn="0"/>
             </w:pPr>
+            <w:r>
+              <w:rPr>
+                <w:rFonts w:ascii="Aptos Narrow" w:hAnsi="Aptos Narrow"/>
+                <w:color w:val="000000"/>
+              </w:rPr>
+              <w:t>0.56</w:t>
+            </w:r>
           </w:p>
         </w:tc>
         <w:tc>
           <w:tcPr>
             <w:tcW w:w="1559" w:type="dxa"/>
+            <w:vAlign w:val="bottom"/>
           </w:tcPr>
           <w:p>
             <w:pPr>
               <w:cnfStyle w:val="000000000000" w:firstRow="0" w:lastRow="0" w:firstColumn="0" w:lastColumn="0" w:oddVBand="0" w:evenVBand="0" w:oddHBand="0" w:evenHBand="0" w:firstRowFirstColumn="0" w:firstRowLastColumn="0" w:lastRowFirstColumn="0" w:lastRowLastColumn="0"/>
             </w:pPr>
+            <w:r>
+              <w:rPr>
+                <w:rFonts w:ascii="Aptos Narrow" w:hAnsi="Aptos Narrow"/>
+                <w:color w:val="000000"/>
+              </w:rPr>
+              <w:t>1.11</w:t>
+            </w:r>
           </w:p>
         </w:tc>
         <w:tc>
           <w:tcPr>
             <w:tcW w:w="1701" w:type="dxa"/>
+            <w:vAlign w:val="bottom"/>
           </w:tcPr>
           <w:p>
             <w:pPr>
               <w:cnfStyle w:val="000000000000" w:firstRow="0" w:lastRow="0" w:firstColumn="0" w:lastColumn="0" w:oddVBand="0" w:evenVBand="0" w:oddHBand="0" w:evenHBand="0" w:firstRowFirstColumn="0" w:firstRowLastColumn="0" w:lastRowFirstColumn="0" w:lastRowLastColumn="0"/>
             </w:pPr>
+            <w:r>
+              <w:rPr>
+                <w:rFonts w:ascii="Aptos Narrow" w:hAnsi="Aptos Narrow"/>
+                <w:color w:val="000000"/>
+              </w:rPr>
+              <w:t>0.11</w:t>
+            </w:r>
           </w:p>
         </w:tc>
         <w:tc>
           <w:tcPr>
             <w:tcW w:w="1701" w:type="dxa"/>
+            <w:vAlign w:val="bottom"/>
           </w:tcPr>
           <w:p>
             <w:pPr>
               <w:cnfStyle w:val="000000000000" w:firstRow="0" w:lastRow="0" w:firstColumn="0" w:lastColumn="0" w:oddVBand="0" w:evenVBand="0" w:oddHBand="0" w:evenHBand="0" w:firstRowFirstColumn="0" w:firstRowLastColumn="0" w:lastRowFirstColumn="0" w:lastRowLastColumn="0"/>
             </w:pPr>
+            <w:r>
+              <w:rPr>
+                <w:rFonts w:ascii="Aptos Narrow" w:hAnsi="Aptos Narrow"/>
+                <w:color w:val="000000"/>
+              </w:rPr>
+              <w:t>0.22</w:t>
+            </w:r>
           </w:p>
         </w:tc>
         <w:tc>
           <w:tcPr>
             <w:tcW w:w="1984" w:type="dxa"/>
+            <w:vAlign w:val="bottom"/>
           </w:tcPr>
           <w:p>
             <w:pPr>
               <w:cnfStyle w:val="000000000000" w:firstRow="0" w:lastRow="0" w:firstColumn="0" w:lastColumn="0" w:oddVBand="0" w:evenVBand="0" w:oddHBand="0" w:evenHBand="0" w:firstRowFirstColumn="0" w:firstRowLastColumn="0" w:lastRowFirstColumn="0" w:lastRowLastColumn="0"/>
             </w:pPr>
+            <w:r>
+              <w:rPr>
+                <w:rFonts w:ascii="Aptos Narrow" w:hAnsi="Aptos Narrow"/>
+                <w:color w:val="000000"/>
+              </w:rPr>
+              <w:t>0.45</w:t>
+            </w:r>
           </w:p>
         </w:tc>
       </w:tr>
@@ -9936,51 +10576,91 @@
         <w:tc>
           <w:tcPr>
             <w:tcW w:w="1573" w:type="dxa"/>
-          </w:tcPr>
-          <w:p>
-            <w:pPr>
-              <w:cnfStyle w:val="000000100000" w:firstRow="0" w:lastRow="0" w:firstColumn="0" w:lastColumn="0" w:oddVBand="0" w:evenVBand="0" w:oddHBand="1" w:evenHBand="0" w:firstRowFirstColumn="0" w:firstRowLastColumn="0" w:lastRowFirstColumn="0" w:lastRowLastColumn="0"/>
-            </w:pPr>
+            <w:vAlign w:val="bottom"/>
+          </w:tcPr>
+          <w:p>
+            <w:pPr>
+              <w:cnfStyle w:val="000000100000" w:firstRow="0" w:lastRow="0" w:firstColumn="0" w:lastColumn="0" w:oddVBand="0" w:evenVBand="0" w:oddHBand="1" w:evenHBand="0" w:firstRowFirstColumn="0" w:firstRowLastColumn="0" w:lastRowFirstColumn="0" w:lastRowLastColumn="0"/>
+            </w:pPr>
+            <w:r>
+              <w:rPr>
+                <w:rFonts w:ascii="Aptos Narrow" w:hAnsi="Aptos Narrow"/>
+                <w:color w:val="000000"/>
+              </w:rPr>
+              <w:t>0.26</w:t>
+            </w:r>
           </w:p>
         </w:tc>
         <w:tc>
           <w:tcPr>
             <w:tcW w:w="1559" w:type="dxa"/>
-          </w:tcPr>
-          <w:p>
-            <w:pPr>
-              <w:cnfStyle w:val="000000100000" w:firstRow="0" w:lastRow="0" w:firstColumn="0" w:lastColumn="0" w:oddVBand="0" w:evenVBand="0" w:oddHBand="1" w:evenHBand="0" w:firstRowFirstColumn="0" w:firstRowLastColumn="0" w:lastRowFirstColumn="0" w:lastRowLastColumn="0"/>
-            </w:pPr>
+            <w:vAlign w:val="bottom"/>
+          </w:tcPr>
+          <w:p>
+            <w:pPr>
+              <w:cnfStyle w:val="000000100000" w:firstRow="0" w:lastRow="0" w:firstColumn="0" w:lastColumn="0" w:oddVBand="0" w:evenVBand="0" w:oddHBand="1" w:evenHBand="0" w:firstRowFirstColumn="0" w:firstRowLastColumn="0" w:lastRowFirstColumn="0" w:lastRowLastColumn="0"/>
+            </w:pPr>
+            <w:r>
+              <w:rPr>
+                <w:rFonts w:ascii="Aptos Narrow" w:hAnsi="Aptos Narrow"/>
+                <w:color w:val="000000"/>
+              </w:rPr>
+              <w:t>0.53</w:t>
+            </w:r>
           </w:p>
         </w:tc>
         <w:tc>
           <w:tcPr>
             <w:tcW w:w="1701" w:type="dxa"/>
-          </w:tcPr>
-          <w:p>
-            <w:pPr>
-              <w:cnfStyle w:val="000000100000" w:firstRow="0" w:lastRow="0" w:firstColumn="0" w:lastColumn="0" w:oddVBand="0" w:evenVBand="0" w:oddHBand="1" w:evenHBand="0" w:firstRowFirstColumn="0" w:firstRowLastColumn="0" w:lastRowFirstColumn="0" w:lastRowLastColumn="0"/>
-            </w:pPr>
+            <w:vAlign w:val="bottom"/>
+          </w:tcPr>
+          <w:p>
+            <w:pPr>
+              <w:cnfStyle w:val="000000100000" w:firstRow="0" w:lastRow="0" w:firstColumn="0" w:lastColumn="0" w:oddVBand="0" w:evenVBand="0" w:oddHBand="1" w:evenHBand="0" w:firstRowFirstColumn="0" w:firstRowLastColumn="0" w:lastRowFirstColumn="0" w:lastRowLastColumn="0"/>
+            </w:pPr>
+            <w:r>
+              <w:rPr>
+                <w:rFonts w:ascii="Aptos Narrow" w:hAnsi="Aptos Narrow"/>
+                <w:color w:val="000000"/>
+              </w:rPr>
+              <w:t>0.05</w:t>
+            </w:r>
           </w:p>
         </w:tc>
         <w:tc>
           <w:tcPr>
             <w:tcW w:w="1701" w:type="dxa"/>
-          </w:tcPr>
-          <w:p>
-            <w:pPr>
-              <w:cnfStyle w:val="000000100000" w:firstRow="0" w:lastRow="0" w:firstColumn="0" w:lastColumn="0" w:oddVBand="0" w:evenVBand="0" w:oddHBand="1" w:evenHBand="0" w:firstRowFirstColumn="0" w:firstRowLastColumn="0" w:lastRowFirstColumn="0" w:lastRowLastColumn="0"/>
-            </w:pPr>
+            <w:vAlign w:val="bottom"/>
+          </w:tcPr>
+          <w:p>
+            <w:pPr>
+              <w:cnfStyle w:val="000000100000" w:firstRow="0" w:lastRow="0" w:firstColumn="0" w:lastColumn="0" w:oddVBand="0" w:evenVBand="0" w:oddHBand="1" w:evenHBand="0" w:firstRowFirstColumn="0" w:firstRowLastColumn="0" w:lastRowFirstColumn="0" w:lastRowLastColumn="0"/>
+            </w:pPr>
+            <w:r>
+              <w:rPr>
+                <w:rFonts w:ascii="Aptos Narrow" w:hAnsi="Aptos Narrow"/>
+                <w:color w:val="000000"/>
+              </w:rPr>
+              <w:t>0.11</w:t>
+            </w:r>
           </w:p>
         </w:tc>
         <w:tc>
           <w:tcPr>
             <w:tcW w:w="1984" w:type="dxa"/>
-          </w:tcPr>
-          <w:p>
-            <w:pPr>
-              <w:cnfStyle w:val="000000100000" w:firstRow="0" w:lastRow="0" w:firstColumn="0" w:lastColumn="0" w:oddVBand="0" w:evenVBand="0" w:oddHBand="1" w:evenHBand="0" w:firstRowFirstColumn="0" w:firstRowLastColumn="0" w:lastRowFirstColumn="0" w:lastRowLastColumn="0"/>
-            </w:pPr>
+            <w:vAlign w:val="bottom"/>
+          </w:tcPr>
+          <w:p>
+            <w:pPr>
+              <w:cnfStyle w:val="000000100000" w:firstRow="0" w:lastRow="0" w:firstColumn="0" w:lastColumn="0" w:oddVBand="0" w:evenVBand="0" w:oddHBand="1" w:evenHBand="0" w:firstRowFirstColumn="0" w:firstRowLastColumn="0" w:lastRowFirstColumn="0" w:lastRowLastColumn="0"/>
+            </w:pPr>
+            <w:r>
+              <w:rPr>
+                <w:rFonts w:ascii="Aptos Narrow" w:hAnsi="Aptos Narrow"/>
+                <w:color w:val="000000"/>
+              </w:rPr>
+              <w:t>0.21</w:t>
+            </w:r>
           </w:p>
         </w:tc>
       </w:tr>
@@ -10004,51 +10684,91 @@
         <w:tc>
           <w:tcPr>
             <w:tcW w:w="1573" w:type="dxa"/>
+            <w:vAlign w:val="bottom"/>
           </w:tcPr>
           <w:p>
             <w:pPr>
               <w:cnfStyle w:val="000000000000" w:firstRow="0" w:lastRow="0" w:firstColumn="0" w:lastColumn="0" w:oddVBand="0" w:evenVBand="0" w:oddHBand="0" w:evenHBand="0" w:firstRowFirstColumn="0" w:firstRowLastColumn="0" w:lastRowFirstColumn="0" w:lastRowLastColumn="0"/>
             </w:pPr>
+            <w:r>
+              <w:rPr>
+                <w:rFonts w:ascii="Aptos Narrow" w:hAnsi="Aptos Narrow"/>
+                <w:color w:val="000000"/>
+              </w:rPr>
+              <w:t>0.14</w:t>
+            </w:r>
           </w:p>
         </w:tc>
         <w:tc>
           <w:tcPr>
             <w:tcW w:w="1559" w:type="dxa"/>
+            <w:vAlign w:val="bottom"/>
           </w:tcPr>
           <w:p>
             <w:pPr>
               <w:cnfStyle w:val="000000000000" w:firstRow="0" w:lastRow="0" w:firstColumn="0" w:lastColumn="0" w:oddVBand="0" w:evenVBand="0" w:oddHBand="0" w:evenHBand="0" w:firstRowFirstColumn="0" w:firstRowLastColumn="0" w:lastRowFirstColumn="0" w:lastRowLastColumn="0"/>
             </w:pPr>
+            <w:r>
+              <w:rPr>
+                <w:rFonts w:ascii="Aptos Narrow" w:hAnsi="Aptos Narrow"/>
+                <w:color w:val="000000"/>
+              </w:rPr>
+              <w:t>0.28</w:t>
+            </w:r>
           </w:p>
         </w:tc>
         <w:tc>
           <w:tcPr>
             <w:tcW w:w="1701" w:type="dxa"/>
+            <w:vAlign w:val="bottom"/>
           </w:tcPr>
           <w:p>
             <w:pPr>
               <w:cnfStyle w:val="000000000000" w:firstRow="0" w:lastRow="0" w:firstColumn="0" w:lastColumn="0" w:oddVBand="0" w:evenVBand="0" w:oddHBand="0" w:evenHBand="0" w:firstRowFirstColumn="0" w:firstRowLastColumn="0" w:lastRowFirstColumn="0" w:lastRowLastColumn="0"/>
             </w:pPr>
+            <w:r>
+              <w:rPr>
+                <w:rFonts w:ascii="Aptos Narrow" w:hAnsi="Aptos Narrow"/>
+                <w:color w:val="000000"/>
+              </w:rPr>
+              <w:t>0.03</w:t>
+            </w:r>
           </w:p>
         </w:tc>
         <w:tc>
           <w:tcPr>
             <w:tcW w:w="1701" w:type="dxa"/>
+            <w:vAlign w:val="bottom"/>
           </w:tcPr>
           <w:p>
             <w:pPr>
               <w:cnfStyle w:val="000000000000" w:firstRow="0" w:lastRow="0" w:firstColumn="0" w:lastColumn="0" w:oddVBand="0" w:evenVBand="0" w:oddHBand="0" w:evenHBand="0" w:firstRowFirstColumn="0" w:firstRowLastColumn="0" w:lastRowFirstColumn="0" w:lastRowLastColumn="0"/>
             </w:pPr>
+            <w:r>
+              <w:rPr>
+                <w:rFonts w:ascii="Aptos Narrow" w:hAnsi="Aptos Narrow"/>
+                <w:color w:val="000000"/>
+              </w:rPr>
+              <w:t>0.06</w:t>
+            </w:r>
           </w:p>
         </w:tc>
         <w:tc>
           <w:tcPr>
             <w:tcW w:w="1984" w:type="dxa"/>
+            <w:vAlign w:val="bottom"/>
           </w:tcPr>
           <w:p>
             <w:pPr>
               <w:cnfStyle w:val="000000000000" w:firstRow="0" w:lastRow="0" w:firstColumn="0" w:lastColumn="0" w:oddVBand="0" w:evenVBand="0" w:oddHBand="0" w:evenHBand="0" w:firstRowFirstColumn="0" w:firstRowLastColumn="0" w:lastRowFirstColumn="0" w:lastRowLastColumn="0"/>
             </w:pPr>
+            <w:r>
+              <w:rPr>
+                <w:rFonts w:ascii="Aptos Narrow" w:hAnsi="Aptos Narrow"/>
+                <w:color w:val="000000"/>
+              </w:rPr>
+              <w:t>0.11</w:t>
+            </w:r>
           </w:p>
         </w:tc>
       </w:tr>
@@ -10075,51 +10795,91 @@
         <w:tc>
           <w:tcPr>
             <w:tcW w:w="1573" w:type="dxa"/>
-          </w:tcPr>
-          <w:p>
-            <w:pPr>
-              <w:cnfStyle w:val="000000100000" w:firstRow="0" w:lastRow="0" w:firstColumn="0" w:lastColumn="0" w:oddVBand="0" w:evenVBand="0" w:oddHBand="1" w:evenHBand="0" w:firstRowFirstColumn="0" w:firstRowLastColumn="0" w:lastRowFirstColumn="0" w:lastRowLastColumn="0"/>
-            </w:pPr>
+            <w:vAlign w:val="bottom"/>
+          </w:tcPr>
+          <w:p>
+            <w:pPr>
+              <w:cnfStyle w:val="000000100000" w:firstRow="0" w:lastRow="0" w:firstColumn="0" w:lastColumn="0" w:oddVBand="0" w:evenVBand="0" w:oddHBand="1" w:evenHBand="0" w:firstRowFirstColumn="0" w:firstRowLastColumn="0" w:lastRowFirstColumn="0" w:lastRowLastColumn="0"/>
+            </w:pPr>
+            <w:r>
+              <w:rPr>
+                <w:rFonts w:ascii="Aptos Narrow" w:hAnsi="Aptos Narrow"/>
+                <w:color w:val="000000"/>
+              </w:rPr>
+              <w:t>0.21</w:t>
+            </w:r>
           </w:p>
         </w:tc>
         <w:tc>
           <w:tcPr>
             <w:tcW w:w="1559" w:type="dxa"/>
-          </w:tcPr>
-          <w:p>
-            <w:pPr>
-              <w:cnfStyle w:val="000000100000" w:firstRow="0" w:lastRow="0" w:firstColumn="0" w:lastColumn="0" w:oddVBand="0" w:evenVBand="0" w:oddHBand="1" w:evenHBand="0" w:firstRowFirstColumn="0" w:firstRowLastColumn="0" w:lastRowFirstColumn="0" w:lastRowLastColumn="0"/>
-            </w:pPr>
+            <w:vAlign w:val="bottom"/>
+          </w:tcPr>
+          <w:p>
+            <w:pPr>
+              <w:cnfStyle w:val="000000100000" w:firstRow="0" w:lastRow="0" w:firstColumn="0" w:lastColumn="0" w:oddVBand="0" w:evenVBand="0" w:oddHBand="1" w:evenHBand="0" w:firstRowFirstColumn="0" w:firstRowLastColumn="0" w:lastRowFirstColumn="0" w:lastRowLastColumn="0"/>
+            </w:pPr>
+            <w:r>
+              <w:rPr>
+                <w:rFonts w:ascii="Aptos Narrow" w:hAnsi="Aptos Narrow"/>
+                <w:color w:val="000000"/>
+              </w:rPr>
+              <w:t>0.43</w:t>
+            </w:r>
           </w:p>
         </w:tc>
         <w:tc>
           <w:tcPr>
             <w:tcW w:w="1701" w:type="dxa"/>
-          </w:tcPr>
-          <w:p>
-            <w:pPr>
-              <w:cnfStyle w:val="000000100000" w:firstRow="0" w:lastRow="0" w:firstColumn="0" w:lastColumn="0" w:oddVBand="0" w:evenVBand="0" w:oddHBand="1" w:evenHBand="0" w:firstRowFirstColumn="0" w:firstRowLastColumn="0" w:lastRowFirstColumn="0" w:lastRowLastColumn="0"/>
-            </w:pPr>
+            <w:vAlign w:val="bottom"/>
+          </w:tcPr>
+          <w:p>
+            <w:pPr>
+              <w:cnfStyle w:val="000000100000" w:firstRow="0" w:lastRow="0" w:firstColumn="0" w:lastColumn="0" w:oddVBand="0" w:evenVBand="0" w:oddHBand="1" w:evenHBand="0" w:firstRowFirstColumn="0" w:firstRowLastColumn="0" w:lastRowFirstColumn="0" w:lastRowLastColumn="0"/>
+            </w:pPr>
+            <w:r>
+              <w:rPr>
+                <w:rFonts w:ascii="Aptos Narrow" w:hAnsi="Aptos Narrow"/>
+                <w:color w:val="000000"/>
+              </w:rPr>
+              <w:t>0.04</w:t>
+            </w:r>
           </w:p>
         </w:tc>
         <w:tc>
           <w:tcPr>
             <w:tcW w:w="1701" w:type="dxa"/>
-          </w:tcPr>
-          <w:p>
-            <w:pPr>
-              <w:cnfStyle w:val="000000100000" w:firstRow="0" w:lastRow="0" w:firstColumn="0" w:lastColumn="0" w:oddVBand="0" w:evenVBand="0" w:oddHBand="1" w:evenHBand="0" w:firstRowFirstColumn="0" w:firstRowLastColumn="0" w:lastRowFirstColumn="0" w:lastRowLastColumn="0"/>
-            </w:pPr>
+            <w:vAlign w:val="bottom"/>
+          </w:tcPr>
+          <w:p>
+            <w:pPr>
+              <w:cnfStyle w:val="000000100000" w:firstRow="0" w:lastRow="0" w:firstColumn="0" w:lastColumn="0" w:oddVBand="0" w:evenVBand="0" w:oddHBand="1" w:evenHBand="0" w:firstRowFirstColumn="0" w:firstRowLastColumn="0" w:lastRowFirstColumn="0" w:lastRowLastColumn="0"/>
+            </w:pPr>
+            <w:r>
+              <w:rPr>
+                <w:rFonts w:ascii="Aptos Narrow" w:hAnsi="Aptos Narrow"/>
+                <w:color w:val="000000"/>
+              </w:rPr>
+              <w:t>0.09</w:t>
+            </w:r>
           </w:p>
         </w:tc>
         <w:tc>
           <w:tcPr>
             <w:tcW w:w="1984" w:type="dxa"/>
-          </w:tcPr>
-          <w:p>
-            <w:pPr>
-              <w:cnfStyle w:val="000000100000" w:firstRow="0" w:lastRow="0" w:firstColumn="0" w:lastColumn="0" w:oddVBand="0" w:evenVBand="0" w:oddHBand="1" w:evenHBand="0" w:firstRowFirstColumn="0" w:firstRowLastColumn="0" w:lastRowFirstColumn="0" w:lastRowLastColumn="0"/>
-            </w:pPr>
+            <w:vAlign w:val="bottom"/>
+          </w:tcPr>
+          <w:p>
+            <w:pPr>
+              <w:cnfStyle w:val="000000100000" w:firstRow="0" w:lastRow="0" w:firstColumn="0" w:lastColumn="0" w:oddVBand="0" w:evenVBand="0" w:oddHBand="1" w:evenHBand="0" w:firstRowFirstColumn="0" w:firstRowLastColumn="0" w:lastRowFirstColumn="0" w:lastRowLastColumn="0"/>
+            </w:pPr>
+            <w:r>
+              <w:rPr>
+                <w:rFonts w:ascii="Aptos Narrow" w:hAnsi="Aptos Narrow"/>
+                <w:color w:val="000000"/>
+              </w:rPr>
+              <w:t>0.17</w:t>
+            </w:r>
           </w:p>
         </w:tc>
       </w:tr>
@@ -10143,51 +10903,91 @@
         <w:tc>
           <w:tcPr>
             <w:tcW w:w="1573" w:type="dxa"/>
+            <w:vAlign w:val="bottom"/>
           </w:tcPr>
           <w:p>
             <w:pPr>
               <w:cnfStyle w:val="000000000000" w:firstRow="0" w:lastRow="0" w:firstColumn="0" w:lastColumn="0" w:oddVBand="0" w:evenVBand="0" w:oddHBand="0" w:evenHBand="0" w:firstRowFirstColumn="0" w:firstRowLastColumn="0" w:lastRowFirstColumn="0" w:lastRowLastColumn="0"/>
             </w:pPr>
+            <w:r>
+              <w:rPr>
+                <w:rFonts w:ascii="Aptos Narrow" w:hAnsi="Aptos Narrow"/>
+                <w:color w:val="000000"/>
+              </w:rPr>
+              <w:t>0.11</w:t>
+            </w:r>
           </w:p>
         </w:tc>
         <w:tc>
           <w:tcPr>
             <w:tcW w:w="1559" w:type="dxa"/>
+            <w:vAlign w:val="bottom"/>
           </w:tcPr>
           <w:p>
             <w:pPr>
               <w:cnfStyle w:val="000000000000" w:firstRow="0" w:lastRow="0" w:firstColumn="0" w:lastColumn="0" w:oddVBand="0" w:evenVBand="0" w:oddHBand="0" w:evenHBand="0" w:firstRowFirstColumn="0" w:firstRowLastColumn="0" w:lastRowFirstColumn="0" w:lastRowLastColumn="0"/>
             </w:pPr>
+            <w:r>
+              <w:rPr>
+                <w:rFonts w:ascii="Aptos Narrow" w:hAnsi="Aptos Narrow"/>
+                <w:color w:val="000000"/>
+              </w:rPr>
+              <w:t>0.22</w:t>
+            </w:r>
           </w:p>
         </w:tc>
         <w:tc>
           <w:tcPr>
             <w:tcW w:w="1701" w:type="dxa"/>
+            <w:vAlign w:val="bottom"/>
           </w:tcPr>
           <w:p>
             <w:pPr>
               <w:cnfStyle w:val="000000000000" w:firstRow="0" w:lastRow="0" w:firstColumn="0" w:lastColumn="0" w:oddVBand="0" w:evenVBand="0" w:oddHBand="0" w:evenHBand="0" w:firstRowFirstColumn="0" w:firstRowLastColumn="0" w:lastRowFirstColumn="0" w:lastRowLastColumn="0"/>
             </w:pPr>
+            <w:r>
+              <w:rPr>
+                <w:rFonts w:ascii="Aptos Narrow" w:hAnsi="Aptos Narrow"/>
+                <w:color w:val="000000"/>
+              </w:rPr>
+              <w:t>0.02</w:t>
+            </w:r>
           </w:p>
         </w:tc>
         <w:tc>
           <w:tcPr>
             <w:tcW w:w="1701" w:type="dxa"/>
+            <w:vAlign w:val="bottom"/>
           </w:tcPr>
           <w:p>
             <w:pPr>
               <w:cnfStyle w:val="000000000000" w:firstRow="0" w:lastRow="0" w:firstColumn="0" w:lastColumn="0" w:oddVBand="0" w:evenVBand="0" w:oddHBand="0" w:evenHBand="0" w:firstRowFirstColumn="0" w:firstRowLastColumn="0" w:lastRowFirstColumn="0" w:lastRowLastColumn="0"/>
             </w:pPr>
+            <w:r>
+              <w:rPr>
+                <w:rFonts w:ascii="Aptos Narrow" w:hAnsi="Aptos Narrow"/>
+                <w:color w:val="000000"/>
+              </w:rPr>
+              <w:t>0.04</w:t>
+            </w:r>
           </w:p>
         </w:tc>
         <w:tc>
           <w:tcPr>
             <w:tcW w:w="1984" w:type="dxa"/>
+            <w:vAlign w:val="bottom"/>
           </w:tcPr>
           <w:p>
             <w:pPr>
               <w:cnfStyle w:val="000000000000" w:firstRow="0" w:lastRow="0" w:firstColumn="0" w:lastColumn="0" w:oddVBand="0" w:evenVBand="0" w:oddHBand="0" w:evenHBand="0" w:firstRowFirstColumn="0" w:firstRowLastColumn="0" w:lastRowFirstColumn="0" w:lastRowLastColumn="0"/>
             </w:pPr>
+            <w:r>
+              <w:rPr>
+                <w:rFonts w:ascii="Aptos Narrow" w:hAnsi="Aptos Narrow"/>
+                <w:color w:val="000000"/>
+              </w:rPr>
+              <w:t>0.09</w:t>
+            </w:r>
           </w:p>
         </w:tc>
       </w:tr>
@@ -10214,51 +11014,91 @@
         <w:tc>
           <w:tcPr>
             <w:tcW w:w="1573" w:type="dxa"/>
-          </w:tcPr>
-          <w:p>
-            <w:pPr>
-              <w:cnfStyle w:val="000000100000" w:firstRow="0" w:lastRow="0" w:firstColumn="0" w:lastColumn="0" w:oddVBand="0" w:evenVBand="0" w:oddHBand="1" w:evenHBand="0" w:firstRowFirstColumn="0" w:firstRowLastColumn="0" w:lastRowFirstColumn="0" w:lastRowLastColumn="0"/>
-            </w:pPr>
+            <w:vAlign w:val="bottom"/>
+          </w:tcPr>
+          <w:p>
+            <w:pPr>
+              <w:cnfStyle w:val="000000100000" w:firstRow="0" w:lastRow="0" w:firstColumn="0" w:lastColumn="0" w:oddVBand="0" w:evenVBand="0" w:oddHBand="1" w:evenHBand="0" w:firstRowFirstColumn="0" w:firstRowLastColumn="0" w:lastRowFirstColumn="0" w:lastRowLastColumn="0"/>
+            </w:pPr>
+            <w:r>
+              <w:rPr>
+                <w:rFonts w:ascii="Aptos Narrow" w:hAnsi="Aptos Narrow"/>
+                <w:color w:val="000000"/>
+              </w:rPr>
+              <w:t>0.26</w:t>
+            </w:r>
           </w:p>
         </w:tc>
         <w:tc>
           <w:tcPr>
             <w:tcW w:w="1559" w:type="dxa"/>
-          </w:tcPr>
-          <w:p>
-            <w:pPr>
-              <w:cnfStyle w:val="000000100000" w:firstRow="0" w:lastRow="0" w:firstColumn="0" w:lastColumn="0" w:oddVBand="0" w:evenVBand="0" w:oddHBand="1" w:evenHBand="0" w:firstRowFirstColumn="0" w:firstRowLastColumn="0" w:lastRowFirstColumn="0" w:lastRowLastColumn="0"/>
-            </w:pPr>
+            <w:vAlign w:val="bottom"/>
+          </w:tcPr>
+          <w:p>
+            <w:pPr>
+              <w:cnfStyle w:val="000000100000" w:firstRow="0" w:lastRow="0" w:firstColumn="0" w:lastColumn="0" w:oddVBand="0" w:evenVBand="0" w:oddHBand="1" w:evenHBand="0" w:firstRowFirstColumn="0" w:firstRowLastColumn="0" w:lastRowFirstColumn="0" w:lastRowLastColumn="0"/>
+            </w:pPr>
+            <w:r>
+              <w:rPr>
+                <w:rFonts w:ascii="Aptos Narrow" w:hAnsi="Aptos Narrow"/>
+                <w:color w:val="000000"/>
+              </w:rPr>
+              <w:t>0.51</w:t>
+            </w:r>
           </w:p>
         </w:tc>
         <w:tc>
           <w:tcPr>
             <w:tcW w:w="1701" w:type="dxa"/>
-          </w:tcPr>
-          <w:p>
-            <w:pPr>
-              <w:cnfStyle w:val="000000100000" w:firstRow="0" w:lastRow="0" w:firstColumn="0" w:lastColumn="0" w:oddVBand="0" w:evenVBand="0" w:oddHBand="1" w:evenHBand="0" w:firstRowFirstColumn="0" w:firstRowLastColumn="0" w:lastRowFirstColumn="0" w:lastRowLastColumn="0"/>
-            </w:pPr>
+            <w:vAlign w:val="bottom"/>
+          </w:tcPr>
+          <w:p>
+            <w:pPr>
+              <w:cnfStyle w:val="000000100000" w:firstRow="0" w:lastRow="0" w:firstColumn="0" w:lastColumn="0" w:oddVBand="0" w:evenVBand="0" w:oddHBand="1" w:evenHBand="0" w:firstRowFirstColumn="0" w:firstRowLastColumn="0" w:lastRowFirstColumn="0" w:lastRowLastColumn="0"/>
+            </w:pPr>
+            <w:r>
+              <w:rPr>
+                <w:rFonts w:ascii="Aptos Narrow" w:hAnsi="Aptos Narrow"/>
+                <w:color w:val="000000"/>
+              </w:rPr>
+              <w:t>0.05</w:t>
+            </w:r>
           </w:p>
         </w:tc>
         <w:tc>
           <w:tcPr>
             <w:tcW w:w="1701" w:type="dxa"/>
-          </w:tcPr>
-          <w:p>
-            <w:pPr>
-              <w:cnfStyle w:val="000000100000" w:firstRow="0" w:lastRow="0" w:firstColumn="0" w:lastColumn="0" w:oddVBand="0" w:evenVBand="0" w:oddHBand="1" w:evenHBand="0" w:firstRowFirstColumn="0" w:firstRowLastColumn="0" w:lastRowFirstColumn="0" w:lastRowLastColumn="0"/>
-            </w:pPr>
+            <w:vAlign w:val="bottom"/>
+          </w:tcPr>
+          <w:p>
+            <w:pPr>
+              <w:cnfStyle w:val="000000100000" w:firstRow="0" w:lastRow="0" w:firstColumn="0" w:lastColumn="0" w:oddVBand="0" w:evenVBand="0" w:oddHBand="1" w:evenHBand="0" w:firstRowFirstColumn="0" w:firstRowLastColumn="0" w:lastRowFirstColumn="0" w:lastRowLastColumn="0"/>
+            </w:pPr>
+            <w:r>
+              <w:rPr>
+                <w:rFonts w:ascii="Aptos Narrow" w:hAnsi="Aptos Narrow"/>
+                <w:color w:val="000000"/>
+              </w:rPr>
+              <w:t>0.1</w:t>
+            </w:r>
           </w:p>
         </w:tc>
         <w:tc>
           <w:tcPr>
             <w:tcW w:w="1984" w:type="dxa"/>
-          </w:tcPr>
-          <w:p>
-            <w:pPr>
-              <w:cnfStyle w:val="000000100000" w:firstRow="0" w:lastRow="0" w:firstColumn="0" w:lastColumn="0" w:oddVBand="0" w:evenVBand="0" w:oddHBand="1" w:evenHBand="0" w:firstRowFirstColumn="0" w:firstRowLastColumn="0" w:lastRowFirstColumn="0" w:lastRowLastColumn="0"/>
-            </w:pPr>
+            <w:vAlign w:val="bottom"/>
+          </w:tcPr>
+          <w:p>
+            <w:pPr>
+              <w:cnfStyle w:val="000000100000" w:firstRow="0" w:lastRow="0" w:firstColumn="0" w:lastColumn="0" w:oddVBand="0" w:evenVBand="0" w:oddHBand="1" w:evenHBand="0" w:firstRowFirstColumn="0" w:firstRowLastColumn="0" w:lastRowFirstColumn="0" w:lastRowLastColumn="0"/>
+            </w:pPr>
+            <w:r>
+              <w:rPr>
+                <w:rFonts w:ascii="Aptos Narrow" w:hAnsi="Aptos Narrow"/>
+                <w:color w:val="000000"/>
+              </w:rPr>
+              <w:t>0.21</w:t>
+            </w:r>
           </w:p>
         </w:tc>
       </w:tr>
@@ -10282,51 +11122,91 @@
         <w:tc>
           <w:tcPr>
             <w:tcW w:w="1573" w:type="dxa"/>
+            <w:vAlign w:val="bottom"/>
           </w:tcPr>
           <w:p>
             <w:pPr>
               <w:cnfStyle w:val="000000000000" w:firstRow="0" w:lastRow="0" w:firstColumn="0" w:lastColumn="0" w:oddVBand="0" w:evenVBand="0" w:oddHBand="0" w:evenHBand="0" w:firstRowFirstColumn="0" w:firstRowLastColumn="0" w:lastRowFirstColumn="0" w:lastRowLastColumn="0"/>
             </w:pPr>
+            <w:r>
+              <w:rPr>
+                <w:rFonts w:ascii="Aptos Narrow" w:hAnsi="Aptos Narrow"/>
+                <w:color w:val="000000"/>
+              </w:rPr>
+              <w:t>0.34</w:t>
+            </w:r>
           </w:p>
         </w:tc>
         <w:tc>
           <w:tcPr>
             <w:tcW w:w="1559" w:type="dxa"/>
+            <w:vAlign w:val="bottom"/>
           </w:tcPr>
           <w:p>
             <w:pPr>
               <w:cnfStyle w:val="000000000000" w:firstRow="0" w:lastRow="0" w:firstColumn="0" w:lastColumn="0" w:oddVBand="0" w:evenVBand="0" w:oddHBand="0" w:evenHBand="0" w:firstRowFirstColumn="0" w:firstRowLastColumn="0" w:lastRowFirstColumn="0" w:lastRowLastColumn="0"/>
             </w:pPr>
+            <w:r>
+              <w:rPr>
+                <w:rFonts w:ascii="Aptos Narrow" w:hAnsi="Aptos Narrow"/>
+                <w:color w:val="000000"/>
+              </w:rPr>
+              <w:t>0.68</w:t>
+            </w:r>
           </w:p>
         </w:tc>
         <w:tc>
           <w:tcPr>
             <w:tcW w:w="1701" w:type="dxa"/>
+            <w:vAlign w:val="bottom"/>
           </w:tcPr>
           <w:p>
             <w:pPr>
               <w:cnfStyle w:val="000000000000" w:firstRow="0" w:lastRow="0" w:firstColumn="0" w:lastColumn="0" w:oddVBand="0" w:evenVBand="0" w:oddHBand="0" w:evenHBand="0" w:firstRowFirstColumn="0" w:firstRowLastColumn="0" w:lastRowFirstColumn="0" w:lastRowLastColumn="0"/>
             </w:pPr>
+            <w:r>
+              <w:rPr>
+                <w:rFonts w:ascii="Aptos Narrow" w:hAnsi="Aptos Narrow"/>
+                <w:color w:val="000000"/>
+              </w:rPr>
+              <w:t>0.07</w:t>
+            </w:r>
           </w:p>
         </w:tc>
         <w:tc>
           <w:tcPr>
             <w:tcW w:w="1701" w:type="dxa"/>
+            <w:vAlign w:val="bottom"/>
           </w:tcPr>
           <w:p>
             <w:pPr>
               <w:cnfStyle w:val="000000000000" w:firstRow="0" w:lastRow="0" w:firstColumn="0" w:lastColumn="0" w:oddVBand="0" w:evenVBand="0" w:oddHBand="0" w:evenHBand="0" w:firstRowFirstColumn="0" w:firstRowLastColumn="0" w:lastRowFirstColumn="0" w:lastRowLastColumn="0"/>
             </w:pPr>
+            <w:r>
+              <w:rPr>
+                <w:rFonts w:ascii="Aptos Narrow" w:hAnsi="Aptos Narrow"/>
+                <w:color w:val="000000"/>
+              </w:rPr>
+              <w:t>0.14</w:t>
+            </w:r>
           </w:p>
         </w:tc>
         <w:tc>
           <w:tcPr>
             <w:tcW w:w="1984" w:type="dxa"/>
+            <w:vAlign w:val="bottom"/>
           </w:tcPr>
           <w:p>
             <w:pPr>
               <w:cnfStyle w:val="000000000000" w:firstRow="0" w:lastRow="0" w:firstColumn="0" w:lastColumn="0" w:oddVBand="0" w:evenVBand="0" w:oddHBand="0" w:evenHBand="0" w:firstRowFirstColumn="0" w:firstRowLastColumn="0" w:lastRowFirstColumn="0" w:lastRowLastColumn="0"/>
             </w:pPr>
+            <w:r>
+              <w:rPr>
+                <w:rFonts w:ascii="Aptos Narrow" w:hAnsi="Aptos Narrow"/>
+                <w:color w:val="000000"/>
+              </w:rPr>
+              <w:t>0.27</w:t>
+            </w:r>
           </w:p>
         </w:tc>
       </w:tr>
@@ -10353,51 +11233,91 @@
         <w:tc>
           <w:tcPr>
             <w:tcW w:w="1573" w:type="dxa"/>
-          </w:tcPr>
-          <w:p>
-            <w:pPr>
-              <w:cnfStyle w:val="000000100000" w:firstRow="0" w:lastRow="0" w:firstColumn="0" w:lastColumn="0" w:oddVBand="0" w:evenVBand="0" w:oddHBand="1" w:evenHBand="0" w:firstRowFirstColumn="0" w:firstRowLastColumn="0" w:lastRowFirstColumn="0" w:lastRowLastColumn="0"/>
-            </w:pPr>
+            <w:vAlign w:val="bottom"/>
+          </w:tcPr>
+          <w:p>
+            <w:pPr>
+              <w:cnfStyle w:val="000000100000" w:firstRow="0" w:lastRow="0" w:firstColumn="0" w:lastColumn="0" w:oddVBand="0" w:evenVBand="0" w:oddHBand="1" w:evenHBand="0" w:firstRowFirstColumn="0" w:firstRowLastColumn="0" w:lastRowFirstColumn="0" w:lastRowLastColumn="0"/>
+            </w:pPr>
+            <w:r>
+              <w:rPr>
+                <w:rFonts w:ascii="Aptos Narrow" w:hAnsi="Aptos Narrow"/>
+                <w:color w:val="000000"/>
+              </w:rPr>
+              <w:t>0.26</w:t>
+            </w:r>
           </w:p>
         </w:tc>
         <w:tc>
           <w:tcPr>
             <w:tcW w:w="1559" w:type="dxa"/>
-          </w:tcPr>
-          <w:p>
-            <w:pPr>
-              <w:cnfStyle w:val="000000100000" w:firstRow="0" w:lastRow="0" w:firstColumn="0" w:lastColumn="0" w:oddVBand="0" w:evenVBand="0" w:oddHBand="1" w:evenHBand="0" w:firstRowFirstColumn="0" w:firstRowLastColumn="0" w:lastRowFirstColumn="0" w:lastRowLastColumn="0"/>
-            </w:pPr>
+            <w:vAlign w:val="bottom"/>
+          </w:tcPr>
+          <w:p>
+            <w:pPr>
+              <w:cnfStyle w:val="000000100000" w:firstRow="0" w:lastRow="0" w:firstColumn="0" w:lastColumn="0" w:oddVBand="0" w:evenVBand="0" w:oddHBand="1" w:evenHBand="0" w:firstRowFirstColumn="0" w:firstRowLastColumn="0" w:lastRowFirstColumn="0" w:lastRowLastColumn="0"/>
+            </w:pPr>
+            <w:r>
+              <w:rPr>
+                <w:rFonts w:ascii="Aptos Narrow" w:hAnsi="Aptos Narrow"/>
+                <w:color w:val="000000"/>
+              </w:rPr>
+              <w:t>0.53</w:t>
+            </w:r>
           </w:p>
         </w:tc>
         <w:tc>
           <w:tcPr>
             <w:tcW w:w="1701" w:type="dxa"/>
-          </w:tcPr>
-          <w:p>
-            <w:pPr>
-              <w:cnfStyle w:val="000000100000" w:firstRow="0" w:lastRow="0" w:firstColumn="0" w:lastColumn="0" w:oddVBand="0" w:evenVBand="0" w:oddHBand="1" w:evenHBand="0" w:firstRowFirstColumn="0" w:firstRowLastColumn="0" w:lastRowFirstColumn="0" w:lastRowLastColumn="0"/>
-            </w:pPr>
+            <w:vAlign w:val="bottom"/>
+          </w:tcPr>
+          <w:p>
+            <w:pPr>
+              <w:cnfStyle w:val="000000100000" w:firstRow="0" w:lastRow="0" w:firstColumn="0" w:lastColumn="0" w:oddVBand="0" w:evenVBand="0" w:oddHBand="1" w:evenHBand="0" w:firstRowFirstColumn="0" w:firstRowLastColumn="0" w:lastRowFirstColumn="0" w:lastRowLastColumn="0"/>
+            </w:pPr>
+            <w:r>
+              <w:rPr>
+                <w:rFonts w:ascii="Aptos Narrow" w:hAnsi="Aptos Narrow"/>
+                <w:color w:val="000000"/>
+              </w:rPr>
+              <w:t>0.05</w:t>
+            </w:r>
           </w:p>
         </w:tc>
         <w:tc>
           <w:tcPr>
             <w:tcW w:w="1701" w:type="dxa"/>
-          </w:tcPr>
-          <w:p>
-            <w:pPr>
-              <w:cnfStyle w:val="000000100000" w:firstRow="0" w:lastRow="0" w:firstColumn="0" w:lastColumn="0" w:oddVBand="0" w:evenVBand="0" w:oddHBand="1" w:evenHBand="0" w:firstRowFirstColumn="0" w:firstRowLastColumn="0" w:lastRowFirstColumn="0" w:lastRowLastColumn="0"/>
-            </w:pPr>
+            <w:vAlign w:val="bottom"/>
+          </w:tcPr>
+          <w:p>
+            <w:pPr>
+              <w:cnfStyle w:val="000000100000" w:firstRow="0" w:lastRow="0" w:firstColumn="0" w:lastColumn="0" w:oddVBand="0" w:evenVBand="0" w:oddHBand="1" w:evenHBand="0" w:firstRowFirstColumn="0" w:firstRowLastColumn="0" w:lastRowFirstColumn="0" w:lastRowLastColumn="0"/>
+            </w:pPr>
+            <w:r>
+              <w:rPr>
+                <w:rFonts w:ascii="Aptos Narrow" w:hAnsi="Aptos Narrow"/>
+                <w:color w:val="000000"/>
+              </w:rPr>
+              <w:t>0.11</w:t>
+            </w:r>
           </w:p>
         </w:tc>
         <w:tc>
           <w:tcPr>
             <w:tcW w:w="1984" w:type="dxa"/>
-          </w:tcPr>
-          <w:p>
-            <w:pPr>
-              <w:cnfStyle w:val="000000100000" w:firstRow="0" w:lastRow="0" w:firstColumn="0" w:lastColumn="0" w:oddVBand="0" w:evenVBand="0" w:oddHBand="1" w:evenHBand="0" w:firstRowFirstColumn="0" w:firstRowLastColumn="0" w:lastRowFirstColumn="0" w:lastRowLastColumn="0"/>
-            </w:pPr>
+            <w:vAlign w:val="bottom"/>
+          </w:tcPr>
+          <w:p>
+            <w:pPr>
+              <w:cnfStyle w:val="000000100000" w:firstRow="0" w:lastRow="0" w:firstColumn="0" w:lastColumn="0" w:oddVBand="0" w:evenVBand="0" w:oddHBand="1" w:evenHBand="0" w:firstRowFirstColumn="0" w:firstRowLastColumn="0" w:lastRowFirstColumn="0" w:lastRowLastColumn="0"/>
+            </w:pPr>
+            <w:r>
+              <w:rPr>
+                <w:rFonts w:ascii="Aptos Narrow" w:hAnsi="Aptos Narrow"/>
+                <w:color w:val="000000"/>
+              </w:rPr>
+              <w:t>0.21</w:t>
+            </w:r>
           </w:p>
         </w:tc>
       </w:tr>
@@ -10421,51 +11341,91 @@
         <w:tc>
           <w:tcPr>
             <w:tcW w:w="1573" w:type="dxa"/>
+            <w:vAlign w:val="bottom"/>
           </w:tcPr>
           <w:p>
             <w:pPr>
               <w:cnfStyle w:val="000000000000" w:firstRow="0" w:lastRow="0" w:firstColumn="0" w:lastColumn="0" w:oddVBand="0" w:evenVBand="0" w:oddHBand="0" w:evenHBand="0" w:firstRowFirstColumn="0" w:firstRowLastColumn="0" w:lastRowFirstColumn="0" w:lastRowLastColumn="0"/>
             </w:pPr>
+            <w:r>
+              <w:rPr>
+                <w:rFonts w:ascii="Aptos Narrow" w:hAnsi="Aptos Narrow"/>
+                <w:color w:val="000000"/>
+              </w:rPr>
+              <w:t>0.24</w:t>
+            </w:r>
           </w:p>
         </w:tc>
         <w:tc>
           <w:tcPr>
             <w:tcW w:w="1559" w:type="dxa"/>
+            <w:vAlign w:val="bottom"/>
           </w:tcPr>
           <w:p>
             <w:pPr>
               <w:cnfStyle w:val="000000000000" w:firstRow="0" w:lastRow="0" w:firstColumn="0" w:lastColumn="0" w:oddVBand="0" w:evenVBand="0" w:oddHBand="0" w:evenHBand="0" w:firstRowFirstColumn="0" w:firstRowLastColumn="0" w:lastRowFirstColumn="0" w:lastRowLastColumn="0"/>
             </w:pPr>
+            <w:r>
+              <w:rPr>
+                <w:rFonts w:ascii="Aptos Narrow" w:hAnsi="Aptos Narrow"/>
+                <w:color w:val="000000"/>
+              </w:rPr>
+              <w:t>0.48</w:t>
+            </w:r>
           </w:p>
         </w:tc>
         <w:tc>
           <w:tcPr>
             <w:tcW w:w="1701" w:type="dxa"/>
+            <w:vAlign w:val="bottom"/>
           </w:tcPr>
           <w:p>
             <w:pPr>
               <w:cnfStyle w:val="000000000000" w:firstRow="0" w:lastRow="0" w:firstColumn="0" w:lastColumn="0" w:oddVBand="0" w:evenVBand="0" w:oddHBand="0" w:evenHBand="0" w:firstRowFirstColumn="0" w:firstRowLastColumn="0" w:lastRowFirstColumn="0" w:lastRowLastColumn="0"/>
             </w:pPr>
+            <w:r>
+              <w:rPr>
+                <w:rFonts w:ascii="Aptos Narrow" w:hAnsi="Aptos Narrow"/>
+                <w:color w:val="000000"/>
+              </w:rPr>
+              <w:t>0.05</w:t>
+            </w:r>
           </w:p>
         </w:tc>
         <w:tc>
           <w:tcPr>
             <w:tcW w:w="1701" w:type="dxa"/>
+            <w:vAlign w:val="bottom"/>
           </w:tcPr>
           <w:p>
             <w:pPr>
               <w:cnfStyle w:val="000000000000" w:firstRow="0" w:lastRow="0" w:firstColumn="0" w:lastColumn="0" w:oddVBand="0" w:evenVBand="0" w:oddHBand="0" w:evenHBand="0" w:firstRowFirstColumn="0" w:firstRowLastColumn="0" w:lastRowFirstColumn="0" w:lastRowLastColumn="0"/>
             </w:pPr>
+            <w:r>
+              <w:rPr>
+                <w:rFonts w:ascii="Aptos Narrow" w:hAnsi="Aptos Narrow"/>
+                <w:color w:val="000000"/>
+              </w:rPr>
+              <w:t>0.1</w:t>
+            </w:r>
           </w:p>
         </w:tc>
         <w:tc>
           <w:tcPr>
             <w:tcW w:w="1984" w:type="dxa"/>
+            <w:vAlign w:val="bottom"/>
           </w:tcPr>
           <w:p>
             <w:pPr>
               <w:cnfStyle w:val="000000000000" w:firstRow="0" w:lastRow="0" w:firstColumn="0" w:lastColumn="0" w:oddVBand="0" w:evenVBand="0" w:oddHBand="0" w:evenHBand="0" w:firstRowFirstColumn="0" w:firstRowLastColumn="0" w:lastRowFirstColumn="0" w:lastRowLastColumn="0"/>
             </w:pPr>
+            <w:r>
+              <w:rPr>
+                <w:rFonts w:ascii="Aptos Narrow" w:hAnsi="Aptos Narrow"/>
+                <w:color w:val="000000"/>
+              </w:rPr>
+              <w:t>0.19</w:t>
+            </w:r>
           </w:p>
         </w:tc>
       </w:tr>
@@ -10492,51 +11452,91 @@
         <w:tc>
           <w:tcPr>
             <w:tcW w:w="1573" w:type="dxa"/>
-          </w:tcPr>
-          <w:p>
-            <w:pPr>
-              <w:cnfStyle w:val="000000100000" w:firstRow="0" w:lastRow="0" w:firstColumn="0" w:lastColumn="0" w:oddVBand="0" w:evenVBand="0" w:oddHBand="1" w:evenHBand="0" w:firstRowFirstColumn="0" w:firstRowLastColumn="0" w:lastRowFirstColumn="0" w:lastRowLastColumn="0"/>
-            </w:pPr>
+            <w:vAlign w:val="bottom"/>
+          </w:tcPr>
+          <w:p>
+            <w:pPr>
+              <w:cnfStyle w:val="000000100000" w:firstRow="0" w:lastRow="0" w:firstColumn="0" w:lastColumn="0" w:oddVBand="0" w:evenVBand="0" w:oddHBand="1" w:evenHBand="0" w:firstRowFirstColumn="0" w:firstRowLastColumn="0" w:lastRowFirstColumn="0" w:lastRowLastColumn="0"/>
+            </w:pPr>
+            <w:r>
+              <w:rPr>
+                <w:rFonts w:ascii="Aptos Narrow" w:hAnsi="Aptos Narrow"/>
+                <w:color w:val="000000"/>
+              </w:rPr>
+              <w:t>0.25</w:t>
+            </w:r>
           </w:p>
         </w:tc>
         <w:tc>
           <w:tcPr>
             <w:tcW w:w="1559" w:type="dxa"/>
-          </w:tcPr>
-          <w:p>
-            <w:pPr>
-              <w:cnfStyle w:val="000000100000" w:firstRow="0" w:lastRow="0" w:firstColumn="0" w:lastColumn="0" w:oddVBand="0" w:evenVBand="0" w:oddHBand="1" w:evenHBand="0" w:firstRowFirstColumn="0" w:firstRowLastColumn="0" w:lastRowFirstColumn="0" w:lastRowLastColumn="0"/>
-            </w:pPr>
+            <w:vAlign w:val="bottom"/>
+          </w:tcPr>
+          <w:p>
+            <w:pPr>
+              <w:cnfStyle w:val="000000100000" w:firstRow="0" w:lastRow="0" w:firstColumn="0" w:lastColumn="0" w:oddVBand="0" w:evenVBand="0" w:oddHBand="1" w:evenHBand="0" w:firstRowFirstColumn="0" w:firstRowLastColumn="0" w:lastRowFirstColumn="0" w:lastRowLastColumn="0"/>
+            </w:pPr>
+            <w:r>
+              <w:rPr>
+                <w:rFonts w:ascii="Aptos Narrow" w:hAnsi="Aptos Narrow"/>
+                <w:color w:val="000000"/>
+              </w:rPr>
+              <w:t>0.49</w:t>
+            </w:r>
           </w:p>
         </w:tc>
         <w:tc>
           <w:tcPr>
             <w:tcW w:w="1701" w:type="dxa"/>
-          </w:tcPr>
-          <w:p>
-            <w:pPr>
-              <w:cnfStyle w:val="000000100000" w:firstRow="0" w:lastRow="0" w:firstColumn="0" w:lastColumn="0" w:oddVBand="0" w:evenVBand="0" w:oddHBand="1" w:evenHBand="0" w:firstRowFirstColumn="0" w:firstRowLastColumn="0" w:lastRowFirstColumn="0" w:lastRowLastColumn="0"/>
-            </w:pPr>
+            <w:vAlign w:val="bottom"/>
+          </w:tcPr>
+          <w:p>
+            <w:pPr>
+              <w:cnfStyle w:val="000000100000" w:firstRow="0" w:lastRow="0" w:firstColumn="0" w:lastColumn="0" w:oddVBand="0" w:evenVBand="0" w:oddHBand="1" w:evenHBand="0" w:firstRowFirstColumn="0" w:firstRowLastColumn="0" w:lastRowFirstColumn="0" w:lastRowLastColumn="0"/>
+            </w:pPr>
+            <w:r>
+              <w:rPr>
+                <w:rFonts w:ascii="Aptos Narrow" w:hAnsi="Aptos Narrow"/>
+                <w:color w:val="000000"/>
+              </w:rPr>
+              <w:t>0.05</w:t>
+            </w:r>
           </w:p>
         </w:tc>
         <w:tc>
           <w:tcPr>
             <w:tcW w:w="1701" w:type="dxa"/>
-          </w:tcPr>
-          <w:p>
-            <w:pPr>
-              <w:cnfStyle w:val="000000100000" w:firstRow="0" w:lastRow="0" w:firstColumn="0" w:lastColumn="0" w:oddVBand="0" w:evenVBand="0" w:oddHBand="1" w:evenHBand="0" w:firstRowFirstColumn="0" w:firstRowLastColumn="0" w:lastRowFirstColumn="0" w:lastRowLastColumn="0"/>
-            </w:pPr>
+            <w:vAlign w:val="bottom"/>
+          </w:tcPr>
+          <w:p>
+            <w:pPr>
+              <w:cnfStyle w:val="000000100000" w:firstRow="0" w:lastRow="0" w:firstColumn="0" w:lastColumn="0" w:oddVBand="0" w:evenVBand="0" w:oddHBand="1" w:evenHBand="0" w:firstRowFirstColumn="0" w:firstRowLastColumn="0" w:lastRowFirstColumn="0" w:lastRowLastColumn="0"/>
+            </w:pPr>
+            <w:r>
+              <w:rPr>
+                <w:rFonts w:ascii="Aptos Narrow" w:hAnsi="Aptos Narrow"/>
+                <w:color w:val="000000"/>
+              </w:rPr>
+              <w:t>0.1</w:t>
+            </w:r>
           </w:p>
         </w:tc>
         <w:tc>
           <w:tcPr>
             <w:tcW w:w="1984" w:type="dxa"/>
-          </w:tcPr>
-          <w:p>
-            <w:pPr>
-              <w:cnfStyle w:val="000000100000" w:firstRow="0" w:lastRow="0" w:firstColumn="0" w:lastColumn="0" w:oddVBand="0" w:evenVBand="0" w:oddHBand="1" w:evenHBand="0" w:firstRowFirstColumn="0" w:firstRowLastColumn="0" w:lastRowFirstColumn="0" w:lastRowLastColumn="0"/>
-            </w:pPr>
+            <w:vAlign w:val="bottom"/>
+          </w:tcPr>
+          <w:p>
+            <w:pPr>
+              <w:cnfStyle w:val="000000100000" w:firstRow="0" w:lastRow="0" w:firstColumn="0" w:lastColumn="0" w:oddVBand="0" w:evenVBand="0" w:oddHBand="1" w:evenHBand="0" w:firstRowFirstColumn="0" w:firstRowLastColumn="0" w:lastRowFirstColumn="0" w:lastRowLastColumn="0"/>
+            </w:pPr>
+            <w:r>
+              <w:rPr>
+                <w:rFonts w:ascii="Aptos Narrow" w:hAnsi="Aptos Narrow"/>
+                <w:color w:val="000000"/>
+              </w:rPr>
+              <w:t>0.2</w:t>
+            </w:r>
           </w:p>
         </w:tc>
       </w:tr>
@@ -10560,51 +11560,91 @@
         <w:tc>
           <w:tcPr>
             <w:tcW w:w="1573" w:type="dxa"/>
+            <w:vAlign w:val="bottom"/>
           </w:tcPr>
           <w:p>
             <w:pPr>
               <w:cnfStyle w:val="000000000000" w:firstRow="0" w:lastRow="0" w:firstColumn="0" w:lastColumn="0" w:oddVBand="0" w:evenVBand="0" w:oddHBand="0" w:evenHBand="0" w:firstRowFirstColumn="0" w:firstRowLastColumn="0" w:lastRowFirstColumn="0" w:lastRowLastColumn="0"/>
             </w:pPr>
+            <w:r>
+              <w:rPr>
+                <w:rFonts w:ascii="Aptos Narrow" w:hAnsi="Aptos Narrow"/>
+                <w:color w:val="000000"/>
+              </w:rPr>
+              <w:t>0.04</w:t>
+            </w:r>
           </w:p>
         </w:tc>
         <w:tc>
           <w:tcPr>
             <w:tcW w:w="1559" w:type="dxa"/>
+            <w:vAlign w:val="bottom"/>
           </w:tcPr>
           <w:p>
             <w:pPr>
               <w:cnfStyle w:val="000000000000" w:firstRow="0" w:lastRow="0" w:firstColumn="0" w:lastColumn="0" w:oddVBand="0" w:evenVBand="0" w:oddHBand="0" w:evenHBand="0" w:firstRowFirstColumn="0" w:firstRowLastColumn="0" w:lastRowFirstColumn="0" w:lastRowLastColumn="0"/>
             </w:pPr>
+            <w:r>
+              <w:rPr>
+                <w:rFonts w:ascii="Aptos Narrow" w:hAnsi="Aptos Narrow"/>
+                <w:color w:val="000000"/>
+              </w:rPr>
+              <w:t>0.07</w:t>
+            </w:r>
           </w:p>
         </w:tc>
         <w:tc>
           <w:tcPr>
             <w:tcW w:w="1701" w:type="dxa"/>
+            <w:vAlign w:val="bottom"/>
           </w:tcPr>
           <w:p>
             <w:pPr>
               <w:cnfStyle w:val="000000000000" w:firstRow="0" w:lastRow="0" w:firstColumn="0" w:lastColumn="0" w:oddVBand="0" w:evenVBand="0" w:oddHBand="0" w:evenHBand="0" w:firstRowFirstColumn="0" w:firstRowLastColumn="0" w:lastRowFirstColumn="0" w:lastRowLastColumn="0"/>
             </w:pPr>
+            <w:r>
+              <w:rPr>
+                <w:rFonts w:ascii="Aptos Narrow" w:hAnsi="Aptos Narrow"/>
+                <w:color w:val="000000"/>
+              </w:rPr>
+              <w:t>0.01</w:t>
+            </w:r>
           </w:p>
         </w:tc>
         <w:tc>
           <w:tcPr>
             <w:tcW w:w="1701" w:type="dxa"/>
+            <w:vAlign w:val="bottom"/>
           </w:tcPr>
           <w:p>
             <w:pPr>
               <w:cnfStyle w:val="000000000000" w:firstRow="0" w:lastRow="0" w:firstColumn="0" w:lastColumn="0" w:oddVBand="0" w:evenVBand="0" w:oddHBand="0" w:evenHBand="0" w:firstRowFirstColumn="0" w:firstRowLastColumn="0" w:lastRowFirstColumn="0" w:lastRowLastColumn="0"/>
             </w:pPr>
+            <w:r>
+              <w:rPr>
+                <w:rFonts w:ascii="Aptos Narrow" w:hAnsi="Aptos Narrow"/>
+                <w:color w:val="000000"/>
+              </w:rPr>
+              <w:t>0.01</w:t>
+            </w:r>
           </w:p>
         </w:tc>
         <w:tc>
           <w:tcPr>
             <w:tcW w:w="1984" w:type="dxa"/>
+            <w:vAlign w:val="bottom"/>
           </w:tcPr>
           <w:p>
             <w:pPr>
               <w:cnfStyle w:val="000000000000" w:firstRow="0" w:lastRow="0" w:firstColumn="0" w:lastColumn="0" w:oddVBand="0" w:evenVBand="0" w:oddHBand="0" w:evenHBand="0" w:firstRowFirstColumn="0" w:firstRowLastColumn="0" w:lastRowFirstColumn="0" w:lastRowLastColumn="0"/>
             </w:pPr>
+            <w:r>
+              <w:rPr>
+                <w:rFonts w:ascii="Aptos Narrow" w:hAnsi="Aptos Narrow"/>
+                <w:color w:val="000000"/>
+              </w:rPr>
+              <w:t>0.03</w:t>
+            </w:r>
           </w:p>
         </w:tc>
       </w:tr>
@@ -10631,51 +11671,91 @@
         <w:tc>
           <w:tcPr>
             <w:tcW w:w="1573" w:type="dxa"/>
-          </w:tcPr>
-          <w:p>
-            <w:pPr>
-              <w:cnfStyle w:val="000000100000" w:firstRow="0" w:lastRow="0" w:firstColumn="0" w:lastColumn="0" w:oddVBand="0" w:evenVBand="0" w:oddHBand="1" w:evenHBand="0" w:firstRowFirstColumn="0" w:firstRowLastColumn="0" w:lastRowFirstColumn="0" w:lastRowLastColumn="0"/>
-            </w:pPr>
+            <w:vAlign w:val="bottom"/>
+          </w:tcPr>
+          <w:p>
+            <w:pPr>
+              <w:cnfStyle w:val="000000100000" w:firstRow="0" w:lastRow="0" w:firstColumn="0" w:lastColumn="0" w:oddVBand="0" w:evenVBand="0" w:oddHBand="1" w:evenHBand="0" w:firstRowFirstColumn="0" w:firstRowLastColumn="0" w:lastRowFirstColumn="0" w:lastRowLastColumn="0"/>
+            </w:pPr>
+            <w:r>
+              <w:rPr>
+                <w:rFonts w:ascii="Aptos Narrow" w:hAnsi="Aptos Narrow"/>
+                <w:color w:val="000000"/>
+              </w:rPr>
+              <w:t>0.31</w:t>
+            </w:r>
           </w:p>
         </w:tc>
         <w:tc>
           <w:tcPr>
             <w:tcW w:w="1559" w:type="dxa"/>
-          </w:tcPr>
-          <w:p>
-            <w:pPr>
-              <w:cnfStyle w:val="000000100000" w:firstRow="0" w:lastRow="0" w:firstColumn="0" w:lastColumn="0" w:oddVBand="0" w:evenVBand="0" w:oddHBand="1" w:evenHBand="0" w:firstRowFirstColumn="0" w:firstRowLastColumn="0" w:lastRowFirstColumn="0" w:lastRowLastColumn="0"/>
-            </w:pPr>
+            <w:vAlign w:val="bottom"/>
+          </w:tcPr>
+          <w:p>
+            <w:pPr>
+              <w:cnfStyle w:val="000000100000" w:firstRow="0" w:lastRow="0" w:firstColumn="0" w:lastColumn="0" w:oddVBand="0" w:evenVBand="0" w:oddHBand="1" w:evenHBand="0" w:firstRowFirstColumn="0" w:firstRowLastColumn="0" w:lastRowFirstColumn="0" w:lastRowLastColumn="0"/>
+            </w:pPr>
+            <w:r>
+              <w:rPr>
+                <w:rFonts w:ascii="Aptos Narrow" w:hAnsi="Aptos Narrow"/>
+                <w:color w:val="000000"/>
+              </w:rPr>
+              <w:t>0.62</w:t>
+            </w:r>
           </w:p>
         </w:tc>
         <w:tc>
           <w:tcPr>
             <w:tcW w:w="1701" w:type="dxa"/>
-          </w:tcPr>
-          <w:p>
-            <w:pPr>
-              <w:cnfStyle w:val="000000100000" w:firstRow="0" w:lastRow="0" w:firstColumn="0" w:lastColumn="0" w:oddVBand="0" w:evenVBand="0" w:oddHBand="1" w:evenHBand="0" w:firstRowFirstColumn="0" w:firstRowLastColumn="0" w:lastRowFirstColumn="0" w:lastRowLastColumn="0"/>
-            </w:pPr>
+            <w:vAlign w:val="bottom"/>
+          </w:tcPr>
+          <w:p>
+            <w:pPr>
+              <w:cnfStyle w:val="000000100000" w:firstRow="0" w:lastRow="0" w:firstColumn="0" w:lastColumn="0" w:oddVBand="0" w:evenVBand="0" w:oddHBand="1" w:evenHBand="0" w:firstRowFirstColumn="0" w:firstRowLastColumn="0" w:lastRowFirstColumn="0" w:lastRowLastColumn="0"/>
+            </w:pPr>
+            <w:r>
+              <w:rPr>
+                <w:rFonts w:ascii="Aptos Narrow" w:hAnsi="Aptos Narrow"/>
+                <w:color w:val="000000"/>
+              </w:rPr>
+              <w:t>0.06</w:t>
+            </w:r>
           </w:p>
         </w:tc>
         <w:tc>
           <w:tcPr>
             <w:tcW w:w="1701" w:type="dxa"/>
-          </w:tcPr>
-          <w:p>
-            <w:pPr>
-              <w:cnfStyle w:val="000000100000" w:firstRow="0" w:lastRow="0" w:firstColumn="0" w:lastColumn="0" w:oddVBand="0" w:evenVBand="0" w:oddHBand="1" w:evenHBand="0" w:firstRowFirstColumn="0" w:firstRowLastColumn="0" w:lastRowFirstColumn="0" w:lastRowLastColumn="0"/>
-            </w:pPr>
+            <w:vAlign w:val="bottom"/>
+          </w:tcPr>
+          <w:p>
+            <w:pPr>
+              <w:cnfStyle w:val="000000100000" w:firstRow="0" w:lastRow="0" w:firstColumn="0" w:lastColumn="0" w:oddVBand="0" w:evenVBand="0" w:oddHBand="1" w:evenHBand="0" w:firstRowFirstColumn="0" w:firstRowLastColumn="0" w:lastRowFirstColumn="0" w:lastRowLastColumn="0"/>
+            </w:pPr>
+            <w:r>
+              <w:rPr>
+                <w:rFonts w:ascii="Aptos Narrow" w:hAnsi="Aptos Narrow"/>
+                <w:color w:val="000000"/>
+              </w:rPr>
+              <w:t>0.12</w:t>
+            </w:r>
           </w:p>
         </w:tc>
         <w:tc>
           <w:tcPr>
             <w:tcW w:w="1984" w:type="dxa"/>
-          </w:tcPr>
-          <w:p>
-            <w:pPr>
-              <w:cnfStyle w:val="000000100000" w:firstRow="0" w:lastRow="0" w:firstColumn="0" w:lastColumn="0" w:oddVBand="0" w:evenVBand="0" w:oddHBand="1" w:evenHBand="0" w:firstRowFirstColumn="0" w:firstRowLastColumn="0" w:lastRowFirstColumn="0" w:lastRowLastColumn="0"/>
-            </w:pPr>
+            <w:vAlign w:val="bottom"/>
+          </w:tcPr>
+          <w:p>
+            <w:pPr>
+              <w:cnfStyle w:val="000000100000" w:firstRow="0" w:lastRow="0" w:firstColumn="0" w:lastColumn="0" w:oddVBand="0" w:evenVBand="0" w:oddHBand="1" w:evenHBand="0" w:firstRowFirstColumn="0" w:firstRowLastColumn="0" w:lastRowFirstColumn="0" w:lastRowLastColumn="0"/>
+            </w:pPr>
+            <w:r>
+              <w:rPr>
+                <w:rFonts w:ascii="Aptos Narrow" w:hAnsi="Aptos Narrow"/>
+                <w:color w:val="000000"/>
+              </w:rPr>
+              <w:t>0.25</w:t>
+            </w:r>
           </w:p>
         </w:tc>
       </w:tr>
@@ -10685,7 +11765,7 @@
       <w:pPr>
         <w:pStyle w:val="Heading2"/>
       </w:pPr>
-      <w:bookmarkStart w:id="25" w:name="_Toc243392880"/>
+      <w:bookmarkStart w:id="25" w:name="_Toc243393769"/>
       <w:r>
         <w:t>4.</w:t>
       </w:r>
@@ -10699,7 +11779,7 @@
       <w:pPr>
         <w:pStyle w:val="Heading2"/>
       </w:pPr>
-      <w:bookmarkStart w:id="26" w:name="_Toc243392881"/>
+      <w:bookmarkStart w:id="26" w:name="_Toc243393770"/>
       <w:r>
         <w:t>4.</w:t>
       </w:r>
@@ -10713,7 +11793,7 @@
       <w:pPr>
         <w:pStyle w:val="Heading2"/>
       </w:pPr>
-      <w:bookmarkStart w:id="27" w:name="_Toc243392882"/>
+      <w:bookmarkStart w:id="27" w:name="_Toc243393771"/>
       <w:r>
         <w:t>4.</w:t>
       </w:r>
@@ -10727,7 +11807,7 @@
       <w:pPr>
         <w:pStyle w:val="Heading1"/>
       </w:pPr>
-      <w:bookmarkStart w:id="28" w:name="_Toc243392883"/>
+      <w:bookmarkStart w:id="28" w:name="_Toc243393772"/>
       <w:r>
         <w:t>5.</w:t>
       </w:r>
@@ -10740,7 +11820,7 @@
       <w:pPr>
         <w:pStyle w:val="Heading2"/>
       </w:pPr>
-      <w:bookmarkStart w:id="29" w:name="_Toc243392884"/>
+      <w:bookmarkStart w:id="29" w:name="_Toc243393773"/>
       <w:r>
         <w:t>5.</w:t>
       </w:r>
@@ -10754,7 +11834,7 @@
       <w:pPr>
         <w:pStyle w:val="Heading2"/>
       </w:pPr>
-      <w:bookmarkStart w:id="30" w:name="_Toc243392885"/>
+      <w:bookmarkStart w:id="30" w:name="_Toc243393774"/>
       <w:r>
         <w:t>5.</w:t>
       </w:r>
@@ -10768,7 +11848,7 @@
       <w:pPr>
         <w:pStyle w:val="Heading2"/>
       </w:pPr>
-      <w:bookmarkStart w:id="31" w:name="_Toc243392886"/>
+      <w:bookmarkStart w:id="31" w:name="_Toc243393775"/>
       <w:r>
         <w:t>5.</w:t>
       </w:r>
@@ -10782,7 +11862,7 @@
       <w:pPr>
         <w:pStyle w:val="Heading2"/>
       </w:pPr>
-      <w:bookmarkStart w:id="32" w:name="_Toc243392887"/>
+      <w:bookmarkStart w:id="32" w:name="_Toc243393776"/>
       <w:r>
         <w:t>5.</w:t>
       </w:r>
@@ -10796,7 +11876,7 @@
       <w:pPr>
         <w:pStyle w:val="Heading1"/>
       </w:pPr>
-      <w:bookmarkStart w:id="33" w:name="_Toc243392888"/>
+      <w:bookmarkStart w:id="33" w:name="_Toc243393777"/>
       <w:r>
         <w:t>6.</w:t>
       </w:r>
@@ -10807,7 +11887,7 @@
     </w:p>
     <w:p/>
     <w:p/>
-    <w:bookmarkStart w:id="34" w:name="_Toc243392889" w:displacedByCustomXml="next"/>
+    <w:bookmarkStart w:id="34" w:name="_Toc243393778" w:displacedByCustomXml="next"/>
     <w:bookmarkStart w:id="35" w:name="_Toc242694108" w:displacedByCustomXml="next"/>
     <w:sdt>
       <w:sdtPr>

</xml_diff>

<commit_message>
updated home range summary to use adehabitatHR
</commit_message>
<xml_diff>
--- a/Green Tree Snake Movement and Home Range Analysis.docx
+++ b/Green Tree Snake Movement and Home Range Analysis.docx
@@ -8834,7 +8834,7 @@
                 <w:rFonts w:ascii="Aptos Narrow" w:hAnsi="Aptos Narrow"/>
                 <w:color w:val="000000"/>
               </w:rPr>
-              <w:t>1.45</w:t>
+              <w:t>5.07</w:t>
             </w:r>
           </w:p>
         </w:tc>
@@ -8852,7 +8852,7 @@
                 <w:rFonts w:ascii="Aptos Narrow" w:hAnsi="Aptos Narrow"/>
                 <w:color w:val="000000"/>
               </w:rPr>
-              <w:t>2.9</w:t>
+              <w:t>12.95</w:t>
             </w:r>
           </w:p>
         </w:tc>
@@ -8870,7 +8870,7 @@
                 <w:rFonts w:ascii="Aptos Narrow" w:hAnsi="Aptos Narrow"/>
                 <w:color w:val="000000"/>
               </w:rPr>
-              <w:t>0.29</w:t>
+              <w:t>3.5</w:t>
             </w:r>
           </w:p>
         </w:tc>
@@ -8888,7 +8888,7 @@
                 <w:rFonts w:ascii="Aptos Narrow" w:hAnsi="Aptos Narrow"/>
                 <w:color w:val="000000"/>
               </w:rPr>
-              <w:t>0.58</w:t>
+              <w:t>7.44</w:t>
             </w:r>
           </w:p>
         </w:tc>
@@ -8906,7 +8906,7 @@
                 <w:rFonts w:ascii="Aptos Narrow" w:hAnsi="Aptos Narrow"/>
                 <w:color w:val="000000"/>
               </w:rPr>
-              <w:t>1.16</w:t>
+              <w:t>17.04</w:t>
             </w:r>
           </w:p>
         </w:tc>
@@ -8942,7 +8942,7 @@
                 <w:rFonts w:ascii="Aptos Narrow" w:hAnsi="Aptos Narrow"/>
                 <w:color w:val="000000"/>
               </w:rPr>
-              <w:t>0.74</w:t>
+              <w:t>6.06</w:t>
             </w:r>
           </w:p>
         </w:tc>
@@ -8960,7 +8960,7 @@
                 <w:rFonts w:ascii="Aptos Narrow" w:hAnsi="Aptos Narrow"/>
                 <w:color w:val="000000"/>
               </w:rPr>
-              <w:t>1.47</w:t>
+              <w:t>11.99</w:t>
             </w:r>
           </w:p>
         </w:tc>
@@ -8978,7 +8978,7 @@
                 <w:rFonts w:ascii="Aptos Narrow" w:hAnsi="Aptos Narrow"/>
                 <w:color w:val="000000"/>
               </w:rPr>
-              <w:t>0.15</w:t>
+              <w:t>17.06</w:t>
             </w:r>
           </w:p>
         </w:tc>
@@ -8996,7 +8996,7 @@
                 <w:rFonts w:ascii="Aptos Narrow" w:hAnsi="Aptos Narrow"/>
                 <w:color w:val="000000"/>
               </w:rPr>
-              <w:t>0.29</w:t>
+              <w:t>39.62</w:t>
             </w:r>
           </w:p>
         </w:tc>
@@ -9014,7 +9014,7 @@
                 <w:rFonts w:ascii="Aptos Narrow" w:hAnsi="Aptos Narrow"/>
                 <w:color w:val="000000"/>
               </w:rPr>
-              <w:t>0.59</w:t>
+              <w:t>83.56</w:t>
             </w:r>
           </w:p>
         </w:tc>
@@ -9053,7 +9053,7 @@
                 <w:rFonts w:ascii="Aptos Narrow" w:hAnsi="Aptos Narrow"/>
                 <w:color w:val="000000"/>
               </w:rPr>
-              <w:t>0.47</w:t>
+              <w:t>8.98</w:t>
             </w:r>
           </w:p>
         </w:tc>
@@ -9071,7 +9071,7 @@
                 <w:rFonts w:ascii="Aptos Narrow" w:hAnsi="Aptos Narrow"/>
                 <w:color w:val="000000"/>
               </w:rPr>
-              <w:t>0.94</w:t>
+              <w:t>10.71</w:t>
             </w:r>
           </w:p>
         </w:tc>
@@ -9089,7 +9089,7 @@
                 <w:rFonts w:ascii="Aptos Narrow" w:hAnsi="Aptos Narrow"/>
                 <w:color w:val="000000"/>
               </w:rPr>
-              <w:t>0.09</w:t>
+              <w:t>0.02</w:t>
             </w:r>
           </w:p>
         </w:tc>
@@ -9107,7 +9107,7 @@
                 <w:rFonts w:ascii="Aptos Narrow" w:hAnsi="Aptos Narrow"/>
                 <w:color w:val="000000"/>
               </w:rPr>
-              <w:t>0.19</w:t>
+              <w:t>0.04</w:t>
             </w:r>
           </w:p>
         </w:tc>
@@ -9125,7 +9125,7 @@
                 <w:rFonts w:ascii="Aptos Narrow" w:hAnsi="Aptos Narrow"/>
                 <w:color w:val="000000"/>
               </w:rPr>
-              <w:t>0.38</w:t>
+              <w:t>0.07</w:t>
             </w:r>
           </w:p>
         </w:tc>
@@ -9161,7 +9161,7 @@
                 <w:rFonts w:ascii="Aptos Narrow" w:hAnsi="Aptos Narrow"/>
                 <w:color w:val="000000"/>
               </w:rPr>
-              <w:t>0.05</w:t>
+              <w:t>0.18</w:t>
             </w:r>
           </w:p>
         </w:tc>
@@ -9179,7 +9179,7 @@
                 <w:rFonts w:ascii="Aptos Narrow" w:hAnsi="Aptos Narrow"/>
                 <w:color w:val="000000"/>
               </w:rPr>
-              <w:t>0.1</w:t>
+              <w:t>0.26</w:t>
             </w:r>
           </w:p>
         </w:tc>
@@ -9197,7 +9197,7 @@
                 <w:rFonts w:ascii="Aptos Narrow" w:hAnsi="Aptos Narrow"/>
                 <w:color w:val="000000"/>
               </w:rPr>
-              <w:t>0.01</w:t>
+              <w:t>5.28</w:t>
             </w:r>
           </w:p>
         </w:tc>
@@ -9215,7 +9215,7 @@
                 <w:rFonts w:ascii="Aptos Narrow" w:hAnsi="Aptos Narrow"/>
                 <w:color w:val="000000"/>
               </w:rPr>
-              <w:t>0.02</w:t>
+              <w:t>11.09</w:t>
             </w:r>
           </w:p>
         </w:tc>
@@ -9233,7 +9233,7 @@
                 <w:rFonts w:ascii="Aptos Narrow" w:hAnsi="Aptos Narrow"/>
                 <w:color w:val="000000"/>
               </w:rPr>
-              <w:t>0.04</w:t>
+              <w:t>26.75</w:t>
             </w:r>
           </w:p>
         </w:tc>
@@ -9272,7 +9272,7 @@
                 <w:rFonts w:ascii="Aptos Narrow" w:hAnsi="Aptos Narrow"/>
                 <w:color w:val="000000"/>
               </w:rPr>
-              <w:t>0.29</w:t>
+              <w:t>3.36</w:t>
             </w:r>
           </w:p>
         </w:tc>
@@ -9290,7 +9290,7 @@
                 <w:rFonts w:ascii="Aptos Narrow" w:hAnsi="Aptos Narrow"/>
                 <w:color w:val="000000"/>
               </w:rPr>
-              <w:t>0.59</w:t>
+              <w:t>6.42</w:t>
             </w:r>
           </w:p>
         </w:tc>
@@ -9308,7 +9308,7 @@
                 <w:rFonts w:ascii="Aptos Narrow" w:hAnsi="Aptos Narrow"/>
                 <w:color w:val="000000"/>
               </w:rPr>
-              <w:t>0.06</w:t>
+              <w:t>2.23</w:t>
             </w:r>
           </w:p>
         </w:tc>
@@ -9326,7 +9326,7 @@
                 <w:rFonts w:ascii="Aptos Narrow" w:hAnsi="Aptos Narrow"/>
                 <w:color w:val="000000"/>
               </w:rPr>
-              <w:t>0.12</w:t>
+              <w:t>4.66</w:t>
             </w:r>
           </w:p>
         </w:tc>
@@ -9344,7 +9344,7 @@
                 <w:rFonts w:ascii="Aptos Narrow" w:hAnsi="Aptos Narrow"/>
                 <w:color w:val="000000"/>
               </w:rPr>
-              <w:t>0.23</w:t>
+              <w:t>9.62</w:t>
             </w:r>
           </w:p>
         </w:tc>
@@ -9380,7 +9380,7 @@
                 <w:rFonts w:ascii="Aptos Narrow" w:hAnsi="Aptos Narrow"/>
                 <w:color w:val="000000"/>
               </w:rPr>
-              <w:t>0.08</w:t>
+              <w:t>0.12</w:t>
             </w:r>
           </w:p>
         </w:tc>
@@ -9398,7 +9398,7 @@
                 <w:rFonts w:ascii="Aptos Narrow" w:hAnsi="Aptos Narrow"/>
                 <w:color w:val="000000"/>
               </w:rPr>
-              <w:t>0.15</w:t>
+              <w:t>0.14</w:t>
             </w:r>
           </w:p>
         </w:tc>
@@ -9416,7 +9416,7 @@
                 <w:rFonts w:ascii="Aptos Narrow" w:hAnsi="Aptos Narrow"/>
                 <w:color w:val="000000"/>
               </w:rPr>
-              <w:t>0.02</w:t>
+              <w:t>29.62</w:t>
             </w:r>
           </w:p>
         </w:tc>
@@ -9434,7 +9434,7 @@
                 <w:rFonts w:ascii="Aptos Narrow" w:hAnsi="Aptos Narrow"/>
                 <w:color w:val="000000"/>
               </w:rPr>
-              <w:t>0.03</w:t>
+              <w:t>54.26</w:t>
             </w:r>
           </w:p>
         </w:tc>
@@ -9452,7 +9452,7 @@
                 <w:rFonts w:ascii="Aptos Narrow" w:hAnsi="Aptos Narrow"/>
                 <w:color w:val="000000"/>
               </w:rPr>
-              <w:t>0.06</w:t>
+              <w:t>101.07</w:t>
             </w:r>
           </w:p>
         </w:tc>
@@ -9491,7 +9491,7 @@
                 <w:rFonts w:ascii="Aptos Narrow" w:hAnsi="Aptos Narrow"/>
                 <w:color w:val="000000"/>
               </w:rPr>
-              <w:t>0.29</w:t>
+              <w:t>4.26</w:t>
             </w:r>
           </w:p>
         </w:tc>
@@ -9509,7 +9509,7 @@
                 <w:rFonts w:ascii="Aptos Narrow" w:hAnsi="Aptos Narrow"/>
                 <w:color w:val="000000"/>
               </w:rPr>
-              <w:t>0.58</w:t>
+              <w:t>6.26</w:t>
             </w:r>
           </w:p>
         </w:tc>
@@ -9527,7 +9527,7 @@
                 <w:rFonts w:ascii="Aptos Narrow" w:hAnsi="Aptos Narrow"/>
                 <w:color w:val="000000"/>
               </w:rPr>
-              <w:t>0.06</w:t>
+              <w:t>0.79</w:t>
             </w:r>
           </w:p>
         </w:tc>
@@ -9545,7 +9545,7 @@
                 <w:rFonts w:ascii="Aptos Narrow" w:hAnsi="Aptos Narrow"/>
                 <w:color w:val="000000"/>
               </w:rPr>
-              <w:t>0.12</w:t>
+              <w:t>1.51</w:t>
             </w:r>
           </w:p>
         </w:tc>
@@ -9563,7 +9563,7 @@
                 <w:rFonts w:ascii="Aptos Narrow" w:hAnsi="Aptos Narrow"/>
                 <w:color w:val="000000"/>
               </w:rPr>
-              <w:t>0.23</w:t>
+              <w:t>2.88</w:t>
             </w:r>
           </w:p>
         </w:tc>
@@ -9599,7 +9599,7 @@
                 <w:rFonts w:ascii="Aptos Narrow" w:hAnsi="Aptos Narrow"/>
                 <w:color w:val="000000"/>
               </w:rPr>
-              <w:t>0.04</w:t>
+              <w:t>0.01</w:t>
             </w:r>
           </w:p>
         </w:tc>
@@ -9617,7 +9617,7 @@
                 <w:rFonts w:ascii="Aptos Narrow" w:hAnsi="Aptos Narrow"/>
                 <w:color w:val="000000"/>
               </w:rPr>
-              <w:t>0.07</w:t>
+              <w:t>0.02</w:t>
             </w:r>
           </w:p>
         </w:tc>
@@ -9635,7 +9635,7 @@
                 <w:rFonts w:ascii="Aptos Narrow" w:hAnsi="Aptos Narrow"/>
                 <w:color w:val="000000"/>
               </w:rPr>
-              <w:t>0.01</w:t>
+              <w:t>3.07</w:t>
             </w:r>
           </w:p>
         </w:tc>
@@ -9653,7 +9653,7 @@
                 <w:rFonts w:ascii="Aptos Narrow" w:hAnsi="Aptos Narrow"/>
                 <w:color w:val="000000"/>
               </w:rPr>
-              <w:t>0.01</w:t>
+              <w:t>7.41</w:t>
             </w:r>
           </w:p>
         </w:tc>
@@ -9671,7 +9671,7 @@
                 <w:rFonts w:ascii="Aptos Narrow" w:hAnsi="Aptos Narrow"/>
                 <w:color w:val="000000"/>
               </w:rPr>
-              <w:t>0.03</w:t>
+              <w:t>14.86</w:t>
             </w:r>
           </w:p>
         </w:tc>
@@ -9710,7 +9710,7 @@
                 <w:rFonts w:ascii="Aptos Narrow" w:hAnsi="Aptos Narrow"/>
                 <w:color w:val="000000"/>
               </w:rPr>
-              <w:t>0.04</w:t>
+              <w:t>0.05</w:t>
             </w:r>
           </w:p>
         </w:tc>
@@ -9728,7 +9728,7 @@
                 <w:rFonts w:ascii="Aptos Narrow" w:hAnsi="Aptos Narrow"/>
                 <w:color w:val="000000"/>
               </w:rPr>
-              <w:t>0.09</w:t>
+              <w:t>0.07</w:t>
             </w:r>
           </w:p>
         </w:tc>
@@ -9746,7 +9746,7 @@
                 <w:rFonts w:ascii="Aptos Narrow" w:hAnsi="Aptos Narrow"/>
                 <w:color w:val="000000"/>
               </w:rPr>
-              <w:t>0.01</w:t>
+              <w:t>2.1</w:t>
             </w:r>
           </w:p>
         </w:tc>
@@ -9764,7 +9764,7 @@
                 <w:rFonts w:ascii="Aptos Narrow" w:hAnsi="Aptos Narrow"/>
                 <w:color w:val="000000"/>
               </w:rPr>
-              <w:t>0.02</w:t>
+              <w:t>4.41</w:t>
             </w:r>
           </w:p>
         </w:tc>
@@ -9782,7 +9782,7 @@
                 <w:rFonts w:ascii="Aptos Narrow" w:hAnsi="Aptos Narrow"/>
                 <w:color w:val="000000"/>
               </w:rPr>
-              <w:t>0.04</w:t>
+              <w:t>9.11</w:t>
             </w:r>
           </w:p>
         </w:tc>
@@ -9818,7 +9818,7 @@
                 <w:rFonts w:ascii="Aptos Narrow" w:hAnsi="Aptos Narrow"/>
                 <w:color w:val="000000"/>
               </w:rPr>
-              <w:t>0.24</w:t>
+              <w:t>13.43</w:t>
             </w:r>
           </w:p>
         </w:tc>
@@ -9836,7 +9836,7 @@
                 <w:rFonts w:ascii="Aptos Narrow" w:hAnsi="Aptos Narrow"/>
                 <w:color w:val="000000"/>
               </w:rPr>
-              <w:t>0.48</w:t>
+              <w:t>14.01</w:t>
             </w:r>
           </w:p>
         </w:tc>
@@ -9854,7 +9854,7 @@
                 <w:rFonts w:ascii="Aptos Narrow" w:hAnsi="Aptos Narrow"/>
                 <w:color w:val="000000"/>
               </w:rPr>
-              <w:t>0.05</w:t>
+              <w:t>1.33</w:t>
             </w:r>
           </w:p>
         </w:tc>
@@ -9872,7 +9872,7 @@
                 <w:rFonts w:ascii="Aptos Narrow" w:hAnsi="Aptos Narrow"/>
                 <w:color w:val="000000"/>
               </w:rPr>
-              <w:t>0.1</w:t>
+              <w:t>2.66</w:t>
             </w:r>
           </w:p>
         </w:tc>
@@ -9890,7 +9890,7 @@
                 <w:rFonts w:ascii="Aptos Narrow" w:hAnsi="Aptos Narrow"/>
                 <w:color w:val="000000"/>
               </w:rPr>
-              <w:t>0.19</w:t>
+              <w:t>5.39</w:t>
             </w:r>
           </w:p>
         </w:tc>
@@ -9947,7 +9947,7 @@
                 <w:rFonts w:ascii="Aptos Narrow" w:hAnsi="Aptos Narrow"/>
                 <w:color w:val="000000"/>
               </w:rPr>
-              <w:t>0.03</w:t>
+              <w:t>0.01</w:t>
             </w:r>
           </w:p>
         </w:tc>
@@ -9965,7 +9965,7 @@
                 <w:rFonts w:ascii="Aptos Narrow" w:hAnsi="Aptos Narrow"/>
                 <w:color w:val="000000"/>
               </w:rPr>
-              <w:t>0</w:t>
+              <w:t>0.47</w:t>
             </w:r>
           </w:p>
         </w:tc>
@@ -9983,7 +9983,7 @@
                 <w:rFonts w:ascii="Aptos Narrow" w:hAnsi="Aptos Narrow"/>
                 <w:color w:val="000000"/>
               </w:rPr>
-              <w:t>0.01</w:t>
+              <w:t>1.08</w:t>
             </w:r>
           </w:p>
         </w:tc>
@@ -10001,7 +10001,7 @@
                 <w:rFonts w:ascii="Aptos Narrow" w:hAnsi="Aptos Narrow"/>
                 <w:color w:val="000000"/>
               </w:rPr>
-              <w:t>0.01</w:t>
+              <w:t>2.78</w:t>
             </w:r>
           </w:p>
         </w:tc>
@@ -10037,7 +10037,7 @@
                 <w:rFonts w:ascii="Aptos Narrow" w:hAnsi="Aptos Narrow"/>
                 <w:color w:val="000000"/>
               </w:rPr>
-              <w:t>0.89</w:t>
+              <w:t>8.69</w:t>
             </w:r>
           </w:p>
         </w:tc>
@@ -10055,7 +10055,7 @@
                 <w:rFonts w:ascii="Aptos Narrow" w:hAnsi="Aptos Narrow"/>
                 <w:color w:val="000000"/>
               </w:rPr>
-              <w:t>1.78</w:t>
+              <w:t>22.48</w:t>
             </w:r>
           </w:p>
         </w:tc>
@@ -10073,7 +10073,7 @@
                 <w:rFonts w:ascii="Aptos Narrow" w:hAnsi="Aptos Narrow"/>
                 <w:color w:val="000000"/>
               </w:rPr>
-              <w:t>0.18</w:t>
+              <w:t>4.13</w:t>
             </w:r>
           </w:p>
         </w:tc>
@@ -10091,7 +10091,7 @@
                 <w:rFonts w:ascii="Aptos Narrow" w:hAnsi="Aptos Narrow"/>
                 <w:color w:val="000000"/>
               </w:rPr>
-              <w:t>0.36</w:t>
+              <w:t>7.84</w:t>
             </w:r>
           </w:p>
         </w:tc>
@@ -10109,7 +10109,7 @@
                 <w:rFonts w:ascii="Aptos Narrow" w:hAnsi="Aptos Narrow"/>
                 <w:color w:val="000000"/>
               </w:rPr>
-              <w:t>0.71</w:t>
+              <w:t>15.88</w:t>
             </w:r>
           </w:p>
         </w:tc>
@@ -10148,7 +10148,7 @@
                 <w:rFonts w:ascii="Aptos Narrow" w:hAnsi="Aptos Narrow"/>
                 <w:color w:val="000000"/>
               </w:rPr>
-              <w:t>0.08</w:t>
+              <w:t>0.22</w:t>
             </w:r>
           </w:p>
         </w:tc>
@@ -10166,7 +10166,7 @@
                 <w:rFonts w:ascii="Aptos Narrow" w:hAnsi="Aptos Narrow"/>
                 <w:color w:val="000000"/>
               </w:rPr>
-              <w:t>0.15</w:t>
+              <w:t>0.84</w:t>
             </w:r>
           </w:p>
         </w:tc>
@@ -10184,7 +10184,7 @@
                 <w:rFonts w:ascii="Aptos Narrow" w:hAnsi="Aptos Narrow"/>
                 <w:color w:val="000000"/>
               </w:rPr>
-              <w:t>0.02</w:t>
+              <w:t>1.86</w:t>
             </w:r>
           </w:p>
         </w:tc>
@@ -10202,7 +10202,7 @@
                 <w:rFonts w:ascii="Aptos Narrow" w:hAnsi="Aptos Narrow"/>
                 <w:color w:val="000000"/>
               </w:rPr>
-              <w:t>0.03</w:t>
+              <w:t>3.47</w:t>
             </w:r>
           </w:p>
         </w:tc>
@@ -10220,7 +10220,7 @@
                 <w:rFonts w:ascii="Aptos Narrow" w:hAnsi="Aptos Narrow"/>
                 <w:color w:val="000000"/>
               </w:rPr>
-              <w:t>0.06</w:t>
+              <w:t>6.61</w:t>
             </w:r>
           </w:p>
         </w:tc>
@@ -10256,7 +10256,7 @@
                 <w:rFonts w:ascii="Aptos Narrow" w:hAnsi="Aptos Narrow"/>
                 <w:color w:val="000000"/>
               </w:rPr>
-              <w:t>0.67</w:t>
+              <w:t>25.86</w:t>
             </w:r>
           </w:p>
         </w:tc>
@@ -10274,7 +10274,7 @@
                 <w:rFonts w:ascii="Aptos Narrow" w:hAnsi="Aptos Narrow"/>
                 <w:color w:val="000000"/>
               </w:rPr>
-              <w:t>1.33</w:t>
+              <w:t>26.49</w:t>
             </w:r>
           </w:p>
         </w:tc>
@@ -10292,7 +10292,7 @@
                 <w:rFonts w:ascii="Aptos Narrow" w:hAnsi="Aptos Narrow"/>
                 <w:color w:val="000000"/>
               </w:rPr>
-              <w:t>0.13</w:t>
+              <w:t>6.46</w:t>
             </w:r>
           </w:p>
         </w:tc>
@@ -10310,7 +10310,7 @@
                 <w:rFonts w:ascii="Aptos Narrow" w:hAnsi="Aptos Narrow"/>
                 <w:color w:val="000000"/>
               </w:rPr>
-              <w:t>0.27</w:t>
+              <w:t>13.77</w:t>
             </w:r>
           </w:p>
         </w:tc>
@@ -10328,7 +10328,7 @@
                 <w:rFonts w:ascii="Aptos Narrow" w:hAnsi="Aptos Narrow"/>
                 <w:color w:val="000000"/>
               </w:rPr>
-              <w:t>0.53</w:t>
+              <w:t>26.9</w:t>
             </w:r>
           </w:p>
         </w:tc>
@@ -10368,7 +10368,7 @@
                 <w:rFonts w:ascii="Aptos Narrow" w:hAnsi="Aptos Narrow"/>
                 <w:color w:val="000000"/>
               </w:rPr>
-              <w:t>0.04</w:t>
+              <w:t>0.46</w:t>
             </w:r>
           </w:p>
         </w:tc>
@@ -10386,7 +10386,7 @@
                 <w:rFonts w:ascii="Aptos Narrow" w:hAnsi="Aptos Narrow"/>
                 <w:color w:val="000000"/>
               </w:rPr>
-              <w:t>0.09</w:t>
+              <w:t>0.52</w:t>
             </w:r>
           </w:p>
         </w:tc>
@@ -10404,7 +10404,7 @@
                 <w:rFonts w:ascii="Aptos Narrow" w:hAnsi="Aptos Narrow"/>
                 <w:color w:val="000000"/>
               </w:rPr>
-              <w:t>0.01</w:t>
+              <w:t>0.84</w:t>
             </w:r>
           </w:p>
         </w:tc>
@@ -10422,7 +10422,7 @@
                 <w:rFonts w:ascii="Aptos Narrow" w:hAnsi="Aptos Narrow"/>
                 <w:color w:val="000000"/>
               </w:rPr>
-              <w:t>0.02</w:t>
+              <w:t>2.2</w:t>
             </w:r>
           </w:p>
         </w:tc>
@@ -10440,7 +10440,7 @@
                 <w:rFonts w:ascii="Aptos Narrow" w:hAnsi="Aptos Narrow"/>
                 <w:color w:val="000000"/>
               </w:rPr>
-              <w:t>0.04</w:t>
+              <w:t>6.01</w:t>
             </w:r>
           </w:p>
         </w:tc>
@@ -10476,7 +10476,7 @@
                 <w:rFonts w:ascii="Aptos Narrow" w:hAnsi="Aptos Narrow"/>
                 <w:color w:val="000000"/>
               </w:rPr>
-              <w:t>0.56</w:t>
+              <w:t>6.22</w:t>
             </w:r>
           </w:p>
         </w:tc>
@@ -10494,7 +10494,7 @@
                 <w:rFonts w:ascii="Aptos Narrow" w:hAnsi="Aptos Narrow"/>
                 <w:color w:val="000000"/>
               </w:rPr>
-              <w:t>1.11</w:t>
+              <w:t>7.8</w:t>
             </w:r>
           </w:p>
         </w:tc>
@@ -10512,7 +10512,7 @@
                 <w:rFonts w:ascii="Aptos Narrow" w:hAnsi="Aptos Narrow"/>
                 <w:color w:val="000000"/>
               </w:rPr>
-              <w:t>0.11</w:t>
+              <w:t>0.22</w:t>
             </w:r>
           </w:p>
         </w:tc>
@@ -10530,7 +10530,7 @@
                 <w:rFonts w:ascii="Aptos Narrow" w:hAnsi="Aptos Narrow"/>
                 <w:color w:val="000000"/>
               </w:rPr>
-              <w:t>0.22</w:t>
+              <w:t>0.43</w:t>
             </w:r>
           </w:p>
         </w:tc>
@@ -10548,7 +10548,7 @@
                 <w:rFonts w:ascii="Aptos Narrow" w:hAnsi="Aptos Narrow"/>
                 <w:color w:val="000000"/>
               </w:rPr>
-              <w:t>0.45</w:t>
+              <w:t>1.04</w:t>
             </w:r>
           </w:p>
         </w:tc>
@@ -10587,7 +10587,7 @@
                 <w:rFonts w:ascii="Aptos Narrow" w:hAnsi="Aptos Narrow"/>
                 <w:color w:val="000000"/>
               </w:rPr>
-              <w:t>0.26</w:t>
+              <w:t>3.85</w:t>
             </w:r>
           </w:p>
         </w:tc>
@@ -10605,7 +10605,7 @@
                 <w:rFonts w:ascii="Aptos Narrow" w:hAnsi="Aptos Narrow"/>
                 <w:color w:val="000000"/>
               </w:rPr>
-              <w:t>0.53</w:t>
+              <w:t>5.46</w:t>
             </w:r>
           </w:p>
         </w:tc>
@@ -10623,7 +10623,7 @@
                 <w:rFonts w:ascii="Aptos Narrow" w:hAnsi="Aptos Narrow"/>
                 <w:color w:val="000000"/>
               </w:rPr>
-              <w:t>0.05</w:t>
+              <w:t>1.92</w:t>
             </w:r>
           </w:p>
         </w:tc>
@@ -10641,7 +10641,7 @@
                 <w:rFonts w:ascii="Aptos Narrow" w:hAnsi="Aptos Narrow"/>
                 <w:color w:val="000000"/>
               </w:rPr>
-              <w:t>0.11</w:t>
+              <w:t>4</w:t>
             </w:r>
           </w:p>
         </w:tc>
@@ -10659,7 +10659,7 @@
                 <w:rFonts w:ascii="Aptos Narrow" w:hAnsi="Aptos Narrow"/>
                 <w:color w:val="000000"/>
               </w:rPr>
-              <w:t>0.21</w:t>
+              <w:t>8.72</w:t>
             </w:r>
           </w:p>
         </w:tc>
@@ -10695,7 +10695,7 @@
                 <w:rFonts w:ascii="Aptos Narrow" w:hAnsi="Aptos Narrow"/>
                 <w:color w:val="000000"/>
               </w:rPr>
-              <w:t>0.14</w:t>
+              <w:t>1.62</w:t>
             </w:r>
           </w:p>
         </w:tc>
@@ -10713,7 +10713,7 @@
                 <w:rFonts w:ascii="Aptos Narrow" w:hAnsi="Aptos Narrow"/>
                 <w:color w:val="000000"/>
               </w:rPr>
-              <w:t>0.28</w:t>
+              <w:t>1.82</w:t>
             </w:r>
           </w:p>
         </w:tc>
@@ -10731,7 +10731,7 @@
                 <w:rFonts w:ascii="Aptos Narrow" w:hAnsi="Aptos Narrow"/>
                 <w:color w:val="000000"/>
               </w:rPr>
-              <w:t>0.03</w:t>
+              <w:t>4.27</w:t>
             </w:r>
           </w:p>
         </w:tc>
@@ -10749,7 +10749,7 @@
                 <w:rFonts w:ascii="Aptos Narrow" w:hAnsi="Aptos Narrow"/>
                 <w:color w:val="000000"/>
               </w:rPr>
-              <w:t>0.06</w:t>
+              <w:t>8.6</w:t>
             </w:r>
           </w:p>
         </w:tc>
@@ -10767,7 +10767,7 @@
                 <w:rFonts w:ascii="Aptos Narrow" w:hAnsi="Aptos Narrow"/>
                 <w:color w:val="000000"/>
               </w:rPr>
-              <w:t>0.11</w:t>
+              <w:t>17.25</w:t>
             </w:r>
           </w:p>
         </w:tc>
@@ -10806,7 +10806,7 @@
                 <w:rFonts w:ascii="Aptos Narrow" w:hAnsi="Aptos Narrow"/>
                 <w:color w:val="000000"/>
               </w:rPr>
-              <w:t>0.21</w:t>
+              <w:t>0.83</w:t>
             </w:r>
           </w:p>
         </w:tc>
@@ -10824,7 +10824,7 @@
                 <w:rFonts w:ascii="Aptos Narrow" w:hAnsi="Aptos Narrow"/>
                 <w:color w:val="000000"/>
               </w:rPr>
-              <w:t>0.43</w:t>
+              <w:t>2.33</w:t>
             </w:r>
           </w:p>
         </w:tc>
@@ -10842,7 +10842,7 @@
                 <w:rFonts w:ascii="Aptos Narrow" w:hAnsi="Aptos Narrow"/>
                 <w:color w:val="000000"/>
               </w:rPr>
-              <w:t>0.04</w:t>
+              <w:t>0.06</w:t>
             </w:r>
           </w:p>
         </w:tc>
@@ -10860,7 +10860,7 @@
                 <w:rFonts w:ascii="Aptos Narrow" w:hAnsi="Aptos Narrow"/>
                 <w:color w:val="000000"/>
               </w:rPr>
-              <w:t>0.09</w:t>
+              <w:t>0.11</w:t>
             </w:r>
           </w:p>
         </w:tc>
@@ -10878,7 +10878,7 @@
                 <w:rFonts w:ascii="Aptos Narrow" w:hAnsi="Aptos Narrow"/>
                 <w:color w:val="000000"/>
               </w:rPr>
-              <w:t>0.17</w:t>
+              <w:t>0.2</w:t>
             </w:r>
           </w:p>
         </w:tc>
@@ -10914,7 +10914,7 @@
                 <w:rFonts w:ascii="Aptos Narrow" w:hAnsi="Aptos Narrow"/>
                 <w:color w:val="000000"/>
               </w:rPr>
-              <w:t>0.11</w:t>
+              <w:t>1.49</w:t>
             </w:r>
           </w:p>
         </w:tc>
@@ -10932,7 +10932,7 @@
                 <w:rFonts w:ascii="Aptos Narrow" w:hAnsi="Aptos Narrow"/>
                 <w:color w:val="000000"/>
               </w:rPr>
-              <w:t>0.22</w:t>
+              <w:t>1.84</w:t>
             </w:r>
           </w:p>
         </w:tc>
@@ -10950,7 +10950,7 @@
                 <w:rFonts w:ascii="Aptos Narrow" w:hAnsi="Aptos Narrow"/>
                 <w:color w:val="000000"/>
               </w:rPr>
-              <w:t>0.02</w:t>
+              <w:t>10.55</w:t>
             </w:r>
           </w:p>
         </w:tc>
@@ -10968,7 +10968,7 @@
                 <w:rFonts w:ascii="Aptos Narrow" w:hAnsi="Aptos Narrow"/>
                 <w:color w:val="000000"/>
               </w:rPr>
-              <w:t>0.04</w:t>
+              <w:t>21.03</w:t>
             </w:r>
           </w:p>
         </w:tc>
@@ -10986,7 +10986,7 @@
                 <w:rFonts w:ascii="Aptos Narrow" w:hAnsi="Aptos Narrow"/>
                 <w:color w:val="000000"/>
               </w:rPr>
-              <w:t>0.09</w:t>
+              <w:t>39.43</w:t>
             </w:r>
           </w:p>
         </w:tc>
@@ -11025,7 +11025,7 @@
                 <w:rFonts w:ascii="Aptos Narrow" w:hAnsi="Aptos Narrow"/>
                 <w:color w:val="000000"/>
               </w:rPr>
-              <w:t>0.26</w:t>
+              <w:t>9.85</w:t>
             </w:r>
           </w:p>
         </w:tc>
@@ -11043,7 +11043,7 @@
                 <w:rFonts w:ascii="Aptos Narrow" w:hAnsi="Aptos Narrow"/>
                 <w:color w:val="000000"/>
               </w:rPr>
-              <w:t>0.51</w:t>
+              <w:t>10.87</w:t>
             </w:r>
           </w:p>
         </w:tc>
@@ -11061,7 +11061,7 @@
                 <w:rFonts w:ascii="Aptos Narrow" w:hAnsi="Aptos Narrow"/>
                 <w:color w:val="000000"/>
               </w:rPr>
-              <w:t>0.05</w:t>
+              <w:t>6.62</w:t>
             </w:r>
           </w:p>
         </w:tc>
@@ -11079,7 +11079,7 @@
                 <w:rFonts w:ascii="Aptos Narrow" w:hAnsi="Aptos Narrow"/>
                 <w:color w:val="000000"/>
               </w:rPr>
-              <w:t>0.1</w:t>
+              <w:t>13.42</w:t>
             </w:r>
           </w:p>
         </w:tc>
@@ -11097,7 +11097,7 @@
                 <w:rFonts w:ascii="Aptos Narrow" w:hAnsi="Aptos Narrow"/>
                 <w:color w:val="000000"/>
               </w:rPr>
-              <w:t>0.21</w:t>
+              <w:t>26.34</w:t>
             </w:r>
           </w:p>
         </w:tc>
@@ -11133,7 +11133,7 @@
                 <w:rFonts w:ascii="Aptos Narrow" w:hAnsi="Aptos Narrow"/>
                 <w:color w:val="000000"/>
               </w:rPr>
-              <w:t>0.34</w:t>
+              <w:t>2.21</w:t>
             </w:r>
           </w:p>
         </w:tc>
@@ -11151,7 +11151,7 @@
                 <w:rFonts w:ascii="Aptos Narrow" w:hAnsi="Aptos Narrow"/>
                 <w:color w:val="000000"/>
               </w:rPr>
-              <w:t>0.68</w:t>
+              <w:t>5</w:t>
             </w:r>
           </w:p>
         </w:tc>
@@ -11169,7 +11169,7 @@
                 <w:rFonts w:ascii="Aptos Narrow" w:hAnsi="Aptos Narrow"/>
                 <w:color w:val="000000"/>
               </w:rPr>
-              <w:t>0.07</w:t>
+              <w:t>1.05</w:t>
             </w:r>
           </w:p>
         </w:tc>
@@ -11187,7 +11187,7 @@
                 <w:rFonts w:ascii="Aptos Narrow" w:hAnsi="Aptos Narrow"/>
                 <w:color w:val="000000"/>
               </w:rPr>
-              <w:t>0.14</w:t>
+              <w:t>1.97</w:t>
             </w:r>
           </w:p>
         </w:tc>
@@ -11205,7 +11205,7 @@
                 <w:rFonts w:ascii="Aptos Narrow" w:hAnsi="Aptos Narrow"/>
                 <w:color w:val="000000"/>
               </w:rPr>
-              <w:t>0.27</w:t>
+              <w:t>3.8</w:t>
             </w:r>
           </w:p>
         </w:tc>
@@ -11244,7 +11244,7 @@
                 <w:rFonts w:ascii="Aptos Narrow" w:hAnsi="Aptos Narrow"/>
                 <w:color w:val="000000"/>
               </w:rPr>
-              <w:t>0.26</w:t>
+              <w:t>0.16</w:t>
             </w:r>
           </w:p>
         </w:tc>
@@ -11262,7 +11262,7 @@
                 <w:rFonts w:ascii="Aptos Narrow" w:hAnsi="Aptos Narrow"/>
                 <w:color w:val="000000"/>
               </w:rPr>
-              <w:t>0.53</w:t>
+              <w:t>0.71</w:t>
             </w:r>
           </w:p>
         </w:tc>
@@ -11280,7 +11280,7 @@
                 <w:rFonts w:ascii="Aptos Narrow" w:hAnsi="Aptos Narrow"/>
                 <w:color w:val="000000"/>
               </w:rPr>
-              <w:t>0.05</w:t>
+              <w:t>13.57</w:t>
             </w:r>
           </w:p>
         </w:tc>
@@ -11298,7 +11298,7 @@
                 <w:rFonts w:ascii="Aptos Narrow" w:hAnsi="Aptos Narrow"/>
                 <w:color w:val="000000"/>
               </w:rPr>
-              <w:t>0.11</w:t>
+              <w:t>27.52</w:t>
             </w:r>
           </w:p>
         </w:tc>
@@ -11316,7 +11316,7 @@
                 <w:rFonts w:ascii="Aptos Narrow" w:hAnsi="Aptos Narrow"/>
                 <w:color w:val="000000"/>
               </w:rPr>
-              <w:t>0.21</w:t>
+              <w:t>57.41</w:t>
             </w:r>
           </w:p>
         </w:tc>
@@ -11352,7 +11352,7 @@
                 <w:rFonts w:ascii="Aptos Narrow" w:hAnsi="Aptos Narrow"/>
                 <w:color w:val="000000"/>
               </w:rPr>
-              <w:t>0.24</w:t>
+              <w:t>2.58</w:t>
             </w:r>
           </w:p>
         </w:tc>
@@ -11370,7 +11370,7 @@
                 <w:rFonts w:ascii="Aptos Narrow" w:hAnsi="Aptos Narrow"/>
                 <w:color w:val="000000"/>
               </w:rPr>
-              <w:t>0.48</w:t>
+              <w:t>4.4</w:t>
             </w:r>
           </w:p>
         </w:tc>
@@ -11388,7 +11388,7 @@
                 <w:rFonts w:ascii="Aptos Narrow" w:hAnsi="Aptos Narrow"/>
                 <w:color w:val="000000"/>
               </w:rPr>
-              <w:t>0.05</w:t>
+              <w:t>0.07</w:t>
             </w:r>
           </w:p>
         </w:tc>
@@ -11406,7 +11406,7 @@
                 <w:rFonts w:ascii="Aptos Narrow" w:hAnsi="Aptos Narrow"/>
                 <w:color w:val="000000"/>
               </w:rPr>
-              <w:t>0.1</w:t>
+              <w:t>0.14</w:t>
             </w:r>
           </w:p>
         </w:tc>
@@ -11424,7 +11424,7 @@
                 <w:rFonts w:ascii="Aptos Narrow" w:hAnsi="Aptos Narrow"/>
                 <w:color w:val="000000"/>
               </w:rPr>
-              <w:t>0.19</w:t>
+              <w:t>0.26</w:t>
             </w:r>
           </w:p>
         </w:tc>
@@ -11463,7 +11463,7 @@
                 <w:rFonts w:ascii="Aptos Narrow" w:hAnsi="Aptos Narrow"/>
                 <w:color w:val="000000"/>
               </w:rPr>
-              <w:t>0.25</w:t>
+              <w:t>4.53</w:t>
             </w:r>
           </w:p>
         </w:tc>
@@ -11481,7 +11481,7 @@
                 <w:rFonts w:ascii="Aptos Narrow" w:hAnsi="Aptos Narrow"/>
                 <w:color w:val="000000"/>
               </w:rPr>
-              <w:t>0.49</w:t>
+              <w:t>7.58</w:t>
             </w:r>
           </w:p>
         </w:tc>
@@ -11499,7 +11499,7 @@
                 <w:rFonts w:ascii="Aptos Narrow" w:hAnsi="Aptos Narrow"/>
                 <w:color w:val="000000"/>
               </w:rPr>
-              <w:t>0.05</w:t>
+              <w:t>4.18</w:t>
             </w:r>
           </w:p>
         </w:tc>
@@ -11517,7 +11517,7 @@
                 <w:rFonts w:ascii="Aptos Narrow" w:hAnsi="Aptos Narrow"/>
                 <w:color w:val="000000"/>
               </w:rPr>
-              <w:t>0.1</w:t>
+              <w:t>10.04</w:t>
             </w:r>
           </w:p>
         </w:tc>
@@ -11535,7 +11535,7 @@
                 <w:rFonts w:ascii="Aptos Narrow" w:hAnsi="Aptos Narrow"/>
                 <w:color w:val="000000"/>
               </w:rPr>
-              <w:t>0.2</w:t>
+              <w:t>20.88</w:t>
             </w:r>
           </w:p>
         </w:tc>
@@ -11571,7 +11571,7 @@
                 <w:rFonts w:ascii="Aptos Narrow" w:hAnsi="Aptos Narrow"/>
                 <w:color w:val="000000"/>
               </w:rPr>
-              <w:t>0.04</w:t>
+              <w:t>0.09</w:t>
             </w:r>
           </w:p>
         </w:tc>
@@ -11589,13 +11589,49 @@
                 <w:rFonts w:ascii="Aptos Narrow" w:hAnsi="Aptos Narrow"/>
                 <w:color w:val="000000"/>
               </w:rPr>
+              <w:t>0.09</w:t>
+            </w:r>
+          </w:p>
+        </w:tc>
+        <w:tc>
+          <w:tcPr>
+            <w:tcW w:w="1701" w:type="dxa"/>
+            <w:vAlign w:val="bottom"/>
+          </w:tcPr>
+          <w:p>
+            <w:pPr>
+              <w:cnfStyle w:val="000000000000" w:firstRow="0" w:lastRow="0" w:firstColumn="0" w:lastColumn="0" w:oddVBand="0" w:evenVBand="0" w:oddHBand="0" w:evenHBand="0" w:firstRowFirstColumn="0" w:firstRowLastColumn="0" w:lastRowFirstColumn="0" w:lastRowLastColumn="0"/>
+            </w:pPr>
+            <w:r>
+              <w:rPr>
+                <w:rFonts w:ascii="Aptos Narrow" w:hAnsi="Aptos Narrow"/>
+                <w:color w:val="000000"/>
+              </w:rPr>
+              <w:t>0.03</w:t>
+            </w:r>
+          </w:p>
+        </w:tc>
+        <w:tc>
+          <w:tcPr>
+            <w:tcW w:w="1701" w:type="dxa"/>
+            <w:vAlign w:val="bottom"/>
+          </w:tcPr>
+          <w:p>
+            <w:pPr>
+              <w:cnfStyle w:val="000000000000" w:firstRow="0" w:lastRow="0" w:firstColumn="0" w:lastColumn="0" w:oddVBand="0" w:evenVBand="0" w:oddHBand="0" w:evenHBand="0" w:firstRowFirstColumn="0" w:firstRowLastColumn="0" w:lastRowFirstColumn="0" w:lastRowLastColumn="0"/>
+            </w:pPr>
+            <w:r>
+              <w:rPr>
+                <w:rFonts w:ascii="Aptos Narrow" w:hAnsi="Aptos Narrow"/>
+                <w:color w:val="000000"/>
+              </w:rPr>
               <w:t>0.07</w:t>
             </w:r>
           </w:p>
         </w:tc>
         <w:tc>
           <w:tcPr>
-            <w:tcW w:w="1701" w:type="dxa"/>
+            <w:tcW w:w="1984" w:type="dxa"/>
             <w:vAlign w:val="bottom"/>
           </w:tcPr>
           <w:p>
@@ -11607,43 +11643,7 @@
                 <w:rFonts w:ascii="Aptos Narrow" w:hAnsi="Aptos Narrow"/>
                 <w:color w:val="000000"/>
               </w:rPr>
-              <w:t>0.01</w:t>
-            </w:r>
-          </w:p>
-        </w:tc>
-        <w:tc>
-          <w:tcPr>
-            <w:tcW w:w="1701" w:type="dxa"/>
-            <w:vAlign w:val="bottom"/>
-          </w:tcPr>
-          <w:p>
-            <w:pPr>
-              <w:cnfStyle w:val="000000000000" w:firstRow="0" w:lastRow="0" w:firstColumn="0" w:lastColumn="0" w:oddVBand="0" w:evenVBand="0" w:oddHBand="0" w:evenHBand="0" w:firstRowFirstColumn="0" w:firstRowLastColumn="0" w:lastRowFirstColumn="0" w:lastRowLastColumn="0"/>
-            </w:pPr>
-            <w:r>
-              <w:rPr>
-                <w:rFonts w:ascii="Aptos Narrow" w:hAnsi="Aptos Narrow"/>
-                <w:color w:val="000000"/>
-              </w:rPr>
-              <w:t>0.01</w:t>
-            </w:r>
-          </w:p>
-        </w:tc>
-        <w:tc>
-          <w:tcPr>
-            <w:tcW w:w="1984" w:type="dxa"/>
-            <w:vAlign w:val="bottom"/>
-          </w:tcPr>
-          <w:p>
-            <w:pPr>
-              <w:cnfStyle w:val="000000000000" w:firstRow="0" w:lastRow="0" w:firstColumn="0" w:lastColumn="0" w:oddVBand="0" w:evenVBand="0" w:oddHBand="0" w:evenHBand="0" w:firstRowFirstColumn="0" w:firstRowLastColumn="0" w:lastRowFirstColumn="0" w:lastRowLastColumn="0"/>
-            </w:pPr>
-            <w:r>
-              <w:rPr>
-                <w:rFonts w:ascii="Aptos Narrow" w:hAnsi="Aptos Narrow"/>
-                <w:color w:val="000000"/>
-              </w:rPr>
-              <w:t>0.03</w:t>
+              <w:t>0.14</w:t>
             </w:r>
           </w:p>
         </w:tc>
@@ -11682,7 +11682,7 @@
                 <w:rFonts w:ascii="Aptos Narrow" w:hAnsi="Aptos Narrow"/>
                 <w:color w:val="000000"/>
               </w:rPr>
-              <w:t>0.31</w:t>
+              <w:t>10.95</w:t>
             </w:r>
           </w:p>
         </w:tc>
@@ -11700,7 +11700,7 @@
                 <w:rFonts w:ascii="Aptos Narrow" w:hAnsi="Aptos Narrow"/>
                 <w:color w:val="000000"/>
               </w:rPr>
-              <w:t>0.62</w:t>
+              <w:t>14.2</w:t>
             </w:r>
           </w:p>
         </w:tc>
@@ -11718,13 +11718,31 @@
                 <w:rFonts w:ascii="Aptos Narrow" w:hAnsi="Aptos Narrow"/>
                 <w:color w:val="000000"/>
               </w:rPr>
+              <w:t>0.03</w:t>
+            </w:r>
+          </w:p>
+        </w:tc>
+        <w:tc>
+          <w:tcPr>
+            <w:tcW w:w="1701" w:type="dxa"/>
+            <w:vAlign w:val="bottom"/>
+          </w:tcPr>
+          <w:p>
+            <w:pPr>
+              <w:cnfStyle w:val="000000100000" w:firstRow="0" w:lastRow="0" w:firstColumn="0" w:lastColumn="0" w:oddVBand="0" w:evenVBand="0" w:oddHBand="1" w:evenHBand="0" w:firstRowFirstColumn="0" w:firstRowLastColumn="0" w:lastRowFirstColumn="0" w:lastRowLastColumn="0"/>
+            </w:pPr>
+            <w:r>
+              <w:rPr>
+                <w:rFonts w:ascii="Aptos Narrow" w:hAnsi="Aptos Narrow"/>
+                <w:color w:val="000000"/>
+              </w:rPr>
               <w:t>0.06</w:t>
             </w:r>
           </w:p>
         </w:tc>
         <w:tc>
           <w:tcPr>
-            <w:tcW w:w="1701" w:type="dxa"/>
+            <w:tcW w:w="1984" w:type="dxa"/>
             <w:vAlign w:val="bottom"/>
           </w:tcPr>
           <w:p>
@@ -11737,24 +11755,6 @@
                 <w:color w:val="000000"/>
               </w:rPr>
               <w:t>0.12</w:t>
-            </w:r>
-          </w:p>
-        </w:tc>
-        <w:tc>
-          <w:tcPr>
-            <w:tcW w:w="1984" w:type="dxa"/>
-            <w:vAlign w:val="bottom"/>
-          </w:tcPr>
-          <w:p>
-            <w:pPr>
-              <w:cnfStyle w:val="000000100000" w:firstRow="0" w:lastRow="0" w:firstColumn="0" w:lastColumn="0" w:oddVBand="0" w:evenVBand="0" w:oddHBand="1" w:evenHBand="0" w:firstRowFirstColumn="0" w:firstRowLastColumn="0" w:lastRowFirstColumn="0" w:lastRowLastColumn="0"/>
-            </w:pPr>
-            <w:r>
-              <w:rPr>
-                <w:rFonts w:ascii="Aptos Narrow" w:hAnsi="Aptos Narrow"/>
-                <w:color w:val="000000"/>
-              </w:rPr>
-              <w:t>0.25</w:t>
             </w:r>
           </w:p>
         </w:tc>

</xml_diff>